<commit_message>
Add ΔAUROC confidence intervals, patient cohort check, reusable package and number audit
- scripts/20: size-matched drug-specific gain now averaged over 10 training subsamples with a
  paired family-level bootstrap CI (replaces the 5-repeat point estimate).
- scripts/22 + Fig 6d: ReSisTrace signatures in 11 HGSOC patients before/after neoadjuvant
  chemotherapy (GSE165897). Drug signatures are not enriched in persisting cells; the fitness
  signature is depleted.
- src/persist/fitadj.py: data-agnostic fitness-adjusted evaluation (control-arm baseline,
  size-matched ΔAUROC with CI, family permutation null, sister ceiling) + tests.
- scripts/23: audits every number quoted in the manuscript against results/ (63 checks, all pass).
- Figures: illustrated Fig 1a schematic, CI error bars in Fig 3c, Arial, π/→ glyphs,
  PLOS-compliant TIFF export (450 dpi, LZW, ≤ 7.5 in).
- Reproducibility: MIT licence, CITATION.cff, locked requirements, single run_all.sh.
</commit_message>
<xml_diff>
--- a/paper/manuscript.docx
+++ b/paper/manuscript.docx
@@ -8,7 +8,7 @@
         <w:jc w:val="left"/>
       </w:pPr>
       <w:r>
-        <w:t xml:space="preserve">Most of the pre-treatment signal for sister-cell survival is generic fitness, and sister discordance sets its ceiling</w:t>
+        <w:t xml:space="preserve">Pre-treatment transcriptional prediction of sister-cell fate is dominated by fitness and limited by sister discordance</w:t>
       </w:r>
     </w:p>
     <w:p>
@@ -48,7 +48,7 @@
         <w:t xml:space="preserve">Methods.</w:t>
       </w:r>
       <w:r>
-        <w:t xml:space="preserve"> We used the ReSisTrace data (Kuramochi ovarian cancer cells; carboplatin, olaparib, NK cells and no-drug control; two replicates; 32,642 labelled pre-treatment cells). We trained classifiers directly on the lineage labels and evaluated them with lineage-grouped cross-validation, replicate hold-out and transfer between arms. We then measured how much of the predictive signal is shared with the control arm, estimated an upper bound on predictability from 3,477 pairs of sisters that were both sequenced before treatment, and tested for confounding by sequencing depth, cell cycle and inferred copy-number subclones. Two independent lineage-tracing data sets and the TCGA ovarian cancer cohort served as external checks.</w:t>
+        <w:t xml:space="preserve"> We used the ReSisTrace data (Kuramochi ovarian cancer cells; carboplatin, olaparib, NK cells and no-drug control; two replicates; 32,642 labelled pre-treatment cells). We trained classifiers directly on the lineage labels and evaluated them with lineage-grouped cross-validation, replicate hold-out and transfer between arms. We then measured how much of the predictive signal is shared with the control arm, estimated an upper bound on predictability from 3,477 pairs of sisters that were both sequenced before treatment, and tested for confounding by sequencing depth, cell cycle and inferred copy-number subclones. Two independent lineage-tracing data sets, the TCGA ovarian cancer cohort and a cohort of 11 patients sampled before and after neoadjuvant chemotherapy served as external checks.</w:t>
       </w:r>
     </w:p>
     <w:p>
@@ -64,7 +64,7 @@
         <w:t xml:space="preserve">Results.</w:t>
       </w:r>
       <w:r>
-        <w:t xml:space="preserve"> A logistic model on 50 principal components predicted the sister's fate with AUROC 0.72–0.75 in the drug arms (label-permutation p &lt; 0.01). This was well above the 0.50–0.60 reported for existing drug-response predictors on the same task, and neither tuning, pooling arms, gradient boosting nor a graph neural network with sister-pair pretraining improved on it (graph network 0.70–0.73 across three seeds). However, a model trained only on the untreated control arm predicted the drug-arm labels almost as well (AUROC 0.70–0.73). With training size matched, the drug-specific gain over this fitness model was 0.016–0.028 AUROC and fell to 0.003 for NK cells once depth and mitochondrial content were removed. Beyond the fitness axis, pre-resistant cells showed lower E2F, mitotic-spindle and MYC-target expression. A label-free score of how typical a cell's state is reached AUROC 0.63–0.70 on its own. Sister discordance alone cost about 0.09–0.12 AUROC. Inferred copy-number subclones did not explain the signal. In two external data sets, clone size predicted lineage survival far better than expression, and ReSisTrace models transferred at or near chance, and no derived signature was associated with outcome in TCGA ovarian tumours after correction for multiple testing.</w:t>
+        <w:t xml:space="preserve"> A logistic model on 50 principal components predicted the sister's fate with AUROC 0.72–0.75 in the drug arms (label-permutation p &lt; 0.01). On the olaparib arm, under the same balanced protocol, this was well above the AUROC of about 0.50–0.60 reported for existing drug-response predictors, and neither tuning, pooling arms, gradient boosting nor a graph neural network with sister-pair pretraining improved on it (graph network 0.70–0.73 across three seeds). However, a model trained only on the untreated control arm predicted the drug-arm labels almost as well (AUROC 0.70–0.73). With training size matched, the drug-specific gain over this fitness model was 0.014–0.025 AUROC (95% confidence intervals excluding zero in every drug arm) and fell to 0.003 for NK cells once depth and mitochondrial content were removed (95% CI −0.010 to 0.016). Beyond the fitness axis, pre-resistant cells showed lower E2F, mitotic-spindle and MYC-target expression. A label-free score of how typical a cell's state is reached AUROC 0.63–0.70 on its own. Sister discordance alone cost about 0.09–0.12 AUROC. Inferred copy-number subclones did not explain the signal. In two external data sets, clone size predicted lineage survival far better than expression, and ReSisTrace models transferred at or near chance. No derived signature was associated with outcome in TCGA ovarian tumours after correction for multiple testing, and in 11 patients sampled before and after neoadjuvant chemotherapy the drug signatures were not enriched in the cells that persisted, while the fitness signature was depleted.</w:t>
       </w:r>
     </w:p>
     <w:p>
@@ -219,7 +219,7 @@
         <w:jc w:val="both"/>
       </w:pPr>
       <w:r>
-        <w:t xml:space="preserve">Under the protocol of the published benchmark (olaparib, all pre-resistant cells against an equal number of randomly drawn pre-sensitive cells, three draws), the same logistic model reached 0.739–0.756 with ordinary five-fold cross-validation and 0.734–0.747 with lineage-grouped folds (Fig. 2c). Grouping by lineage lowered AUROC by less than 0.01. The gap to the 0.50–0.60 reported by Shen et al. (2026) is therefore not due to sister cells leaking between training and test folds. It reflects training directly on the lineage labels rather than transferring from bulk drug-response data.</w:t>
+        <w:t xml:space="preserve">Under the protocol of the published benchmark (olaparib, all pre-resistant cells against an equal number of randomly drawn pre-sensitive cells, three draws), the same logistic model reached 0.739–0.756 with ordinary five-fold cross-validation and 0.734–0.747 with lineage-grouped folds (Fig. 2c). Grouping by lineage lowered AUROC by less than 0.01. The gap to the 0.50–0.60 reported by Shen et al. (2026) is therefore not due to sister cells leaking between training and test folds. It reflects training directly on the lineage labels rather than transferring from bulk drug-response data. Table S20 sets out the inputs, training signal, labels and protocol behind each value; the published methods were not rerun here.</w:t>
       </w:r>
     </w:p>
     <w:p>
@@ -254,7 +254,7 @@
         <w:jc w:val="both"/>
       </w:pPr>
       <w:r>
-        <w:t xml:space="preserve">Drug-arm and control-model scores were strongly correlated (Spearman 0.80–0.82). Adding the drug score to a logistic model that already contained the control-model score still improved fit in every arm (likelihood-ratio p &lt; 10⁻²⁵). The drug-specific component was therefore real, but it was small. The drug score residualised on the control score reached AUROC 0.60–0.63, and within quintiles of the control score 0.64–0.66 (Fig. 3b). The control arm has fewer labelled cells (4,183) than the drug arms (8,942–10,123), so we also trained drug models on random family-matched subsets of the same size. The drug-specific advantage was then 0.016 for carboplatin, 0.028 for olaparib and 0.016 for NK (Fig. 3c). It was essentially unchanged after removing cell cycle (0.016, 0.029, 0.013). After removing depth and mitochondrial content as well, it was 0.012 for carboplatin, 0.026 for olaparib and 0.003 for NK. For NK cells, therefore, almost nothing drug-specific remained.</w:t>
+        <w:t xml:space="preserve">Drug-arm and control-model scores were strongly correlated (Spearman 0.80–0.82). Adding the drug score to a logistic model that already contained the control-model score still improved fit in every arm (likelihood-ratio p &lt; 10⁻²⁵). The drug-specific component was therefore real, but it was small. The drug score residualised on the control score reached AUROC 0.60–0.63, and within quintiles of the control score 0.64–0.66 (Fig. 3b). The control arm has fewer labelled cells (4,183) than the drug arms (8,942–10,123), so we also trained drug models on random sets of whole families of the same size, repeated ten times, and put a paired family-bootstrap confidence interval on the difference (Methods). The drug-specific advantage was then 0.014 for carboplatin (95% CI 0.001–0.026), 0.025 for olaparib (0.012–0.039) and 0.017 for NK (0.003–0.031) (Fig. 3c, Table S19). The spread across the ten training subsets was small (s.d. 0.003–0.004). The gain was essentially unchanged after removing cell cycle (0.014, 0.025, 0.014). After removing depth and mitochondrial content as well, it was 0.012 for carboplatin (−0.001 to 0.025), 0.021 for olaparib (0.008–0.035) and 0.003 for NK (−0.010 to 0.016). For NK cells, therefore, nothing drug-specific could be distinguished from zero. The result did not depend on how expression was represented. We repeated the analysis with Harmony-corrected components (batch = sample; Korsunsky et al., 2019), with principal components of analytic Pearson residuals, a count-based alternative to log-normalisation (Lause et al., 2021), and with the latent space of scVI, which models library size and sample explicitly (Lopez et al., 2018). Across these representations, drug-arm models reached 0.704–0.746, the control-trained model 0.667–0.722 on the same labels, and the size-matched drug-specific gain (simpler five-repeat estimate) was 0.013–0.032 (Table S17).</w:t>
       </w:r>
     </w:p>
     <w:p>
@@ -271,7 +271,7 @@
         <w:jc w:val="both"/>
       </w:pPr>
       <w:r>
-        <w:t xml:space="preserve">While checking the shuffled-label controls, we noticed that gradient boosting trained on shuffled labels still scored above chance on the true labels (AUROC 0.56–0.58 in six refits on the olaparib and carboplatin arms; 0.56 with principal components alone), although the shuffled labels were uncorrelated with the true ones (|r| &lt; 0.01). Logistic regression trained on the same shuffled labels scored 0.47–0.54. This led us to a simple label-free score: the mean distance from a cell to its 15 nearest neighbours in principal-component space within its own sample. Pre-resistant cells lay in denser, more typical regions of state space. Density alone separated the classes with AUROC 0.70 (carboplatin), 0.69 (olaparib), 0.64 (NK) and 0.67 (control), essentially unchanged within single samples and after removing cell cycle, depth and mitochondrial content (0.63–0.69). It correlated with the supervised PCA-logistic score (Spearman 0.54–0.70). Much of what the supervised models learn is therefore available without any labels: cells whose sisters are recovered, with or without treatment, tend to be in common states, and cells in unusual states tend to lose their sisters. The control arm shows the same pattern as the drug arms, which fits a fitness effect. It also means that shuffled-label controls for flexible models should not be assumed to sit at 0.5, and each model should be compared with its own null.</w:t>
+        <w:t xml:space="preserve">While checking the shuffled-label controls, we noticed that gradient boosting trained on shuffled labels still scored above chance on the true labels (AUROC 0.56–0.58 in six refits on the olaparib and carboplatin arms; 0.56 with principal components alone), although the shuffled labels were uncorrelated with the true ones (|r| &lt; 0.01). Logistic regression trained on the same shuffled labels scored 0.47–0.54. This led us to a simple label-free score: the mean distance from a cell to its 15 nearest neighbours in principal-component space within its own sample. Pre-resistant cells lay in denser, more typical regions of state space. Density alone separated the classes with AUROC 0.70 (carboplatin), 0.69 (olaparib), 0.63 (NK) and 0.67 (control), essentially unchanged within single samples and after removing cell cycle, depth and mitochondrial content (0.63–0.69). It correlated with the supervised PCA-logistic score (Spearman 0.54–0.70). Much of what the supervised models learn is therefore available without any labels: cells whose sisters are recovered, with or without treatment, tend to be in common states, and cells in unusual states tend to lose their sisters. The control arm shows the same pattern as the drug arms, which fits a fitness effect. It also means that shuffled-label controls for flexible models should not be assumed to sit at 0.5, and each model should be compared with its own null.</w:t>
       </w:r>
     </w:p>
     <w:p>
@@ -279,7 +279,7 @@
         <w:pStyle w:val="Heading2"/>
       </w:pPr>
       <w:r>
-        <w:t xml:space="preserve">What distinguishes the shared and drug-specific components (Fig. 5a)</w:t>
+        <w:t xml:space="preserve">What distinguishes the shared and drug-specific components (Fig. 4a)</w:t>
       </w:r>
     </w:p>
     <w:p>
@@ -297,7 +297,16 @@
         <w:jc w:val="both"/>
       </w:pPr>
       <w:r>
-        <w:t xml:space="preserve">Hallmark gene-set enrichment of the control contrast showed higher MYC-target, mTORC1, E2F and fatty-acid-metabolism programmes, and lower TNF-α/NF-κB, TGF-β, interferon, p53 and apoptosis programmes, in cells whose sisters were recovered (Fig. 5a). This profile of a proliferative, low-stress state fits an advantage in re-plating and regrowth. After the control contrast was subtracted, all three drug-specific contrasts pointed the same way: E2F targets, mitotic spindle and MYC targets were lower in pre-resistant cells, and for carboplatin and NK so were the G2-M checkpoint and DNA repair. In other words, among cells that are otherwise fit, those whose sisters survived treatment were relatively less proliferative. This agrees with the original report that DNA replication was associated with pre-survival only in the control condition and not under any treatment (Dai et al., 2024). Carboplatin-tolerant cells in breast cancer xenografts also took on a slow-cycling, persister-like state, although there it was measured after treatment (Kronheim et al., 2026).</w:t>
+        <w:t xml:space="preserve">Hallmark gene-set enrichment of the control contrast showed higher MYC-target, mTORC1, E2F and fatty-acid-metabolism programmes, and lower TNF-α/NF-κB, TGF-β, interferon, p53 and apoptosis programmes, in cells whose sisters were recovered (Fig. 4a). This profile of a proliferative, low-stress state fits an advantage in re-plating and regrowth. After the control contrast was subtracted, all three drug-specific contrasts pointed the same way: E2F targets, mitotic spindle and MYC targets were lower in pre-resistant cells, and for carboplatin and NK so were the G2-M checkpoint and DNA repair. In other words, among cells that are otherwise fit, those whose sisters survived treatment were relatively less proliferative. This agrees with the original report that DNA replication was associated with pre-survival only in the control condition and not under any treatment (Dai et al., 2024). Carboplatin-tolerant cells in breast cancer xenografts also took on a slow-cycling, persister-like state, although there it was measured after treatment (Kronheim et al., 2026).</w:t>
+      </w:r>
+    </w:p>
+    <w:p>
+      <w:pPr>
+        <w:spacing w:after="160" w:line="360"/>
+        <w:jc w:val="both"/>
+      </w:pPr>
+      <w:r>
+        <w:t xml:space="preserve">To check this at the level of individual genes, we fixed a panel of 28 marker genes in advance, covering proliferation, G1 arrest, senescence, quiescence and previously reported persister markers (Fig. S2; 24 were among the retained genes). In the control contrast, recovered cells expressed markedly less of the CDK inhibitors CDKN1A (p21; z = −4.8, FDR &lt; 10⁻⁴), CDKN1B and CDKN1C, which fits a proliferative fitness state. Beyond the control contrast, the replication and mitosis genes CDK1, PCNA, MCM2 and E2F1 were lower in pre-resistant cells in all three drug arms (z between −1.2 and −4.3). Individually, however, only CDK1 and PCNA for NK cells passed correction (FDR 0.017 and 0.003). Senescence-associated secretory genes (IL6, CXCL8, SERPINE1) were not higher in pre-resistant cells, and CDKN1C was only modestly and non-significantly higher. The drug-specific state therefore looks like slower cycling among otherwise fit cells rather than senescence, although at the level of single genes the evidence is weak.</w:t>
       </w:r>
     </w:p>
     <w:p>
@@ -314,7 +323,7 @@
         <w:pStyle w:val="Heading2"/>
       </w:pPr>
       <w:r>
-        <w:t xml:space="preserve">Copy-number subclones do not explain the signal (Fig. 5b)</w:t>
+        <w:t xml:space="preserve">Copy-number subclones do not explain the signal (Fig. 4b)</w:t>
       </w:r>
     </w:p>
     <w:p>
@@ -340,25 +349,25 @@
         <w:pStyle w:val="Heading2"/>
       </w:pPr>
       <w:r>
-        <w:t xml:space="preserve">Sister discordance caps predictability (Fig. 4)</w:t>
-      </w:r>
-    </w:p>
-    <w:p>
-      <w:pPr>
-        <w:spacing w:after="160" w:line="360"/>
-        <w:jc w:val="both"/>
-      </w:pPr>
-      <w:r>
-        <w:t xml:space="preserve">A pre-treatment cell's label is its sister's fate, so no model can use the sister's own state. To estimate how much state sisters share, we used 3,477 pairs of sisters from 2,939 families that were both sequenced before treatment. Along the leading principal components, sisters were strongly correlated (mean intraclass correlation 0.75 over PCs 1–10, against 0.00 for random pairs from the same sample; Fig. 4a). The most heritable linear direction, estimated on held-out families, reached 0.93. Much of this shared variation is likely cell-cycle phase, which the thymidine block in the protocol synchronises, so it does not bound fate prediction tightly by itself.</w:t>
-      </w:r>
-    </w:p>
-    <w:p>
-      <w:pPr>
-        <w:spacing w:after="160" w:line="360"/>
-        <w:jc w:val="both"/>
-      </w:pPr>
-      <w:r>
-        <w:t xml:space="preserve">A more useful bound comes from each model's own score. For the PCA model, the correlation of scores between pre-treatment sisters was 0.63–0.81. We assumed a latent liability that determines the treated sister's survival and allowed 10% of observed negatives to be true positives, a value within the error range estimated by the original authors, who found that on average more than 80% of pre-sensitive labels were correct (Dai et al., 2024). Under these assumptions, the observed AUROC and score concordance imply that the same score would reach about 0.84 in the drug arms and 0.76 in the control arm if the treated sister's own transcriptome were available (Fig. 4b). Sister discordance therefore costs 0.09–0.12 AUROC in the drug arms and 0.05 in the control (Fig. 4c), and the estimate changed little across assumed noise levels of 0 to 20%. Even with the treated cell in hand, a large part of fate would remain unexplained by the measured state. This agrees with the partial heritability of fate seen in live-cell studies (Spencer et al., 2009; Paek et al., 2016).</w:t>
+        <w:t xml:space="preserve">Sister discordance caps predictability (Fig. 5)</w:t>
+      </w:r>
+    </w:p>
+    <w:p>
+      <w:pPr>
+        <w:spacing w:after="160" w:line="360"/>
+        <w:jc w:val="both"/>
+      </w:pPr>
+      <w:r>
+        <w:t xml:space="preserve">A pre-treatment cell's label is its sister's fate, so no model can use the sister's own state. To estimate how much state sisters share, we used 3,477 pairs of sisters from 2,939 families that were both sequenced before treatment. Along the leading principal components, sisters were strongly correlated (mean intraclass correlation 0.75 over PCs 1–10, against 0.00 for random pairs from the same sample; Fig. 5a). The most heritable linear direction, estimated on held-out families, reached 0.93. Much of this shared variation is likely cell-cycle phase, which the thymidine block in the protocol synchronises, so it does not bound fate prediction tightly by itself.</w:t>
+      </w:r>
+    </w:p>
+    <w:p>
+      <w:pPr>
+        <w:spacing w:after="160" w:line="360"/>
+        <w:jc w:val="both"/>
+      </w:pPr>
+      <w:r>
+        <w:t xml:space="preserve">A more useful bound comes from each model's own score. For the PCA model, the correlation of scores between pre-treatment sisters was 0.63–0.81. We assumed a latent liability that determines the treated sister's survival and allowed 10% of observed negatives to be true positives, a value within the error range estimated by the original authors, who found that on average more than 80% of pre-sensitive labels were correct (Dai et al., 2024). Under these assumptions, the observed AUROC and score concordance imply that the same score would reach about 0.84 in the drug arms and 0.76 in the control arm if the treated sister's own transcriptome were available (Fig. 5b). Sister discordance therefore costs 0.09–0.12 AUROC in the drug arms and 0.05 in the control (Fig. 5c), and the estimate changed little across assumed noise levels of 0 to 20%. Even with the treated cell in hand, a large part of fate would remain unexplained by the measured state. This agrees with the partial heritability of fate seen in live-cell studies (Spencer et al., 2009; Paek et al., 2016).</w:t>
       </w:r>
     </w:p>
     <w:p>
@@ -375,7 +384,7 @@
         <w:jc w:val="both"/>
       </w:pPr>
       <w:r>
-        <w:t xml:space="preserve">We built a cell–cell k-nearest-neighbour graph within each sample and trained a GraphSAGE-style network (Hamilton et al., 2017). Its encoder was optionally pretrained with a contrastive loss (Chen et al., 2020) that pulls pre-treatment sisters together, excluding test cells. The idea was that sister pairs mark the heritable part of the state, which is what the ceiling analysis says a predictor must use. Across three seeds, sister-pair pretraining improved a matched MLP slightly in every arm (by 0.004–0.014; MLP 0.700–0.738, pretrained MLP 0.708–0.742). Message passing over the graph did not help: the graph network with pretraining reached 0.696–0.734 (seed s.d. ≤ 0.005), slightly below the pretrained MLP and below logistic regression (0.708–0.747) in every arm (Fig. S2). In replicate hold-out, the graph network scored 0.68–0.74, against 0.70–0.76 for logistic regression. Smoothing features over the same graph before logistic regression changed AUROC by at most 0.005. The neural models therefore recovered the same signal as the linear model, and no more.</w:t>
+        <w:t xml:space="preserve">We built a cell–cell k-nearest-neighbour graph within each sample and trained a GraphSAGE-style network (Hamilton et al., 2017). Its encoder was optionally pretrained with a contrastive loss (Chen et al., 2020) that pulls pre-treatment sisters together, excluding test cells. The idea was that sister pairs mark the heritable part of the state, which is what the ceiling analysis says a predictor must use. Across three seeds, sister-pair pretraining improved a matched MLP slightly in every arm (by 0.004–0.014; MLP 0.700–0.738, pretrained MLP 0.708–0.742). Message passing over the graph did not help: the graph network with pretraining reached 0.696–0.734 (seed s.d. ≤ 0.005), slightly below the pretrained MLP and below logistic regression (0.708–0.747) in every arm (Fig. S3). In replicate hold-out, the graph network scored 0.68–0.74, against 0.70–0.76 for logistic regression. Smoothing features over the same graph before logistic regression changed AUROC by at most 0.005. A one-at-a-time sweep of the graph network without pretraining over the number of layers, hidden width, dropout, learning rate, weight decay and neighbourhood size (Table S18) gave 0.727–0.739 for carboplatin, 0.722–0.733 for olaparib, 0.695–0.714 for NK and 0.667–0.700 for control, never above logistic regression. The neural models therefore recovered the same signal as the linear model, and no more.</w:t>
       </w:r>
     </w:p>
     <w:p>
@@ -383,7 +392,7 @@
         <w:pStyle w:val="Heading2"/>
       </w:pPr>
       <w:r>
-        <w:t xml:space="preserve">Little transfer to other systems and no association with patient outcome (Fig. 6)</w:t>
+        <w:t xml:space="preserve">Little transfer to other systems, and no enrichment after chemotherapy in patients (Fig. 6)</w:t>
       </w:r>
     </w:p>
     <w:p>
@@ -415,6 +424,15 @@
     </w:p>
     <w:p>
       <w:pPr>
+        <w:spacing w:after="160" w:line="360"/>
+        <w:jc w:val="both"/>
+      </w:pPr>
+      <w:r>
+        <w:t xml:space="preserve">Survival statistics in bulk tumours are an indirect test. A more direct one asks whether the cells that persist through chemotherapy in patients carry the pre-resistant states. Zhang et al. (2022) sequenced malignant cells from 11 patients with high-grade serous ovarian cancer before and after three cycles of neoadjuvant carboplatin–paclitaxel (8,806 malignant cells). If the ReSisTrace carboplatin states were selected by treatment, post-treatment cells should score higher than treatment-naive cells from the same patient. They did not. We compared scores within each patient and against random gene sets matched in size and expression (Methods). The carboplatin whole-contrast and carboplatin-specific signatures rose in only 5 of 11 patients (median change −0.03 and −0.10 within-patient s.d.; Wilcoxon p = 0.24 and 0.83), within the range of random gene sets. The fitness signature moved the other way. It was lower after treatment in 7 of 11 patients (median −0.18; Wilcoxon p = 0.042), below all 200 matched random sets (two-sided p = 0.005), and lower in all five patients whose two samples came from the same anatomical site (Fig. 6d, Table S21). No signature change was associated with the platinum-free interval (Spearman |ρ| ≤ 0.34, all p &gt; 0.3; n = 11). The state that predicts recovery in culture, which is proliferative and low in stress and apoptosis programmes, is therefore depleted rather than enriched in tumours that have been through chemotherapy. This fits the view that it marks the ability to regrow after the experimental procedure rather than tolerance of the drug. Post-treatment tissue also differs in ways a sister design does not capture (drug-induced changes, stroma, sampling site), so this is a consistency check rather than a validation.</w:t>
+      </w:r>
+    </w:p>
+    <w:p>
+      <w:pPr>
         <w:pStyle w:val="Heading1"/>
       </w:pPr>
       <w:r>
@@ -463,16 +481,16 @@
         <w:jc w:val="both"/>
       </w:pPr>
       <w:r>
-        <w:t xml:space="preserve">The external data sets show how strongly clone-level designs are shaped by sampling. In both, clone size predicted whether a lineage would be seen again much better than expression did. This is expected, since larger clones are more likely to be re-sampled. Expression-based claims from clone-level labels therefore need clone size as a baseline, and singleton lineages are a useful, if small, stress test. The failure of ReSisTrace models to transfer is not surprising, given different cell lines, drugs and label definitions, but it argues against treating any single pre-resistance signature as general.</w:t>
-      </w:r>
-    </w:p>
-    <w:p>
-      <w:pPr>
-        <w:spacing w:after="160" w:line="360"/>
-        <w:jc w:val="both"/>
-      </w:pPr>
-      <w:r>
-        <w:t xml:space="preserve">Several limitations apply. First, ReSisTrace labels are noisy. Cells whose sister was lost or only partially matched are counted as pre-sensitive, and our ceiling handles this only through an assumed noise level. Second, the Gaussian liability model is a simplification. It assumes a single linear score and treats the fitted model as capturing the relevant direction, so the ceilings are approximate. Third, our copy-number clusters were inferred from expression and only weakly separated. They reproduced the published enrichment pattern, but they are not the original subclone calls. Fourth, all analyses use one ovarian cancer cell line, and the external checks rely on clone-level labels and on bulk tumours that differ from a cell line in many ways. Finally, the graph model was tested with one architecture and modest tuning. A different design might do better, but the near-identical performance of very different models suggests that the information, not the model class, is the limit.</w:t>
+        <w:t xml:space="preserve">The external data sets show how strongly clone-level designs are shaped by sampling. In both, clone size predicted whether a lineage would be seen again much better than expression did. This is expected, since larger clones are more likely to be re-sampled. Expression-based claims from clone-level labels therefore need clone size as a baseline, and singleton lineages are a useful, if small, stress test. The failure of ReSisTrace models to transfer is not surprising, given different cell lines, drugs and label definitions, but it argues against treating any single pre-resistance signature as general. The patient cohort makes the same point from the other direction. Cells that survived carboplatin-based chemotherapy in tumours were no higher on the carboplatin signatures than the same patients' untreated cells, and were lower on the fitness signature. A state that marks recovery in a culture dish need not mark survival in a patient, where the drug is given over months and the cells sit in a tissue. This is a further reason to measure the drug-specific part of a lineage signal, since it is the part that might translate.</w:t>
+      </w:r>
+    </w:p>
+    <w:p>
+      <w:pPr>
+        <w:spacing w:after="160" w:line="360"/>
+        <w:jc w:val="both"/>
+      </w:pPr>
+      <w:r>
+        <w:t xml:space="preserve">Several limitations apply. First, ReSisTrace labels are noisy. Cells whose sister was lost or only partially matched are counted as pre-sensitive, and our ceiling handles this only through an assumed noise level. Second, the Gaussian liability model is a simplification. It assumes a single linear score and treats the fitted model as capturing the relevant direction, so the ceilings are approximate. Third, our copy-number clusters were inferred from expression and only weakly separated. They reproduced the published enrichment pattern, but they are not the original subclone calls. Fourth, all analyses use one ovarian cancer cell line, and the external checks rely on clone-level labels, on bulk tumours, and on a patient cohort of 11 in which the two samples are different pieces of tissue rather than sisters, so a negative result there has several possible causes. Finally, the graph model was tested with one architecture and modest tuning. A different design might do better, but the near-identical performance of very different models suggests that the information, not the model class, is the limit.</w:t>
       </w:r>
     </w:p>
     <w:p>
@@ -638,10 +656,10 @@
           <w:b/>
           <w:bCs/>
         </w:rPr>
-        <w:t xml:space="preserve">Fitness analysis.</w:t>
-      </w:r>
-      <w:r>
-        <w:t xml:space="preserve"> For each drug arm, the fitness score was the prediction of a PCA-logistic model trained on all labelled control cells. We report the drug model's out-of-fold AUROC; the fitness model's AUROC on the drug-arm labels; the AUROC of the drug logit after within-sample linear regression on the fitness logit; the mean AUROC within fitness-score quintiles; a one-degree-of-freedom likelihood-ratio test for adding the drug logit to a model containing the fitness logit; and the size-matched specificity index. For the latter, drug models were trained on random sets of drug-arm families containing as many cells as the control arm, and both models were scored on the remaining drug-arm cells (five repeats).</w:t>
+        <w:t xml:space="preserve">Alternative representations.</w:t>
+      </w:r>
+      <w:r>
+        <w:t xml:space="preserve"> To test whether the results depend on the representation, the 50 principal components were replaced by (i) Harmony-corrected components (harmonypy, batch = sample), (ii) 50 principal components of analytic Pearson residuals (θ = 100) computed per sample on raw counts of the same 2,000 genes (Scanpy), or (iii) a 30-dimensional scVI latent space (scvi-tools, batch = sample, up to 100 epochs with early stopping) trained on the same raw counts. The logistic and fitness analyses were then rerun unchanged.</w:t>
       </w:r>
     </w:p>
     <w:p>
@@ -654,10 +672,10 @@
           <w:b/>
           <w:bCs/>
         </w:rPr>
-        <w:t xml:space="preserve">Ceiling.</w:t>
-      </w:r>
-      <w:r>
-        <w:t xml:space="preserve"> For any score, sister concordance was the Pearson correlation over symmetrised pre-treatment sister pairs, after rank-based inverse-normal transformation of model scores. The most concordant linear direction was found by solving the generalised eigenproblem between the symmetrised sister cross-covariance and the total covariance (ridge 10⁻²), with five-fold cross-validation over families. Under a latent-liability model, the treated sister survives when its liability exceeds a threshold set by the arm's prevalence. We corrected each observed AUROC for label noise, using AUROC_obs = (1 − π)·AUROC + π/2, where π is the fraction of observed negatives that are true positives. We then inverted the bivariate-normal AUROC to obtain the implied correlation between score and sister liability, divided it by the score's sister concordance, and converted the result back into the AUROC expected if the treated sister itself were scored.</w:t>
+        <w:t xml:space="preserve">Foundation-model embeddings.</w:t>
+      </w:r>
+      <w:r>
+        <w:t xml:space="preserve"> We also represented each cell by Geneformer (Theodoris et al., 2023), using the cancer-tuned V2 model with 104 million parameters (Geneformer-V2-104M_CLcancer, continually pretrained on about 14 million cancer transcriptomes; Chen et al., 2024). Raw counts of each pre-treatment cell were rank-value encoded as in Geneformer: counts were scaled to 10,000 per cell, divided by each gene's median in the pretraining corpus, and genes were ranked, keeping the top 4,094 plus the &lt;cls&gt; and &lt;eos&gt; tokens (16,019–16,517 genes per sample were in the model vocabulary). The cell embedding was the mean over gene positions of the penultimate hidden layer (768 dimensions), Geneformer's default. The model was used without fine-tuning, so the embedding does not see the labels. The forward pass ran in half precision on one NVIDIA T4 GPU (Kaggle). Embeddings were z-scored within each sample, as the principal components were, and the logistic and fitness analyses were rerun unchanged.</w:t>
       </w:r>
     </w:p>
     <w:p>
@@ -670,10 +688,10 @@
           <w:b/>
           <w:bCs/>
         </w:rPr>
-        <w:t xml:space="preserve">Typicality score.</w:t>
-      </w:r>
-      <w:r>
-        <w:t xml:space="preserve"> For each cell, we computed the mean Euclidean distance to its 15 nearest neighbours in the 50-component space among cells of the same sample, and used its negative as a label-free score. The direction (denser = pre-resistant) is the only choice made with reference to the labels.</w:t>
+        <w:t xml:space="preserve">Fitness analysis.</w:t>
+      </w:r>
+      <w:r>
+        <w:t xml:space="preserve"> Throughout, fitness is defined operationally as what predicts a sister's recovery without any drug: the score of a PCA-logistic model trained on the lineage labels of the untreated control arm. Technical covariates (sequencing depth, detected genes, mitochondrial fraction, cell-cycle scores) are not part of this definition and were handled separately by regression. For each drug arm, the fitness score was the prediction of this model trained on all labelled control cells. We report the drug model's out-of-fold AUROC; the fitness model's AUROC on the drug-arm labels; the AUROC of the drug logit after within-sample linear regression on the fitness logit; the mean AUROC within fitness-score quintiles; a one-degree-of-freedom likelihood-ratio test for adding the drug logit to a model containing the fitness logit; and the size-matched specificity index (ΔAUROC). For the latter, the drug model was fitted by the same lineage-grouped five-fold cross-validation, but each training fold was reduced to a random set of whole families containing as many cells as the labelled control arm (4,183), so that the drug model never had more training data than the fitness model. Out-of-fold drug scores and the fitness score were then compared on all drug-arm cells, and ΔAUROC was averaged over 10 random reductions. Its 95% confidence interval came from 1,000 paired family-level bootstrap resamples: each resample reweighted whole families, and the seed-averaged ΔAUROC was recomputed with both scores on the same resampled cells. We used this bootstrap rather than a DeLong test because sisters are not independent observations. The one-sided p-value is the fraction of resamples with ΔAUROC ≤ 0. An earlier, simpler estimate (five random training sets, scored on the held-out drug-arm cells) gave similar values and is reported in Table S3.</w:t>
       </w:r>
     </w:p>
     <w:p>
@@ -686,10 +704,10 @@
           <w:b/>
           <w:bCs/>
         </w:rPr>
-        <w:t xml:space="preserve">Differential expression and pathways.</w:t>
-      </w:r>
-      <w:r>
-        <w:t xml:space="preserve"> Wilcoxon tests compared pre-resistant with pre-sensitive cells within each sample. Replicate z-scores were combined by Stouffer's method, and genes with opposite signs in the two replicates were flagged. Drug-specific genes had FDR &lt; 0.05 for the drug contrast and for the difference from the control contrast, z_diff = (z_drug − z_control)/√2, and consistent signs. Preranked GSEA (Subramanian et al., 2005; GSEApy, Fang et al., 2023) used the MSigDB Hallmark collection (Liberzon et al., 2015) with 1,000 permutations. Signatures took the top 50 genes in each direction after removing mitochondrial and ribosomal genes.</w:t>
+        <w:t xml:space="preserve">Ceiling.</w:t>
+      </w:r>
+      <w:r>
+        <w:t xml:space="preserve"> For any score, sister concordance was the Pearson correlation over symmetrised pre-treatment sister pairs, after rank-based inverse-normal transformation of model scores. The most concordant linear direction was found by solving the generalised eigenproblem between the symmetrised sister cross-covariance and the total covariance (ridge 10⁻²), with five-fold cross-validation over families. Under a latent-liability model, the treated sister survives when its liability exceeds a threshold set by the arm's prevalence. We corrected each observed AUROC for label noise, using AUROC_obs = (1 − π)·AUROC + π/2, where π is the fraction of observed negatives that are true positives. We then inverted the bivariate-normal AUROC to obtain the implied correlation between score and sister liability, divided it by the score's sister concordance, and converted the result back into the AUROC expected if the treated sister itself were scored.</w:t>
       </w:r>
     </w:p>
     <w:p>
@@ -702,10 +720,10 @@
           <w:b/>
           <w:bCs/>
         </w:rPr>
-        <w:t xml:space="preserve">Copy-number clusters.</w:t>
-      </w:r>
-      <w:r>
-        <w:t xml:space="preserve"> Genes detected in at least 10% of cells in every sample and located on GENCODE v44 autosomes or chromosome X (11,883 genes) were normalised and log-transformed. Each sample was analysed with infercnvpy (https://github.com/icbi-lab/infercnvpy; window of 100 genes, step 10), following the approach of InferCNV (Patel et al., 2014), against one fixed reference panel of 200 random cells from each pre-treatment sample. Profiles were pooled, reduced to 20 principal components and clustered by k-means, with k from 2 to 8 chosen by silhouette. Enrichment was tested with Fisher's exact test and Benjamini–Hochberg correction. Confound tests compared grouped out-of-fold predictions from cluster identity, expression and both, within-cluster AUROC, and a likelihood-ratio test for expression beyond cluster identity.</w:t>
+        <w:t xml:space="preserve">Typicality score.</w:t>
+      </w:r>
+      <w:r>
+        <w:t xml:space="preserve"> For each cell, we computed the mean Euclidean distance to its 15 nearest neighbours in the 50-component space among cells of the same sample, and used its negative as a label-free score. The direction (denser = pre-resistant) is the only choice made with reference to the labels.</w:t>
       </w:r>
     </w:p>
     <w:p>
@@ -718,19 +736,10 @@
           <w:b/>
           <w:bCs/>
         </w:rPr>
-        <w:t xml:space="preserve">External data.</w:t>
-      </w:r>
-      <w:r>
-        <w:t xml:space="preserve"> For Watermelon (GEO GSE150949), barcoded day-0 cells were labelled by the presence of their lineage barcode in any day-14 sample. For the triple-negative breast cancer study (GEO GSE228382), per-cell lineage annotations are not in GEO. We therefore exported the authors' Seurat object (figshare, doi:10.6084/m9.figshare.24787458) to plain files with a short R script. Untreated day-0 cells with a lineage barcode were labelled with the authors' </w:t>
-      </w:r>
-      <w:r>
-        <w:rPr>
-          <w:rFonts w:ascii="Consolas" w:cs="Consolas" w:eastAsia="Consolas" w:hAnsi="Consolas"/>
-        </w:rPr>
-        <w:t xml:space="preserve">DTPE_lineages</w:t>
-      </w:r>
-      <w:r>
-        <w:t xml:space="preserve"> annotation. For each data set we evaluated lineage-grouped cross-validation of clone-size, covariate and expression models, and zero-shot transfer of ReSisTrace logistic models using shared highly variable genes, z-scored within each data set. For TCGA-OV, RSEM expression and curated survival endpoints (Liu et al., 2018) were obtained from UCSC Xena. Primary tumours were scored by the mean z-score of up-genes minus down-genes, and Cox models (lifelines; Davidson-Pilon, 2019) were fitted per standard deviation of score.</w:t>
+        <w:t xml:space="preserve">Differential expression and pathways.</w:t>
+      </w:r>
+      <w:r>
+        <w:t xml:space="preserve"> Wilcoxon tests compared pre-resistant with pre-sensitive cells within each sample. Replicate z-scores were combined by Stouffer's method, and genes with opposite signs in the two replicates were flagged. Drug-specific genes had FDR &lt; 0.05 for the drug contrast and for the difference from the control contrast, z_diff = (z_drug − z_control)/√2, and consistent signs. Preranked GSEA (Subramanian et al., 2005; GSEApy, Fang et al., 2023) used the MSigDB Hallmark collection (Liberzon et al., 2015) with 1,000 permutations. Signatures took up to 50 genes in each direction with FDR &lt; 0.05, ranked by z-score, after removing mitochondrial and ribosomal genes. The fitness signature used the control contrast; the whole-contrast signature of a drug arm used its drug contrast without reference to the control; and the drug-specific signature of a drug arm used only its drug-specific genes, ranked by z_diff (carboplatin 25 up and 31 down, NK 16 up and 50 down, olaparib 50 and 50).</w:t>
       </w:r>
     </w:p>
     <w:p>
@@ -743,10 +752,10 @@
           <w:b/>
           <w:bCs/>
         </w:rPr>
-        <w:t xml:space="preserve">Code and data availability.</w:t>
-      </w:r>
-      <w:r>
-        <w:t xml:space="preserve"> All data are public: GSE223003, GSE150949, GSE228382 with figshare 24787458, and TCGA-OV through UCSC Xena. The code, configuration files and per-run results table are in the accompanying repository and run on a laptop CPU. All result tables underlying the figures and text, including full differential expression and gene-set enrichment results, are provided as Supplementary Tables S1–S15 (Supplementary_Tables.xlsx).</w:t>
+        <w:t xml:space="preserve">Copy-number clusters.</w:t>
+      </w:r>
+      <w:r>
+        <w:t xml:space="preserve"> Genes detected in at least 10% of cells in every sample and located on GENCODE v44 autosomes or chromosome X (11,883 genes) were normalised and log-transformed. Each sample was analysed with infercnvpy (https://github.com/icbi-lab/infercnvpy; window of 100 genes, step 10), following the approach of InferCNV (Patel et al., 2014), against one fixed reference panel of 200 random cells from each pre-treatment sample. Profiles were pooled, reduced to 20 principal components and clustered by k-means, with k from 2 to 8 chosen by silhouette. Enrichment was tested with Fisher's exact test and Benjamini–Hochberg correction. Confound tests compared grouped out-of-fold predictions from cluster identity, expression and both, within-cluster AUROC, and a likelihood-ratio test for expression beyond cluster identity.</w:t>
       </w:r>
     </w:p>
     <w:p>
@@ -759,10 +768,10 @@
           <w:b/>
           <w:bCs/>
         </w:rPr>
-        <w:t xml:space="preserve">Author contributions.</w:t>
-      </w:r>
-      <w:r>
-        <w:t xml:space="preserve"> [To be completed by the authors.]</w:t>
+        <w:t xml:space="preserve">Patient data.</w:t>
+      </w:r>
+      <w:r>
+        <w:t xml:space="preserve"> Count data and cell annotations for 11 patients with high-grade serous ovarian cancer sampled before and after neoadjuvant carboplatin–paclitaxel were obtained from GEO (GSE165897; Zhang et al., 2022), and the platinum-free interval and chemotherapy response score from Table 1 of that paper. Only cells the authors annotated as malignant epithelial cells were used (8,806 of 51,786). Counts were normalised to 10,000 per cell and log-transformed, and genes detected in fewer than 1% of malignant cells were dropped. Each gene was z-scored within patient across that patient's treatment-naive and post-treatment cells, so that patient identity, which dominates this data set, cannot drive the comparison. A signature score was the mean z of its up-genes minus the mean z of its down-genes, and each patient contributed one number: the mean score of their post-treatment cells minus the mean score of their treatment-naive cells. Significance was assessed in two ways: a Wilcoxon signed-rank test over the 11 patients, and a comparison with 200 random gene sets drawn to match the up- and down-sets in size and in mean expression (20 expression bins), which controls for the global transcriptional change that chemotherapy itself produces. As a sensitivity check we repeated the comparison in the five patients whose two samples came from the same anatomical site.</w:t>
       </w:r>
     </w:p>
     <w:p>
@@ -775,10 +784,19 @@
           <w:b/>
           <w:bCs/>
         </w:rPr>
-        <w:t xml:space="preserve">Funding.</w:t>
-      </w:r>
-      <w:r>
-        <w:t xml:space="preserve"> [To be completed by the authors.]</w:t>
+        <w:t xml:space="preserve">External data.</w:t>
+      </w:r>
+      <w:r>
+        <w:t xml:space="preserve"> For Watermelon (GEO GSE150949), barcoded day-0 cells were labelled by the presence of their lineage barcode in any day-14 sample. For the triple-negative breast cancer study (GEO GSE228382), per-cell lineage annotations are not in GEO. We therefore exported the authors' Seurat object (figshare, doi:10.6084/m9.figshare.24787458) to plain files with a short R script. Untreated day-0 cells with a lineage barcode were labelled with the authors' </w:t>
+      </w:r>
+      <w:r>
+        <w:rPr>
+          <w:rFonts w:ascii="Consolas" w:cs="Consolas" w:eastAsia="Consolas" w:hAnsi="Consolas"/>
+        </w:rPr>
+        <w:t xml:space="preserve">DTPE_lineages</w:t>
+      </w:r>
+      <w:r>
+        <w:t xml:space="preserve"> annotation. For each data set we evaluated lineage-grouped cross-validation of clone-size, covariate and expression models, and zero-shot transfer of ReSisTrace logistic models using shared highly variable genes, z-scored within each data set. For TCGA-OV, RSEM expression and curated survival endpoints (Liu et al., 2018) were obtained from UCSC Xena. Five signatures were tested: the fitness signature, the three drug-specific signatures and the whole-contrast carboplatin signature. Primary tumours were scored by the mean z-score of up-genes minus down-genes, and Cox models (lifelines; Davidson-Pilon, 2019) were fitted per standard deviation of score.</w:t>
       </w:r>
     </w:p>
     <w:p>
@@ -791,10 +809,46 @@
           <w:b/>
           <w:bCs/>
         </w:rPr>
-        <w:t xml:space="preserve">Competing interests.</w:t>
-      </w:r>
-      <w:r>
-        <w:t xml:space="preserve"> The authors declare no competing interests.</w:t>
+        <w:t xml:space="preserve">Code and data availability.</w:t>
+      </w:r>
+      <w:r>
+        <w:t xml:space="preserve"> All data are public: GSE223003, GSE150949, GSE228382 with figshare 24787458, and TCGA-OV through UCSC Xena. The code is available at [REPOSITORY URL] and archived at Zenodo ([ZENODO DOI]) under the MIT licence. The repository contains the analysis package, one numbered script per analysis step, the configuration file (</w:t>
+      </w:r>
+      <w:r>
+        <w:rPr>
+          <w:rFonts w:ascii="Consolas" w:cs="Consolas" w:eastAsia="Consolas" w:hAnsi="Consolas"/>
+        </w:rPr>
+        <w:t xml:space="preserve">configs/default.yaml</w:t>
+      </w:r>
+      <w:r>
+        <w:t xml:space="preserve">, which fixes the random seed and all hyperparameters), a locked Python environment (</w:t>
+      </w:r>
+      <w:r>
+        <w:rPr>
+          <w:rFonts w:ascii="Consolas" w:cs="Consolas" w:eastAsia="Consolas" w:hAnsi="Consolas"/>
+        </w:rPr>
+        <w:t xml:space="preserve">uv.lock</w:t>
+      </w:r>
+      <w:r>
+        <w:t xml:space="preserve">, exported as </w:t>
+      </w:r>
+      <w:r>
+        <w:rPr>
+          <w:rFonts w:ascii="Consolas" w:cs="Consolas" w:eastAsia="Consolas" w:hAnsi="Consolas"/>
+        </w:rPr>
+        <w:t xml:space="preserve">requirements.lock.txt</w:t>
+      </w:r>
+      <w:r>
+        <w:t xml:space="preserve">; Python 3.12, NumPy 2.5, scikit-learn 1.9, Scanpy 1.12, PyTorch 2.14 CPU) and a single script (</w:t>
+      </w:r>
+      <w:r>
+        <w:rPr>
+          <w:rFonts w:ascii="Consolas" w:cs="Consolas" w:eastAsia="Consolas" w:hAnsi="Consolas"/>
+        </w:rPr>
+        <w:t xml:space="preserve">scripts/run_all.sh</w:t>
+      </w:r>
+      <w:r>
+        <w:t xml:space="preserve">) that regenerates every result, figure and supplementary table from the public data on a laptop CPU; only the Geneformer forward pass used a GPU (a Kaggle T4; the notebook is included). Every metric is appended to a results table together with a hash of the configuration that produced it. All result tables underlying the figures and text, including full differential expression and gene-set enrichment results, are provided as Supplementary Tables S1–S21 (Supplementary_Tables.xlsx).</w:t>
       </w:r>
     </w:p>
     <w:p>
@@ -807,6 +861,54 @@
           <w:b/>
           <w:bCs/>
         </w:rPr>
+        <w:t xml:space="preserve">Author contributions.</w:t>
+      </w:r>
+      <w:r>
+        <w:t xml:space="preserve"> [To be completed by the authors.]</w:t>
+      </w:r>
+    </w:p>
+    <w:p>
+      <w:pPr>
+        <w:spacing w:after="160" w:line="360"/>
+        <w:jc w:val="both"/>
+      </w:pPr>
+      <w:r>
+        <w:rPr>
+          <w:b/>
+          <w:bCs/>
+        </w:rPr>
+        <w:t xml:space="preserve">Funding.</w:t>
+      </w:r>
+      <w:r>
+        <w:t xml:space="preserve"> [To be completed by the authors.]</w:t>
+      </w:r>
+    </w:p>
+    <w:p>
+      <w:pPr>
+        <w:spacing w:after="160" w:line="360"/>
+        <w:jc w:val="both"/>
+      </w:pPr>
+      <w:r>
+        <w:rPr>
+          <w:b/>
+          <w:bCs/>
+        </w:rPr>
+        <w:t xml:space="preserve">Competing interests.</w:t>
+      </w:r>
+      <w:r>
+        <w:t xml:space="preserve"> The authors declare no competing interests.</w:t>
+      </w:r>
+    </w:p>
+    <w:p>
+      <w:pPr>
+        <w:spacing w:after="160" w:line="360"/>
+        <w:jc w:val="both"/>
+      </w:pPr>
+      <w:r>
+        <w:rPr>
+          <w:b/>
+          <w:bCs/>
+        </w:rPr>
         <w:t xml:space="preserve">Use of AI tools.</w:t>
       </w:r>
       <w:r>
@@ -834,7 +936,7 @@
       <w:r>
         <w:drawing>
           <wp:inline distT="0" distB="0" distL="0" distR="0">
-            <wp:extent cx="5905500" cy="3552825"/>
+            <wp:extent cx="5905500" cy="3609975"/>
             <wp:effectExtent t="0" r="0" b="0" l="0"/>
             <wp:docPr id="1" name="" descr="" title=""/>
             <wp:cNvGraphicFramePr>
@@ -859,7 +961,7 @@
                   <pic:spPr bwMode="auto">
                     <a:xfrm>
                       <a:off x="0" y="0"/>
-                      <a:ext cx="5905500" cy="3552825"/>
+                      <a:ext cx="5905500" cy="3609975"/>
                     </a:xfrm>
                     <a:prstGeom prst="rect">
                       <a:avLst/>
@@ -896,7 +998,7 @@
       <w:r>
         <w:drawing>
           <wp:inline distT="0" distB="0" distL="0" distR="0">
-            <wp:extent cx="5905500" cy="2571750"/>
+            <wp:extent cx="5905500" cy="2638425"/>
             <wp:effectExtent t="0" r="0" b="0" l="0"/>
             <wp:docPr id="1" name="" descr="" title=""/>
             <wp:cNvGraphicFramePr>
@@ -921,7 +1023,7 @@
                   <pic:spPr bwMode="auto">
                     <a:xfrm>
                       <a:off x="0" y="0"/>
-                      <a:ext cx="5905500" cy="2571750"/>
+                      <a:ext cx="5905500" cy="2638425"/>
                     </a:xfrm>
                     <a:prstGeom prst="rect">
                       <a:avLst/>
@@ -958,7 +1060,7 @@
       <w:r>
         <w:drawing>
           <wp:inline distT="0" distB="0" distL="0" distR="0">
-            <wp:extent cx="5905500" cy="2362200"/>
+            <wp:extent cx="5905500" cy="2381250"/>
             <wp:effectExtent t="0" r="0" b="0" l="0"/>
             <wp:docPr id="1" name="" descr="" title=""/>
             <wp:cNvGraphicFramePr>
@@ -983,7 +1085,7 @@
                   <pic:spPr bwMode="auto">
                     <a:xfrm>
                       <a:off x="0" y="0"/>
-                      <a:ext cx="5905500" cy="2362200"/>
+                      <a:ext cx="5905500" cy="2381250"/>
                     </a:xfrm>
                     <a:prstGeom prst="rect">
                       <a:avLst/>
@@ -1009,7 +1111,7 @@
         <w:t xml:space="preserve">Figure 3. Most of the signal is shared with the untreated control.</w:t>
       </w:r>
       <w:r>
-        <w:t xml:space="preserve"> (a) AUROC of PCA-logistic models trained on one arm and tested on another; the diagonal shows within-arm cross-validation. (b) For each drug arm: AUROC of the drug-arm model, of the control-arm (fitness) model applied to drug-arm cells, and of the drug score after within-sample regression on the fitness score. (c) Drug-specific AUROC gain over the fitness model with training size matched, under three preprocessing variants.</w:t>
+        <w:t xml:space="preserve"> (a) AUROC of PCA-logistic models trained on one arm and tested on another; the diagonal shows within-arm cross-validation. (b) For each drug arm: AUROC of the drug-arm model, of the control-arm (fitness) model applied to drug-arm cells, and of the drug score after within-sample regression on the fitness score. (c) Drug-specific AUROC gain over the fitness model with training size matched (ΔAUROC, mean over 10 training subsamples), under three preprocessing variants; error bars are 95% paired family-bootstrap intervals (Table S19).</w:t>
       </w:r>
     </w:p>
     <w:p>
@@ -1020,7 +1122,7 @@
       <w:r>
         <w:drawing>
           <wp:inline distT="0" distB="0" distL="0" distR="0">
-            <wp:extent cx="5905500" cy="2095500"/>
+            <wp:extent cx="5905500" cy="2686050"/>
             <wp:effectExtent t="0" r="0" b="0" l="0"/>
             <wp:docPr id="1" name="" descr="" title=""/>
             <wp:cNvGraphicFramePr>
@@ -1045,7 +1147,7 @@
                   <pic:spPr bwMode="auto">
                     <a:xfrm>
                       <a:off x="0" y="0"/>
-                      <a:ext cx="5905500" cy="2095500"/>
+                      <a:ext cx="5905500" cy="2686050"/>
                     </a:xfrm>
                     <a:prstGeom prst="rect">
                       <a:avLst/>
@@ -1068,10 +1170,10 @@
           <w:b/>
           <w:bCs/>
         </w:rPr>
-        <w:t xml:space="preserve">Figure 4. Sister discordance caps predictability.</w:t>
-      </w:r>
-      <w:r>
-        <w:t xml:space="preserve"> (a) Intraclass correlation of principal-component scores between pre-treatment sisters and between random same-sample pairs. (b) Expected AUROC as a function of the correlation between score and sister liability under the bivariate-normal model with label noise π = 0.1 (line), with each arm's observed PCA-logistic AUROC (dots) and the AUROC implied if the treated sister's own state were scored (diamonds). (c) AUROC lost to sister discordance as a function of assumed label noise.</w:t>
+        <w:t xml:space="preserve">Figure 4. Biology of the shared and drug-specific components.</w:t>
+      </w:r>
+      <w:r>
+        <w:t xml:space="preserve"> (a) Normalised enrichment scores of Hallmark gene sets for the control contrast (fitness) and for each drug contrast after subtracting the control contrast; asterisks mark FDR &lt; 0.05. (b) Odds ratios for inferred copy-number clusters among pre-resistant versus pre-sensitive cells in each arm.</w:t>
       </w:r>
     </w:p>
     <w:p>
@@ -1082,7 +1184,7 @@
       <w:r>
         <w:drawing>
           <wp:inline distT="0" distB="0" distL="0" distR="0">
-            <wp:extent cx="5905500" cy="2619375"/>
+            <wp:extent cx="5905500" cy="2114550"/>
             <wp:effectExtent t="0" r="0" b="0" l="0"/>
             <wp:docPr id="1" name="" descr="" title=""/>
             <wp:cNvGraphicFramePr>
@@ -1107,7 +1209,7 @@
                   <pic:spPr bwMode="auto">
                     <a:xfrm>
                       <a:off x="0" y="0"/>
-                      <a:ext cx="5905500" cy="2619375"/>
+                      <a:ext cx="5905500" cy="2114550"/>
                     </a:xfrm>
                     <a:prstGeom prst="rect">
                       <a:avLst/>
@@ -1130,10 +1232,10 @@
           <w:b/>
           <w:bCs/>
         </w:rPr>
-        <w:t xml:space="preserve">Figure 5. Biology of the shared and drug-specific components.</w:t>
-      </w:r>
-      <w:r>
-        <w:t xml:space="preserve"> (a) Normalised enrichment scores of Hallmark gene sets for the control contrast (fitness) and for each drug contrast after subtracting the control contrast; asterisks mark FDR &lt; 0.05. (b) Odds ratios for inferred copy-number clusters among pre-resistant versus pre-sensitive cells in each arm.</w:t>
+        <w:t xml:space="preserve">Figure 5. Sister discordance caps predictability.</w:t>
+      </w:r>
+      <w:r>
+        <w:t xml:space="preserve"> (a) Intraclass correlation of principal-component scores between pre-treatment sisters and between random same-sample pairs. (b) Expected AUROC as a function of the correlation between score and sister liability under the bivariate-normal model with label noise π = 0.1 (line), with each arm's observed PCA-logistic AUROC (dots) and the AUROC implied if the treated sister's own state were scored (diamonds). (c) AUROC lost to sister discordance as a function of assumed label noise π.</w:t>
       </w:r>
     </w:p>
     <w:p>
@@ -1144,7 +1246,7 @@
       <w:r>
         <w:drawing>
           <wp:inline distT="0" distB="0" distL="0" distR="0">
-            <wp:extent cx="5905500" cy="1943100"/>
+            <wp:extent cx="5905500" cy="4552950"/>
             <wp:effectExtent t="0" r="0" b="0" l="0"/>
             <wp:docPr id="1" name="" descr="" title=""/>
             <wp:cNvGraphicFramePr>
@@ -1169,7 +1271,7 @@
                   <pic:spPr bwMode="auto">
                     <a:xfrm>
                       <a:off x="0" y="0"/>
-                      <a:ext cx="5905500" cy="1943100"/>
+                      <a:ext cx="5905500" cy="4552950"/>
                     </a:xfrm>
                     <a:prstGeom prst="rect">
                       <a:avLst/>
@@ -1195,7 +1297,7 @@
         <w:t xml:space="preserve">Figure 6. External and clinical checks.</w:t>
       </w:r>
       <w:r>
-        <w:t xml:space="preserve"> (a, b) AUROC for predicting lineage persistence from untreated cells in Watermelon (a) and triple-negative breast cancer (b), using clone size, technical covariates, expression, expression within singleton lineages, and zero-shot transfer of ReSisTrace models; error bars are 95% lineage-bootstrap intervals. (c) Hazard ratios per standard deviation of signature score for overall survival and progression-free interval in TCGA-OV.</w:t>
+        <w:t xml:space="preserve"> (a, b) AUROC for predicting lineage persistence from untreated cells in Watermelon (a) and triple-negative breast cancer (b), using clone size, technical covariates, expression, expression within singleton lineages, and zero-shot transfer of ReSisTrace models; error bars are 95% lineage-bootstrap intervals. (c) Hazard ratios per standard deviation of signature score for overall survival and progression-free interval in TCGA-OV; the fitness, whole-contrast and drug-specific signatures are defined in Methods (Differential expression and pathways). (d) Change in signature score from treatment-naive to post-treatment malignant cells in 11 patients with high-grade serous ovarian cancer receiving neoadjuvant carboplatin–paclitaxel (Zhang et al., 2022); one dot per patient, filled where both samples came from the same anatomical site; the vertical line is the median and the grey band spans ±2 s.d. of the medians of 200 expression-matched random gene sets.</w:t>
       </w:r>
     </w:p>
     <w:p>
@@ -1206,7 +1308,7 @@
       <w:r>
         <w:drawing>
           <wp:inline distT="0" distB="0" distL="0" distR="0">
-            <wp:extent cx="5905500" cy="3600450"/>
+            <wp:extent cx="5905500" cy="3629025"/>
             <wp:effectExtent t="0" r="0" b="0" l="0"/>
             <wp:docPr id="1" name="" descr="" title=""/>
             <wp:cNvGraphicFramePr>
@@ -1231,7 +1333,7 @@
                   <pic:spPr bwMode="auto">
                     <a:xfrm>
                       <a:off x="0" y="0"/>
-                      <a:ext cx="5905500" cy="3600450"/>
+                      <a:ext cx="5905500" cy="3629025"/>
                     </a:xfrm>
                     <a:prstGeom prst="rect">
                       <a:avLst/>
@@ -1268,7 +1370,7 @@
       <w:r>
         <w:drawing>
           <wp:inline distT="0" distB="0" distL="0" distR="0">
-            <wp:extent cx="5905500" cy="4371975"/>
+            <wp:extent cx="5905500" cy="7677150"/>
             <wp:effectExtent t="0" r="0" b="0" l="0"/>
             <wp:docPr id="1" name="" descr="" title=""/>
             <wp:cNvGraphicFramePr>
@@ -1293,7 +1395,7 @@
                   <pic:spPr bwMode="auto">
                     <a:xfrm>
                       <a:off x="0" y="0"/>
-                      <a:ext cx="5905500" cy="4371975"/>
+                      <a:ext cx="5905500" cy="7677150"/>
                     </a:xfrm>
                     <a:prstGeom prst="rect">
                       <a:avLst/>
@@ -1316,7 +1418,69 @@
           <w:b/>
           <w:bCs/>
         </w:rPr>
-        <w:t xml:space="preserve">Figure S2. Graph model ablation.</w:t>
+        <w:t xml:space="preserve">Figure S2. Pre-specified marker panel.</w:t>
+      </w:r>
+      <w:r>
+        <w:t xml:space="preserve"> z-scores for pre-resistant versus pre-sensitive cells. The control column shows the control (fitness) contrast; the drug columns show the difference from the control contrast, z_diff = (z_drug − z_control)/√2. Asterisks mark FDR &lt; 0.05 for z_diff. Genes not among the 5,005 retained genes (CDKN2A, RB1, GLB1, KDM5A) are omitted.</w:t>
+      </w:r>
+    </w:p>
+    <w:p>
+      <w:pPr>
+        <w:keepNext/>
+        <w:spacing w:before="240"/>
+      </w:pPr>
+      <w:r>
+        <w:drawing>
+          <wp:inline distT="0" distB="0" distL="0" distR="0">
+            <wp:extent cx="5905500" cy="4124325"/>
+            <wp:effectExtent t="0" r="0" b="0" l="0"/>
+            <wp:docPr id="1" name="" descr="" title=""/>
+            <wp:cNvGraphicFramePr>
+              <a:graphicFrameLocks xmlns:a="http://schemas.openxmlformats.org/drawingml/2006/main" noChangeAspect="1"/>
+            </wp:cNvGraphicFramePr>
+            <a:graphic xmlns:a="http://schemas.openxmlformats.org/drawingml/2006/main">
+              <a:graphicData uri="http://schemas.openxmlformats.org/drawingml/2006/picture">
+                <pic:pic xmlns:pic="http://schemas.openxmlformats.org/drawingml/2006/picture">
+                  <pic:nvPicPr>
+                    <pic:cNvPr id="0" name="" descr=""/>
+                    <pic:cNvPicPr>
+                      <a:picLocks noChangeAspect="1" noChangeArrowheads="1"/>
+                    </pic:cNvPicPr>
+                  </pic:nvPicPr>
+                  <pic:blipFill>
+                    <a:blip r:embed="rId16" cstate="none"/>
+                    <a:srcRect/>
+                    <a:stretch>
+                      <a:fillRect/>
+                    </a:stretch>
+                  </pic:blipFill>
+                  <pic:spPr bwMode="auto">
+                    <a:xfrm>
+                      <a:off x="0" y="0"/>
+                      <a:ext cx="5905500" cy="4124325"/>
+                    </a:xfrm>
+                    <a:prstGeom prst="rect">
+                      <a:avLst/>
+                    </a:prstGeom>
+                  </pic:spPr>
+                </pic:pic>
+              </a:graphicData>
+            </a:graphic>
+          </wp:inline>
+        </w:drawing>
+      </w:r>
+    </w:p>
+    <w:p>
+      <w:pPr>
+        <w:spacing w:after="160" w:line="360"/>
+        <w:jc w:val="both"/>
+      </w:pPr>
+      <w:r>
+        <w:rPr>
+          <w:b/>
+          <w:bCs/>
+        </w:rPr>
+        <w:t xml:space="preserve">Figure S3. Graph model ablation.</w:t>
       </w:r>
       <w:r>
         <w:t xml:space="preserve"> Within-arm AUROC for logistic regression, an MLP, an MLP with sister-pair pretraining, the graph network, and the graph network with pretraining (mean ± s.d. over seeds).</w:t>
@@ -1358,6 +1522,35 @@
           <w:sz w:val="20"/>
           <w:szCs w:val="20"/>
         </w:rPr>
+        <w:t xml:space="preserve">Chen H, Venkatesh MS, Gomez Ortega J, et al. Quantized multi-task learning for context-specific representations of gene network dynamics. </w:t>
+      </w:r>
+      <w:r>
+        <w:rPr>
+          <w:i/>
+          <w:iCs/>
+          <w:sz w:val="20"/>
+          <w:szCs w:val="20"/>
+        </w:rPr>
+        <w:t xml:space="preserve">bioRxiv</w:t>
+      </w:r>
+      <w:r>
+        <w:rPr>
+          <w:sz w:val="20"/>
+          <w:szCs w:val="20"/>
+        </w:rPr>
+        <w:t xml:space="preserve"> (2024). doi:10.1101/2024.08.16.608180</w:t>
+      </w:r>
+    </w:p>
+    <w:p>
+      <w:pPr>
+        <w:spacing w:after="160" w:line="276"/>
+        <w:jc w:val="left"/>
+      </w:pPr>
+      <w:r>
+        <w:rPr>
+          <w:sz w:val="20"/>
+          <w:szCs w:val="20"/>
+        </w:rPr>
         <w:t xml:space="preserve">Chen J, Wang X, Ma A, et al. Deep transfer learning of cancer drug responses by integrating bulk and single-cell RNA-seq data. </w:t>
       </w:r>
       <w:r>
@@ -1764,6 +1957,35 @@
           <w:sz w:val="20"/>
           <w:szCs w:val="20"/>
         </w:rPr>
+        <w:t xml:space="preserve">Korsunsky I, Millard N, Fan J, et al. Fast, sensitive and accurate integration of single-cell data with Harmony. </w:t>
+      </w:r>
+      <w:r>
+        <w:rPr>
+          <w:i/>
+          <w:iCs/>
+          <w:sz w:val="20"/>
+          <w:szCs w:val="20"/>
+        </w:rPr>
+        <w:t xml:space="preserve">Nat Methods</w:t>
+      </w:r>
+      <w:r>
+        <w:rPr>
+          <w:sz w:val="20"/>
+          <w:szCs w:val="20"/>
+        </w:rPr>
+        <w:t xml:space="preserve"> 16, 1289–1296 (2019). doi:10.1038/s41592-019-0619-0</w:t>
+      </w:r>
+    </w:p>
+    <w:p>
+      <w:pPr>
+        <w:spacing w:after="160" w:line="276"/>
+        <w:jc w:val="left"/>
+      </w:pPr>
+      <w:r>
+        <w:rPr>
+          <w:sz w:val="20"/>
+          <w:szCs w:val="20"/>
+        </w:rPr>
         <w:t xml:space="preserve">Kronheim S, Wang J, Chen JY, et al. Chemotherapy reshapes cellular clonal landscape via persister programs in breast cancer xenografts. </w:t>
       </w:r>
       <w:r>
@@ -1793,6 +2015,35 @@
           <w:sz w:val="20"/>
           <w:szCs w:val="20"/>
         </w:rPr>
+        <w:t xml:space="preserve">Lause J, Berens P, Kobak D. Analytic Pearson residuals for normalization of single-cell RNA-seq UMI data. </w:t>
+      </w:r>
+      <w:r>
+        <w:rPr>
+          <w:i/>
+          <w:iCs/>
+          <w:sz w:val="20"/>
+          <w:szCs w:val="20"/>
+        </w:rPr>
+        <w:t xml:space="preserve">Genome Biol</w:t>
+      </w:r>
+      <w:r>
+        <w:rPr>
+          <w:sz w:val="20"/>
+          <w:szCs w:val="20"/>
+        </w:rPr>
+        <w:t xml:space="preserve"> 22, 258 (2021). doi:10.1186/s13059-021-02451-7</w:t>
+      </w:r>
+    </w:p>
+    <w:p>
+      <w:pPr>
+        <w:spacing w:after="160" w:line="276"/>
+        <w:jc w:val="left"/>
+      </w:pPr>
+      <w:r>
+        <w:rPr>
+          <w:sz w:val="20"/>
+          <w:szCs w:val="20"/>
+        </w:rPr>
         <w:t xml:space="preserve">Liberzon A, Birger C, Thorvaldsdóttir H, et al. The Molecular Signatures Database (MSigDB) hallmark gene set collection. </w:t>
       </w:r>
       <w:r>
@@ -1851,6 +2102,35 @@
           <w:sz w:val="20"/>
           <w:szCs w:val="20"/>
         </w:rPr>
+        <w:t xml:space="preserve">Lopez R, Regier J, Cole MB, Jordan MI, Yosef N. Deep generative modeling for single-cell transcriptomics. </w:t>
+      </w:r>
+      <w:r>
+        <w:rPr>
+          <w:i/>
+          <w:iCs/>
+          <w:sz w:val="20"/>
+          <w:szCs w:val="20"/>
+        </w:rPr>
+        <w:t xml:space="preserve">Nat Methods</w:t>
+      </w:r>
+      <w:r>
+        <w:rPr>
+          <w:sz w:val="20"/>
+          <w:szCs w:val="20"/>
+        </w:rPr>
+        <w:t xml:space="preserve"> 15, 1053–1058 (2018). doi:10.1038/s41592-018-0229-2</w:t>
+      </w:r>
+    </w:p>
+    <w:p>
+      <w:pPr>
+        <w:spacing w:after="160" w:line="276"/>
+        <w:jc w:val="left"/>
+      </w:pPr>
+      <w:r>
+        <w:rPr>
+          <w:sz w:val="20"/>
+          <w:szCs w:val="20"/>
+        </w:rPr>
         <w:t xml:space="preserve">Marine JC, Dawson SJ, Dawson MA. Non-genetic mechanisms of therapeutic resistance in cancer. </w:t>
       </w:r>
       <w:r>
@@ -2402,6 +2682,35 @@
           <w:sz w:val="20"/>
           <w:szCs w:val="20"/>
         </w:rPr>
+        <w:t xml:space="preserve">Theodoris CV, Xiao L, Chopra A, et al. Transfer learning enables predictions in network biology. </w:t>
+      </w:r>
+      <w:r>
+        <w:rPr>
+          <w:i/>
+          <w:iCs/>
+          <w:sz w:val="20"/>
+          <w:szCs w:val="20"/>
+        </w:rPr>
+        <w:t xml:space="preserve">Nature</w:t>
+      </w:r>
+      <w:r>
+        <w:rPr>
+          <w:sz w:val="20"/>
+          <w:szCs w:val="20"/>
+        </w:rPr>
+        <w:t xml:space="preserve"> 618, 616–624 (2023). doi:10.1038/s41586-023-06139-9</w:t>
+      </w:r>
+    </w:p>
+    <w:p>
+      <w:pPr>
+        <w:spacing w:after="160" w:line="276"/>
+        <w:jc w:val="left"/>
+      </w:pPr>
+      <w:r>
+        <w:rPr>
+          <w:sz w:val="20"/>
+          <w:szCs w:val="20"/>
+        </w:rPr>
         <w:t xml:space="preserve">Tirosh I, Izar B, Prakadan SM, et al. Dissecting the multicellular ecosystem of metastatic melanoma by single-cell RNA-seq. </w:t>
       </w:r>
       <w:r>
@@ -2535,6 +2844,35 @@
           <w:szCs w:val="20"/>
         </w:rPr>
         <w:t xml:space="preserve"> 19, 15 (2018). doi:10.1186/s13059-017-1382-0</w:t>
+      </w:r>
+    </w:p>
+    <w:p>
+      <w:pPr>
+        <w:spacing w:after="160" w:line="276"/>
+        <w:jc w:val="left"/>
+      </w:pPr>
+      <w:r>
+        <w:rPr>
+          <w:sz w:val="20"/>
+          <w:szCs w:val="20"/>
+        </w:rPr>
+        <w:t xml:space="preserve">Zhang K, Erkan EP, Jamalzadeh S, et al. Longitudinal single-cell RNA-seq analysis reveals stress-promoted chemoresistance in metastatic ovarian cancer. </w:t>
+      </w:r>
+      <w:r>
+        <w:rPr>
+          <w:i/>
+          <w:iCs/>
+          <w:sz w:val="20"/>
+          <w:szCs w:val="20"/>
+        </w:rPr>
+        <w:t xml:space="preserve">Sci Adv</w:t>
+      </w:r>
+      <w:r>
+        <w:rPr>
+          <w:sz w:val="20"/>
+          <w:szCs w:val="20"/>
+        </w:rPr>
+        <w:t xml:space="preserve"> 8, eabm1831 (2022). doi:10.1126/sciadv.abm1831 ✓</w:t>
       </w:r>
     </w:p>
     <w:p>

</xml_diff>

<commit_message>
Test the label-free density score in the two external lineage data sets
It reaches only 0.53 (Watermelon) and 0.57 (TNBC), against 0.63-0.70 in ReSisTrace, so the
typicality effect is specific to sister-level labels rather than a general property of
clone-level lineage data. Reported in Results, Fig 6a,b and Table S13.
</commit_message>
<xml_diff>
--- a/paper/manuscript.docx
+++ b/paper/manuscript.docx
@@ -271,7 +271,7 @@
         <w:jc w:val="both"/>
       </w:pPr>
       <w:r>
-        <w:t xml:space="preserve">While checking the shuffled-label controls, we noticed that gradient boosting trained on shuffled labels still scored above chance on the true labels (AUROC 0.56–0.58 in six refits on the olaparib and carboplatin arms; 0.56 with principal components alone), although the shuffled labels were uncorrelated with the true ones (|r| &lt; 0.01). Logistic regression trained on the same shuffled labels scored 0.47–0.54. This led us to a simple label-free score: the mean distance from a cell to its 15 nearest neighbours in principal-component space within its own sample. Pre-resistant cells lay in denser, more typical regions of state space. Density alone separated the classes with AUROC 0.70 (carboplatin), 0.69 (olaparib), 0.63 (NK) and 0.67 (control), essentially unchanged within single samples and after removing cell cycle, depth and mitochondrial content (0.63–0.69). It correlated with the supervised PCA-logistic score (Spearman 0.54–0.70). Much of what the supervised models learn is therefore available without any labels: cells whose sisters are recovered, with or without treatment, tend to be in common states, and cells in unusual states tend to lose their sisters. The control arm shows the same pattern as the drug arms, which fits a fitness effect. It also means that shuffled-label controls for flexible models should not be assumed to sit at 0.5, and each model should be compared with its own null.</w:t>
+        <w:t xml:space="preserve">While checking the shuffled-label controls, we noticed that gradient boosting trained on shuffled labels still scored above chance on the true labels (AUROC 0.56–0.58 in six refits on the olaparib and carboplatin arms; 0.56 with principal components alone), although the shuffled labels were uncorrelated with the true ones (|r| &lt; 0.01). Logistic regression trained on the same shuffled labels scored 0.47–0.54. This led us to a simple label-free score: the mean distance from a cell to its 15 nearest neighbours in principal-component space within its own sample. Pre-resistant cells lay in denser, more typical regions of state space. Density alone separated the classes with AUROC 0.70 (carboplatin), 0.69 (olaparib), 0.63 (NK) and 0.67 (control), essentially unchanged within single samples and after removing cell cycle, depth and mitochondrial content (0.63–0.69). It correlated with the supervised PCA-logistic score (Spearman 0.54–0.70). Much of what the supervised models learn is therefore available without any labels: cells whose sisters are recovered, with or without treatment, tend to be in common states, and cells in unusual states tend to lose their sisters. The control arm shows the same pattern as the drug arms, which fits a fitness effect. It also means that shuffled-label controls for flexible models should not be assumed to sit at 0.5, and each model should be compared with its own null. The effect is specific to this design: in the two external lineage-tracing data sets, where labels belong to whole clones rather than to a sister, the same score reached only 0.53 and 0.57 (Table S13). Density therefore tracks whether a cell's sister is recovered, not whether a clone is re-sampled.</w:t>
       </w:r>
     </w:p>
     <w:p>
@@ -401,16 +401,16 @@
         <w:jc w:val="both"/>
       </w:pPr>
       <w:r>
-        <w:t xml:space="preserve">In the Watermelon data (PC9 lung cancer cells, osimertinib; Oren et al., 2021), 5,087 barcoded day-0 cells from 2,993 lineages were labelled by whether their lineage was observed at day 14. Clone size alone predicted this label with AUROC 0.76. Expression alone reached 0.61, added 0.01 to clone size, and reached 0.58 among singleton lineages, where clone size carries no information. Models trained on ReSisTrace and applied without refitting scored 0.49–0.52 (Fig. 6a).</w:t>
-      </w:r>
-    </w:p>
-    <w:p>
-      <w:pPr>
-        <w:spacing w:after="160" w:line="360"/>
-        <w:jc w:val="both"/>
-      </w:pPr>
-      <w:r>
-        <w:t xml:space="preserve">In the triple-negative breast cancer data (MDA-MB-468, afatinib; Pellecchia et al., 2024), 1,541 untreated barcoded cells from 448 lineages were labelled with the authors' annotation of lineages found among drug-tolerant expanded persisters after 40 days (55.9% positive). Clone size alone gave AUROC 0.88 and expression alone 0.64; together they gave 0.88. ReSisTrace models transferred slightly above chance (0.54–0.57). Among the 237 singleton lineages, the ReSisTrace control model transferred best (0.64, 95% CI 0.53–0.76), which fits the idea that what transfers is fitness rather than drug tolerance. The subset is small, however, and we do not rely on it (Fig. 6b).</w:t>
+        <w:t xml:space="preserve">In the Watermelon data (PC9 lung cancer cells, osimertinib; Oren et al., 2021), 5,087 barcoded day-0 cells from 2,993 lineages were labelled by whether their lineage was observed at day 14. Clone size alone predicted this label with AUROC 0.76. Expression alone reached 0.61, added 0.01 to clone size, and reached 0.58 among singleton lineages, where clone size carries no information. Models trained on ReSisTrace and applied without refitting scored 0.49–0.52. The label-free density score, which reaches 0.63–0.70 in ReSisTrace, gave only 0.533 here (95% CI 0.517–0.552; Fig. 6a).</w:t>
+      </w:r>
+    </w:p>
+    <w:p>
+      <w:pPr>
+        <w:spacing w:after="160" w:line="360"/>
+        <w:jc w:val="both"/>
+      </w:pPr>
+      <w:r>
+        <w:t xml:space="preserve">In the triple-negative breast cancer data (MDA-MB-468, afatinib; Pellecchia et al., 2024), 1,541 untreated barcoded cells from 448 lineages were labelled with the authors' annotation of lineages found among drug-tolerant expanded persisters after 40 days (55.9% positive). Clone size alone gave AUROC 0.88 and expression alone 0.64; together they gave 0.88. ReSisTrace models transferred slightly above chance (0.54–0.57). Among the 237 singleton lineages, the ReSisTrace control model transferred best (0.64, 95% CI 0.53–0.76), which fits the idea that what transfers is fitness rather than drug tolerance. The subset is small, however, and we do not rely on it. The label-free density score gave 0.570 (95% CI 0.530–0.605; Fig. 6b).</w:t>
       </w:r>
     </w:p>
     <w:p>
@@ -675,7 +675,7 @@
         <w:t xml:space="preserve">Foundation-model embeddings.</w:t>
       </w:r>
       <w:r>
-        <w:t xml:space="preserve"> We also represented each cell by Geneformer (Theodoris et al., 2023), using the cancer-tuned V2 model with 104 million parameters (Geneformer-V2-104M_CLcancer, continually pretrained on about 14 million cancer transcriptomes; Chen et al., 2024). Raw counts of each pre-treatment cell were rank-value encoded as in Geneformer: counts were scaled to 10,000 per cell, divided by each gene's median in the pretraining corpus, and genes were ranked, keeping the top 4,094 plus the &lt;cls&gt; and &lt;eos&gt; tokens (16,019–16,517 genes per sample were in the model vocabulary). The cell embedding was the mean over gene positions of the penultimate hidden layer (768 dimensions), Geneformer's default. The model was used without fine-tuning, so the embedding does not see the labels. The forward pass ran in half precision on one NVIDIA T4 GPU (Kaggle). Embeddings were z-scored within each sample, as the principal components were, and the logistic and fitness analyses were rerun unchanged.</w:t>
+        <w:t xml:space="preserve"> We also represented each cell by Geneformer (Theodoris et al., 2023), using the cancer-tuned V2 model with 104 million parameters (Geneformer-V2-104M_CLcancer, continually pretrained on about 14 million cancer transcriptomes; Chen et al., 2026). Raw counts of each pre-treatment cell were rank-value encoded as in Geneformer: counts were scaled to 10,000 per cell, divided by each gene's median in the pretraining corpus, and genes were ranked, keeping the top 4,094 plus the &lt;cls&gt; and &lt;eos&gt; tokens (16,019–16,517 genes per sample were in the model vocabulary). The cell embedding was the mean over gene positions of the penultimate hidden layer (768 dimensions), Geneformer's default. The model was used without fine-tuning, so the embedding does not see the labels. The forward pass ran in half precision on one NVIDIA T4 GPU (Kaggle). Embeddings were z-scored within each sample, as the principal components were, and the logistic and fitness analyses were rerun unchanged.</w:t>
       </w:r>
     </w:p>
     <w:p>
@@ -1297,7 +1297,7 @@
         <w:t xml:space="preserve">Figure 6. External and clinical checks.</w:t>
       </w:r>
       <w:r>
-        <w:t xml:space="preserve"> (a, b) AUROC for predicting lineage persistence from untreated cells in Watermelon (a) and triple-negative breast cancer (b), using clone size, technical covariates, expression, expression within singleton lineages, and zero-shot transfer of ReSisTrace models; error bars are 95% lineage-bootstrap intervals. (c) Hazard ratios per standard deviation of signature score for overall survival and progression-free interval in TCGA-OV; the fitness, whole-contrast and drug-specific signatures are defined in Methods (Differential expression and pathways). (d) Change in signature score from treatment-naive to post-treatment malignant cells in 11 patients with high-grade serous ovarian cancer receiving neoadjuvant carboplatin–paclitaxel (Zhang et al., 2022); one dot per patient, filled where both samples came from the same anatomical site; the vertical line is the median and the grey band spans ±2 s.d. of the medians of 200 expression-matched random gene sets.</w:t>
+        <w:t xml:space="preserve"> (a, b) AUROC for predicting lineage persistence from untreated cells in Watermelon (a) and triple-negative breast cancer (b), using clone size, technical covariates, expression, the label-free density score, expression within singleton lineages, and zero-shot transfer of ReSisTrace models; error bars are 95% lineage-bootstrap intervals. (c) Hazard ratios per standard deviation of signature score for overall survival and progression-free interval in TCGA-OV; the fitness, whole-contrast and drug-specific signatures are defined in Methods (Differential expression and pathways). (d) Change in signature score from treatment-naive to post-treatment malignant cells in 11 patients with high-grade serous ovarian cancer receiving neoadjuvant carboplatin–paclitaxel (Zhang et al., 2022); one dot per patient, filled where both samples came from the same anatomical site; the vertical line is the median and the grey band spans ±2 s.d. of the medians of 200 expression-matched random gene sets.</w:t>
       </w:r>
     </w:p>
     <w:p>
@@ -1522,23 +1522,23 @@
           <w:sz w:val="20"/>
           <w:szCs w:val="20"/>
         </w:rPr>
-        <w:t xml:space="preserve">Chen H, Venkatesh MS, Gomez Ortega J, et al. Quantized multi-task learning for context-specific representations of gene network dynamics. </w:t>
-      </w:r>
-      <w:r>
-        <w:rPr>
-          <w:i/>
-          <w:iCs/>
-          <w:sz w:val="20"/>
-          <w:szCs w:val="20"/>
-        </w:rPr>
-        <w:t xml:space="preserve">bioRxiv</w:t>
-      </w:r>
-      <w:r>
-        <w:rPr>
-          <w:sz w:val="20"/>
-          <w:szCs w:val="20"/>
-        </w:rPr>
-        <w:t xml:space="preserve"> (2024). doi:10.1101/2024.08.16.608180</w:t>
+        <w:t xml:space="preserve">Chen H, Venkatesh MS, Gómez Ortega J, et al. Scaling and quantization of large-scale foundation model enables resource-efficient predictions in network biology. </w:t>
+      </w:r>
+      <w:r>
+        <w:rPr>
+          <w:i/>
+          <w:iCs/>
+          <w:sz w:val="20"/>
+          <w:szCs w:val="20"/>
+        </w:rPr>
+        <w:t xml:space="preserve">Nat Comput Sci</w:t>
+      </w:r>
+      <w:r>
+        <w:rPr>
+          <w:sz w:val="20"/>
+          <w:szCs w:val="20"/>
+        </w:rPr>
+        <w:t xml:space="preserve"> 6, 450–463 (2026). doi:10.1038/s43588-026-00972-4</w:t>
       </w:r>
     </w:p>
     <w:p>

</xml_diff>

<commit_message>
Add Geneformer foundation-model embeddings as an alternative representation
The cancer-tuned Geneformer V2-104M model (frozen, mean-pooled penultimate layer, 768 dims,
forward pass on a Kaggle T4) reaches AUROC 0.671-0.683 in the drug arms, below the 0.723-0.747
of logistic regression on 50 principal components, and its fitness model still explains most
of it. The conclusion is unchanged by the representation.

Three-step pipeline in scripts/21_geneformer.py (tokens on CPU, embed on GPU, analyze),
with the GPU notebook in kaggle/geneformer/. Audit extended to 73 checks.
</commit_message>
<xml_diff>
--- a/paper/manuscript.docx
+++ b/paper/manuscript.docx
@@ -64,7 +64,7 @@
         <w:t xml:space="preserve">Results.</w:t>
       </w:r>
       <w:r>
-        <w:t xml:space="preserve"> A logistic model on 50 principal components predicted the sister's fate with AUROC 0.72–0.75 in the drug arms (label-permutation p &lt; 0.01). On the olaparib arm, under the same balanced protocol, this was well above the AUROC of about 0.50–0.60 reported for existing drug-response predictors, and neither tuning, pooling arms, gradient boosting nor a graph neural network with sister-pair pretraining improved on it (graph network 0.70–0.73 across three seeds). However, a model trained only on the untreated control arm predicted the drug-arm labels almost as well (AUROC 0.70–0.73). With training size matched, the drug-specific gain over this fitness model was 0.014–0.025 AUROC (95% confidence intervals excluding zero in every drug arm) and fell to 0.003 for NK cells once depth and mitochondrial content were removed (95% CI −0.010 to 0.016). Beyond the fitness axis, pre-resistant cells showed lower E2F, mitotic-spindle and MYC-target expression. A label-free score of how typical a cell's state is reached AUROC 0.63–0.70 on its own. Sister discordance alone cost about 0.09–0.12 AUROC. Inferred copy-number subclones did not explain the signal. In two external data sets, clone size predicted lineage survival far better than expression, and ReSisTrace models transferred at or near chance. No derived signature was associated with outcome in TCGA ovarian tumours after correction for multiple testing, and in 11 patients sampled before and after neoadjuvant chemotherapy the drug signatures were not enriched in the cells that persisted, while the fitness signature was depleted.</w:t>
+        <w:t xml:space="preserve"> A logistic model on 50 principal components predicted the sister's fate with AUROC 0.72–0.75 in the drug arms (label-permutation p &lt; 0.01). On the olaparib arm, under the same balanced protocol, this was well above the AUROC of about 0.50–0.60 reported for existing drug-response predictors, and neither tuning, pooling arms, gradient boosting, a graph neural network with sister-pair pretraining nor embeddings from a single-cell foundation model improved on it (graph network 0.70–0.73 across three seeds; Geneformer 0.67–0.68). However, a model trained only on the untreated control arm predicted the drug-arm labels almost as well (AUROC 0.70–0.73). With training size matched, the drug-specific gain over this fitness model was 0.014–0.025 AUROC (95% confidence intervals excluding zero in every drug arm) and fell to 0.003 for NK cells once depth and mitochondrial content were removed (95% CI −0.010 to 0.016). Beyond the fitness axis, pre-resistant cells showed lower E2F, mitotic-spindle and MYC-target expression. A label-free score of how typical a cell's state is reached AUROC 0.63–0.70 on its own. Sister discordance alone cost about 0.09–0.12 AUROC. Inferred copy-number subclones did not explain the signal. In two external data sets, clone size predicted lineage survival far better than expression, and ReSisTrace models transferred at or near chance. No derived signature was associated with outcome in TCGA ovarian tumours after correction for multiple testing, and in 11 patients sampled before and after neoadjuvant chemotherapy the drug signatures were not enriched in the cells that persisted, while the fitness signature was depleted.</w:t>
       </w:r>
     </w:p>
     <w:p>
@@ -254,7 +254,7 @@
         <w:jc w:val="both"/>
       </w:pPr>
       <w:r>
-        <w:t xml:space="preserve">Drug-arm and control-model scores were strongly correlated (Spearman 0.80–0.82). Adding the drug score to a logistic model that already contained the control-model score still improved fit in every arm (likelihood-ratio p &lt; 10⁻²⁵). The drug-specific component was therefore real, but it was small. The drug score residualised on the control score reached AUROC 0.60–0.63, and within quintiles of the control score 0.64–0.66 (Fig. 3b). The control arm has fewer labelled cells (4,183) than the drug arms (8,942–10,123), so we also trained drug models on random sets of whole families of the same size, repeated ten times, and put a paired family-bootstrap confidence interval on the difference (Methods). The drug-specific advantage was then 0.014 for carboplatin (95% CI 0.001–0.026), 0.025 for olaparib (0.012–0.039) and 0.017 for NK (0.003–0.031) (Fig. 3c, Table S19). The spread across the ten training subsets was small (s.d. 0.003–0.004). The gain was essentially unchanged after removing cell cycle (0.014, 0.025, 0.014). After removing depth and mitochondrial content as well, it was 0.012 for carboplatin (−0.001 to 0.025), 0.021 for olaparib (0.008–0.035) and 0.003 for NK (−0.010 to 0.016). For NK cells, therefore, nothing drug-specific could be distinguished from zero. The result did not depend on how expression was represented. We repeated the analysis with Harmony-corrected components (batch = sample; Korsunsky et al., 2019), with principal components of analytic Pearson residuals, a count-based alternative to log-normalisation (Lause et al., 2021), and with the latent space of scVI, which models library size and sample explicitly (Lopez et al., 2018). Across these representations, drug-arm models reached 0.704–0.746, the control-trained model 0.667–0.722 on the same labels, and the size-matched drug-specific gain (simpler five-repeat estimate) was 0.013–0.032 (Table S17).</w:t>
+        <w:t xml:space="preserve">Drug-arm and control-model scores were strongly correlated (Spearman 0.80–0.82). Adding the drug score to a logistic model that already contained the control-model score still improved fit in every arm (likelihood-ratio p &lt; 10⁻²⁵). The drug-specific component was therefore real, but it was small. The drug score residualised on the control score reached AUROC 0.60–0.63, and within quintiles of the control score 0.64–0.66 (Fig. 3b). The control arm has fewer labelled cells (4,183) than the drug arms (8,942–10,123), so we also trained drug models on random sets of whole families of the same size, repeated ten times, and put a paired family-bootstrap confidence interval on the difference (Methods). The drug-specific advantage was then 0.014 for carboplatin (95% CI 0.001–0.026), 0.025 for olaparib (0.012–0.039) and 0.017 for NK (0.003–0.031) (Fig. 3c, Table S19). The spread across the ten training subsets was small (s.d. 0.003–0.004). The gain was essentially unchanged after removing cell cycle (0.014, 0.025, 0.014). After removing depth and mitochondrial content as well, it was 0.012 for carboplatin (−0.001 to 0.025), 0.021 for olaparib (0.008–0.035) and 0.003 for NK (−0.010 to 0.016). For NK cells, therefore, nothing drug-specific could be distinguished from zero. The result did not depend on how expression was represented. We repeated the analysis with Harmony-corrected components (batch = sample; Korsunsky et al., 2019), with principal components of analytic Pearson residuals, a count-based alternative to log-normalisation (Lause et al., 2021), and with the latent space of scVI, which models library size and sample explicitly (Lopez et al., 2018). We also replaced the principal components with 768-dimensional cell embeddings from Geneformer, a transformer pretrained on 104 million human single-cell transcriptomes and continually pretrained on about 14 million cancer transcriptomes (Theodoris et al., 2023; Chen et al., 2026). The foundation model did not extract more signal than 50 principal components: it reached 0.671–0.683 in the drug arms, below the 0.723–0.747 of the linear model, and its fitness model still explained most of that (0.634–0.663), leaving a size-matched gain of 0.017–0.030. Across all four alternative representations, drug-arm models reached 0.671–0.746, the control-trained model 0.634–0.722 on the same labels, and the size-matched drug-specific gain (simpler five-repeat estimate) was 0.013–0.032 (Table S17).</w:t>
       </w:r>
     </w:p>
     <w:p>
@@ -490,7 +490,7 @@
         <w:jc w:val="both"/>
       </w:pPr>
       <w:r>
-        <w:t xml:space="preserve">Several limitations apply. First, ReSisTrace labels are noisy. Cells whose sister was lost or only partially matched are counted as pre-sensitive, and our ceiling handles this only through an assumed noise level. Second, the Gaussian liability model is a simplification. It assumes a single linear score and treats the fitted model as capturing the relevant direction, so the ceilings are approximate. Third, our copy-number clusters were inferred from expression and only weakly separated. They reproduced the published enrichment pattern, but they are not the original subclone calls. Fourth, all analyses use one ovarian cancer cell line, and the external checks rely on clone-level labels, on bulk tumours, and on a patient cohort of 11 in which the two samples are different pieces of tissue rather than sisters, so a negative result there has several possible causes. Finally, the graph model was tested with one architecture and modest tuning. A different design might do better, but the near-identical performance of very different models suggests that the information, not the model class, is the limit.</w:t>
+        <w:t xml:space="preserve">Several limitations apply. First, ReSisTrace labels are noisy. Cells whose sister was lost or only partially matched are counted as pre-sensitive, and our ceiling handles this only through an assumed noise level. Second, the Gaussian liability model is a simplification. It assumes a single linear score and treats the fitted model as capturing the relevant direction, so the ceilings are approximate. Third, our copy-number clusters were inferred from expression and only weakly separated. They reproduced the published enrichment pattern, but they are not the original subclone calls. Fourth, all analyses use one ovarian cancer cell line, and the external checks rely on clone-level labels, on bulk tumours, and on a patient cohort of 11 in which the two samples are different pieces of tissue rather than sisters, so a negative result there has several possible causes. Finally, the graph model was tested with one architecture and modest tuning, and the foundation model was used as a frozen feature extractor rather than fine-tuned, which may not be the best use of it. A different design might do better, but the near-identical performance of very different models, from logistic regression to a 104-million-parameter transformer, suggests that the information, not the model class, is the limit.</w:t>
       </w:r>
     </w:p>
     <w:p>

</xml_diff>

<commit_message>
Final polish: conclusions, package description, AI-use statement
</commit_message>
<xml_diff>
--- a/paper/manuscript.docx
+++ b/paper/manuscript.docx
@@ -80,7 +80,7 @@
         <w:t xml:space="preserve">Conclusions.</w:t>
       </w:r>
       <w:r>
-        <w:t xml:space="preserve"> In this system, most of what a pre-treatment transcriptome says about a sister's survival is generic fitness rather than drug-specific tolerance, and even a perfect model of the sequenced cell would be limited by the imperfect similarity of sisters. Untreated controls and sister-based ceilings should accompany claims that pre-existing states predict drug tolerance.</w:t>
+        <w:t xml:space="preserve"> In this system, most of what a pre-treatment transcriptome says about a sister's survival is generic fitness rather than drug-specific tolerance, and even a perfect model of the sequenced cell would be limited by the imperfect similarity of sisters. The fitness state does not appear to be what selects cells in treated patients. Untreated controls and sister-based ceilings should accompany claims that pre-existing states predict drug tolerance, and we provide them as a small reusable package.</w:t>
       </w:r>
     </w:p>
     <w:p>
@@ -812,7 +812,16 @@
         <w:t xml:space="preserve">Code and data availability.</w:t>
       </w:r>
       <w:r>
-        <w:t xml:space="preserve"> All data are public: GSE223003, GSE150949, GSE228382 with figshare 24787458, and TCGA-OV through UCSC Xena. The code is available at [REPOSITORY URL] and archived at Zenodo ([ZENODO DOI]) under the MIT licence. The repository contains the analysis package, one numbered script per analysis step, the configuration file (</w:t>
+        <w:t xml:space="preserve"> All data are public: GSE223003, GSE150949, GSE228382 with figshare 24787458, and TCGA-OV through UCSC Xena. The code is available at [REPOSITORY URL] and archived at Zenodo ([ZENODO DOI]) under the MIT licence. The fitness-adjusted evaluation described here (control-arm baseline, size-matched ΔAUROC with a family-level bootstrap interval, family permutation null and sister ceiling) is packaged as a small module, </w:t>
+      </w:r>
+      <w:r>
+        <w:rPr>
+          <w:rFonts w:ascii="Consolas" w:cs="Consolas" w:eastAsia="Consolas" w:hAnsi="Consolas"/>
+        </w:rPr>
+        <w:t xml:space="preserve">persist.fitadj</w:t>
+      </w:r>
+      <w:r>
+        <w:t xml:space="preserve">, that takes plain arrays and any scikit-learn classifier, so it can be applied to other lineage-tracing designs that include an untreated arm. The repository contains the analysis package, one numbered script per analysis step, the configuration file (</w:t>
       </w:r>
       <w:r>
         <w:rPr>
@@ -912,7 +921,16 @@
         <w:t xml:space="preserve">Use of AI tools.</w:t>
       </w:r>
       <w:r>
-        <w:t xml:space="preserve"> An AI assistant (Claude, Anthropic) was used to help write analysis code, retrieve and check literature, and draft text. All analyses were checked, and all text was reviewed and edited by the authors, who take full responsibility for the content.</w:t>
+        <w:t xml:space="preserve"> An AI assistant (Claude, Anthropic) was used to help write analysis code, retrieve and check literature, and draft text. Every number quoted in this manuscript is regenerated from the result tables by a script in the repository (</w:t>
+      </w:r>
+      <w:r>
+        <w:rPr>
+          <w:rFonts w:ascii="Consolas" w:cs="Consolas" w:eastAsia="Consolas" w:hAnsi="Consolas"/>
+        </w:rPr>
+        <w:t xml:space="preserve">scripts/23_audit_manuscript.py</w:t>
+      </w:r>
+      <w:r>
+        <w:t xml:space="preserve">), which fails if any value disagrees. All analyses were checked, and all text was reviewed and edited by the authors, who take full responsibility for the content.</w:t>
       </w:r>
     </w:p>
     <w:p>

</xml_diff>

<commit_message>
Cite the independent Schaff reanalysis, and test substitutes for an untreated control arm
Aviv (2026, Zenodo 22850050) preregistered a reanalysis of the same Schaff data and reaches the same
conclusion about clone abundance from a different direction, then asks which condition a clone is
detected under. Cited, and the terminology is corrected throughout: what these designs observe is
detection, not survival.

scripts/27: neither a label-free density score nor a model trained on the other drug arms reproduces
the control arm. They err in opposite directions and bracket the true gain in all three ReSisTrace arms,
but the ordering is not guaranteed - in the six Schaff treatments the two bounds cross or both go
negative for four of them. Reported as a flag, not a measurement.

Audit now at 89 checks, all passing.
</commit_message>
<xml_diff>
--- a/paper/manuscript.docx
+++ b/paper/manuscript.docx
@@ -392,6 +392,103 @@
         <w:pStyle w:val="Heading2"/>
       </w:pPr>
       <w:r>
+        <w:t xml:space="preserve">Without an untreated arm, the drug-specific gain can be bracketed but not measured (Fig. 8)</w:t>
+      </w:r>
+    </w:p>
+    <w:p>
+      <w:pPr>
+        <w:spacing w:after="160" w:line="360"/>
+        <w:jc w:val="both"/>
+      </w:pPr>
+      <w:r>
+        <w:t xml:space="preserve">The comparison at the centre of this paper needs an untreated arm, and almost no study has one. We therefore asked whether something built from the treated arms alone can stand in for it. ReSisTrace is the only data set where such a substitute can be checked, because the real control arm is there to check it against. We tried two, neither of which uses control-arm labels: the label-free density score, and a model trained on the other drug arms and applied to this one (either pooled, or averaged over the arms, which gave the same answer).</w:t>
+      </w:r>
+    </w:p>
+    <w:p>
+      <w:pPr>
+        <w:spacing w:after="160" w:line="360"/>
+        <w:jc w:val="both"/>
+      </w:pPr>
+      <w:r>
+        <w:t xml:space="preserve">Neither reproduced the control arm, and they failed in opposite directions (Fig. 8, Table S26). Measured against the real control model, the drug-specific gain was 0.022 (carboplatin), 0.031 (olaparib) and 0.027 (NK). Measured against the density score it was two to three times larger, 0.043–0.090, because density is a weaker measure of fitness and leaves more of the fitness axis to be counted as drug-specific. Measured against the other drug arms it nearly vanished, to between 0.0045 and 0.0065, because those arms carry the drug-specific component too, so using them as a baseline subtracts part of the signal being measured. Agreement with the control score was moderate for density (Spearman 0.54–0.63) and higher for the other-arm models (0.84–0.87), but neither is a substitute.</w:t>
+      </w:r>
+    </w:p>
+    <w:p>
+      <w:pPr>
+        <w:spacing w:after="160" w:line="360"/>
+        <w:jc w:val="both"/>
+      </w:pPr>
+      <w:r>
+        <w:t xml:space="preserve">The two err in opposite directions, and in all three arms the control-arm value fell between them. Where an untreated arm is missing, the pair may therefore still be worth reporting: the other-arm baseline as a low estimate, the label-free density score as a high one. We would not want this mistaken for a control arm. Three arms of one data set are not enough to establish that the ordering always holds, and in the second data set it does not: applying the same two baselines to the six treatments there gives 0.007–0.025 and 0.086–0.089 for the two MAPK inhibitors, but for the other four the two cross or both turn negative (−0.024 to 0.033 and −0.038 to 0.047), which is the same conclusion the clone-size adjustment reaches for those arms. The honest summary is that a substitute can flag when a pre-resistance signal is mostly fitness, and cannot be trusted to say by how much.</w:t>
+      </w:r>
+    </w:p>
+    <w:p>
+      <w:pPr>
+        <w:pStyle w:val="Heading2"/>
+      </w:pPr>
+      <w:r>
+        <w:t xml:space="preserve">A second lineage system, six treatments: clone size explains most of the signal again (Fig. 7)</w:t>
+      </w:r>
+    </w:p>
+    <w:p>
+      <w:pPr>
+        <w:spacing w:after="160" w:line="360"/>
+        <w:jc w:val="both"/>
+      </w:pPr>
+      <w:r>
+        <w:t xml:space="preserve">ReSisTrace is the only design we know of that carries an untreated arm through the whole protocol, so the fitness model cannot be rebuilt elsewhere. A weaker version of the same question can be asked wherever pre-treatment clone size is measured, because the size a lineage reaches in culture before any drug is itself a measure of how well it grows. Schaff et al. (2026) barcoded WM989 melanoma cells, profiled an untreated sample, split the rest across six treatments (dabrafenib, trametinib, CoCl2, acidic medium, cisplatin and doxorubicin) and sequenced the surviving cells with paired barcodes. Every untreated cell therefore carries six labels at once. We assigned lineages from the barcode features stored in the same matrices as the genes (Methods) and obtained 7,165 untreated cells from 1,695 lineages, of which 30.6% (trametinib) to 78.3% (acidic medium) lay in a lineage that was detected again after treatment. As in the other clone-level data sets, what is observed is detection, not death: a lineage can go undetected because its cells died or simply because it was not sampled.</w:t>
+      </w:r>
+    </w:p>
+    <w:p>
+      <w:pPr>
+        <w:spacing w:after="160" w:line="360"/>
+        <w:jc w:val="both"/>
+      </w:pPr>
+      <w:r>
+        <w:t xml:space="preserve">Clone size predicted detection better than expression for every one of the six treatments: AUROC 0.68–0.90 for clone size against 0.54–0.66 for a logistic model on 50 principal components, with lineage-grouped cross-validation throughout (Fig. 7a). Adding expression to clone size changed AUROC by at most 0.04, and for four treatments not at all. After the expression score was residualised on log clone size, it fell to 0.44–0.59, and the likelihood-ratio test for adding it to clone size was not significant for cisplatin (p = 0.46) or doxorubicin (p = 0.15), although it was for the other four (p &lt; 10⁻⁸; Table S22). The two targeted therapies behaved differently from the rest: dabrafenib and trametinib were the treatments where clone size mattered least (0.70 and 0.68) and where expression added most (0.04 and 0.03), which matches the weak clone-size correlations the original authors reported for exactly those two arms. For the stressors and the two chemotherapies, almost nothing survived the adjustment.</w:t>
+      </w:r>
+    </w:p>
+    <w:p>
+      <w:pPr>
+        <w:spacing w:after="160" w:line="360"/>
+        <w:jc w:val="both"/>
+      </w:pPr>
+      <w:r>
+        <w:t xml:space="preserve">This does not contradict the original study, which showed that pre-treatment size is not the sole determinant of resistance and that some small clones became highly resistant. It does put the two predictors side by side, which had not been done: as a predictor of whether a lineage is detected again, its size before treatment is worth far more than its transcriptional state, and the part of the state that is not explained by growth is small except under MAPK inhibition.</w:t>
+      </w:r>
+    </w:p>
+    <w:p>
+      <w:pPr>
+        <w:spacing w:after="160" w:line="360"/>
+        <w:jc w:val="both"/>
+      </w:pPr>
+      <w:r>
+        <w:t xml:space="preserve">While this work was in preparation, Aviv (2026) released a preregistered reanalysis of the same data that reaches the same conclusion about clone size from a different direction, and then goes further. That analysis notes that "clone abundance dominates", so a comparison that does not hold abundance fixed finds "a signal that is really a headcount", which is what Fig. 7a shows. It then asks a question we do not: not whether a clone is detected at all, but which of the six conditions a clone is detected under. Holding clone abundance and condition identity fixed, a model in which state effects differ by condition ordered the six conditions within a clone better than a model in which the state effect is shared, by 0.052 in equal-clone-weighted within-clone AUROC (95% CI 0.037–0.066, permutation p &lt; 0.001), while a shared state effect added nothing to condition identity alone. The two results fit together and neither is implied by the other. Averaged over conditions, state is worth little next to size; conditional on size and condition, a small condition-specific part remains. It is worth noting how close that 0.052 is to the 0.014–0.025 we measure against a real untreated arm in ReSisTrace: in both systems the part of the pre-treatment state that is specific to the treatment is small and hard to see next to the axis that is not.</w:t>
+      </w:r>
+    </w:p>
+    <w:p>
+      <w:pPr>
+        <w:spacing w:after="160" w:line="360"/>
+        <w:jc w:val="both"/>
+      </w:pPr>
+      <w:r>
+        <w:t xml:space="preserve">Cross-treatment transfer was structured rather than general (Fig. 7b). Scores trained on one treatment's labels ranked another treatment's labels at 0.48–0.63, with two blocks: the two MAPK inhibitors transferred to each other (0.565 and 0.568) better than to anything else, and the four stress and chemotherapy arms transferred among themselves (0.548–0.627). This is the pattern the original authors saw in the resistant cells' transcriptomes, and here it appears in what can be predicted beforehand.</w:t>
+      </w:r>
+    </w:p>
+    <w:p>
+      <w:pPr>
+        <w:spacing w:after="160" w:line="360"/>
+        <w:jc w:val="both"/>
+      </w:pPr>
+      <w:r>
+        <w:t xml:space="preserve">The ceiling analysis did not carry over, for a reason worth stating. Cells that share a lineage in the untreated sample are separated by about six doublings rather than one division, and they share far less state: the mean intraclass correlation over the first ten principal components was 0.18, against 0.75 for ReSisTrace sisters, and the concordance of the model score between clone-mates was 0.17–0.21, against 0.63–0.81. Dividing the observed signal by so small a concordance is an extrapolation the liability model cannot support, and it failed openly: in three of the six treatments the implied correlation exceeded one and the estimate was clamped (Table S23). We therefore report no ceiling for this data set. The sister design, where the two cells are one division apart, is what makes that bound estimable at all.</w:t>
+      </w:r>
+    </w:p>
+    <w:p>
+      <w:pPr>
+        <w:pStyle w:val="Heading2"/>
+      </w:pPr>
+      <w:r>
         <w:t xml:space="preserve">Little transfer to other systems, and no enrichment after chemotherapy in patients (Fig. 6)</w:t>
       </w:r>
     </w:p>
@@ -768,10 +865,10 @@
           <w:b/>
           <w:bCs/>
         </w:rPr>
-        <w:t xml:space="preserve">Patient data.</w:t>
-      </w:r>
-      <w:r>
-        <w:t xml:space="preserve"> Count data and cell annotations for 11 patients with high-grade serous ovarian cancer sampled before and after neoadjuvant carboplatin–paclitaxel were obtained from GEO (GSE165897; Zhang et al., 2022), and the platinum-free interval and chemotherapy response score from Table 1 of that paper. Only cells the authors annotated as malignant epithelial cells were used (8,806 of 51,786). Counts were normalised to 10,000 per cell and log-transformed, and genes detected in fewer than 1% of malignant cells were dropped. Each gene was z-scored within patient across that patient's treatment-naive and post-treatment cells, so that patient identity, which dominates this data set, cannot drive the comparison. A signature score was the mean z of its up-genes minus the mean z of its down-genes, and each patient contributed one number: the mean score of their post-treatment cells minus the mean score of their treatment-naive cells. Significance was assessed in two ways: a Wilcoxon signed-rank test over the 11 patients, and a comparison with 200 random gene sets drawn to match the up- and down-sets in size and in mean expression (20 expression bins), which controls for the global transcriptional change that chemotherapy itself produces. As a sensitivity check we repeated the comparison in the five patients whose two samples came from the same anatomical site.</w:t>
+        <w:t xml:space="preserve">Second lineage system.</w:t>
+      </w:r>
+      <w:r>
+        <w:t xml:space="preserve"> Matrices for the nine samples of Schaff et al. (2026) were taken from GEO (GSE279162). Lineage barcodes are stored there as features of type "Custom" alongside the genes, so no separate barcode file is needed. Barcodes with at least five UMIs across all samples were kept, and those whose per-cell count vectors were near-parallel (cosine at least 0.55), which arise when sequencing errors split one barcode in two, were merged by connected components; this left 2,118 barcode groups, the largest containing nine barcodes. A cell was assigned the barcode holding at least two UMIs and more than half of its barcode UMIs, and was left unassigned otherwise, so a cell split evenly between two barcodes is dropped rather than guessed. This is simpler than the authors' Bayesian assignment and our clone counts are not identical to theirs; the results below were repeated at merge thresholds of 0.70 and 0.85 and at a stricter assignment rule (three UMIs, 60%) and did not change materially (Table S22). A lineage counted as surviving a treatment if any cell in that treatment's sample carried it. Clone size is the number of untreated cells with that lineage. Features, cross-validation and the label-free density score were computed exactly as for the other external data sets, with lineages as groups.</w:t>
       </w:r>
     </w:p>
     <w:p>
@@ -784,19 +881,10 @@
           <w:b/>
           <w:bCs/>
         </w:rPr>
-        <w:t xml:space="preserve">External data.</w:t>
-      </w:r>
-      <w:r>
-        <w:t xml:space="preserve"> For Watermelon (GEO GSE150949), barcoded day-0 cells were labelled by the presence of their lineage barcode in any day-14 sample. For the triple-negative breast cancer study (GEO GSE228382), per-cell lineage annotations are not in GEO. We therefore exported the authors' Seurat object (figshare, doi:10.6084/m9.figshare.24787458) to plain files with a short R script. Untreated day-0 cells with a lineage barcode were labelled with the authors' </w:t>
-      </w:r>
-      <w:r>
-        <w:rPr>
-          <w:rFonts w:ascii="Consolas" w:cs="Consolas" w:eastAsia="Consolas" w:hAnsi="Consolas"/>
-        </w:rPr>
-        <w:t xml:space="preserve">DTPE_lineages</w:t>
-      </w:r>
-      <w:r>
-        <w:t xml:space="preserve"> annotation. For each data set we evaluated lineage-grouped cross-validation of clone-size, covariate and expression models, and zero-shot transfer of ReSisTrace logistic models using shared highly variable genes, z-scored within each data set. For TCGA-OV, RSEM expression and curated survival endpoints (Liu et al., 2018) were obtained from UCSC Xena. Five signatures were tested: the fitness signature, the three drug-specific signatures and the whole-contrast carboplatin signature. Primary tumours were scored by the mean z-score of up-genes minus down-genes, and Cox models (lifelines; Davidson-Pilon, 2019) were fitted per standard deviation of score.</w:t>
+        <w:t xml:space="preserve">Patient data.</w:t>
+      </w:r>
+      <w:r>
+        <w:t xml:space="preserve"> Count data and cell annotations for 11 patients with high-grade serous ovarian cancer sampled before and after neoadjuvant carboplatin–paclitaxel were obtained from GEO (GSE165897; Zhang et al., 2022), and the platinum-free interval and chemotherapy response score from Table 1 of that paper. Only cells the authors annotated as malignant epithelial cells were used (8,806 of 51,786). Counts were normalised to 10,000 per cell and log-transformed, and genes detected in fewer than 1% of malignant cells were dropped. Each gene was z-scored within patient across that patient's treatment-naive and post-treatment cells, so that patient identity, which dominates this data set, cannot drive the comparison. A signature score was the mean z of its up-genes minus the mean z of its down-genes, and each patient contributed one number: the mean score of their post-treatment cells minus the mean score of their treatment-naive cells. Significance was assessed in two ways: a Wilcoxon signed-rank test over the 11 patients, and a comparison with 200 random gene sets drawn to match the up- and down-sets in size and in mean expression (20 expression bins), which controls for the global transcriptional change that chemotherapy itself produces. As a sensitivity check we repeated the comparison in the five patients whose two samples came from the same anatomical site.</w:t>
       </w:r>
     </w:p>
     <w:p>
@@ -809,6 +897,31 @@
           <w:b/>
           <w:bCs/>
         </w:rPr>
+        <w:t xml:space="preserve">External data.</w:t>
+      </w:r>
+      <w:r>
+        <w:t xml:space="preserve"> For Watermelon (GEO GSE150949), barcoded day-0 cells were labelled by the presence of their lineage barcode in any day-14 sample. For the triple-negative breast cancer study (GEO GSE228382), per-cell lineage annotations are not in GEO. We therefore exported the authors' Seurat object (figshare, doi:10.6084/m9.figshare.24787458) to plain files with a short R script. Untreated day-0 cells with a lineage barcode were labelled with the authors' </w:t>
+      </w:r>
+      <w:r>
+        <w:rPr>
+          <w:rFonts w:ascii="Consolas" w:cs="Consolas" w:eastAsia="Consolas" w:hAnsi="Consolas"/>
+        </w:rPr>
+        <w:t xml:space="preserve">DTPE_lineages</w:t>
+      </w:r>
+      <w:r>
+        <w:t xml:space="preserve"> annotation. For each data set we evaluated lineage-grouped cross-validation of clone-size, covariate and expression models, and zero-shot transfer of ReSisTrace logistic models using shared highly variable genes, z-scored within each data set. For TCGA-OV, RSEM expression and curated survival endpoints (Liu et al., 2018) were obtained from UCSC Xena. Five signatures were tested: the fitness signature, the three drug-specific signatures and the whole-contrast carboplatin signature. Primary tumours were scored by the mean z-score of up-genes minus down-genes, and Cox models (lifelines; Davidson-Pilon, 2019) were fitted per standard deviation of score.</w:t>
+      </w:r>
+    </w:p>
+    <w:p>
+      <w:pPr>
+        <w:spacing w:after="160" w:line="360"/>
+        <w:jc w:val="both"/>
+      </w:pPr>
+      <w:r>
+        <w:rPr>
+          <w:b/>
+          <w:bCs/>
+        </w:rPr>
         <w:t xml:space="preserve">Code and data availability.</w:t>
       </w:r>
       <w:r>
@@ -857,7 +970,7 @@
         <w:t xml:space="preserve">scripts/run_all.sh</w:t>
       </w:r>
       <w:r>
-        <w:t xml:space="preserve">) that regenerates every result, figure and supplementary table from the public data on a laptop CPU; only the Geneformer forward pass used a GPU (a Kaggle T4; the notebook is included). Every metric is appended to a results table together with a hash of the configuration that produced it. All result tables underlying the figures and text, including full differential expression and gene-set enrichment results, are provided as Supplementary Tables S1–S21 (Supplementary_Tables.xlsx).</w:t>
+        <w:t xml:space="preserve">) that regenerates every result, figure and supplementary table from the public data on a laptop CPU; only the Geneformer forward pass used a GPU (a Kaggle T4; the notebook is included). Every metric is appended to a results table together with a hash of the configuration that produced it. All result tables underlying the figures and text, including full differential expression and gene-set enrichment results, are provided as Supplementary Tables S1–S26 (Supplementary_Tables.xlsx).</w:t>
       </w:r>
     </w:p>
     <w:p>
@@ -1326,7 +1439,7 @@
       <w:r>
         <w:drawing>
           <wp:inline distT="0" distB="0" distL="0" distR="0">
-            <wp:extent cx="5905500" cy="3629025"/>
+            <wp:extent cx="5905500" cy="3448050"/>
             <wp:effectExtent t="0" r="0" b="0" l="0"/>
             <wp:docPr id="1" name="" descr="" title=""/>
             <wp:cNvGraphicFramePr>
@@ -1351,7 +1464,7 @@
                   <pic:spPr bwMode="auto">
                     <a:xfrm>
                       <a:off x="0" y="0"/>
-                      <a:ext cx="5905500" cy="3629025"/>
+                      <a:ext cx="5905500" cy="3448050"/>
                     </a:xfrm>
                     <a:prstGeom prst="rect">
                       <a:avLst/>
@@ -1374,10 +1487,10 @@
           <w:b/>
           <w:bCs/>
         </w:rPr>
-        <w:t xml:space="preserve">Figure S1. Label-free typicality.</w:t>
-      </w:r>
-      <w:r>
-        <w:t xml:space="preserve"> AUROC of the local-density score (negative mean distance to the 15 nearest neighbours within the sample), compared with the supervised PCA-logistic model and the control-arm (fitness) model, for each arm.</w:t>
+        <w:t xml:space="preserve">Figure 8. Substitutes for an untreated arm.</w:t>
+      </w:r>
+      <w:r>
+        <w:t xml:space="preserve"> For each drug arm of ReSisTrace, the drug-specific gain measured against the real control-arm model (black) and against two substitutes that use no control-arm labels: a model trained on the other drug arms (blue) and the label-free density score (green). Error bars are 95% family-bootstrap intervals. The control-arm value lies between the two substitutes in every arm.</w:t>
       </w:r>
     </w:p>
     <w:p>
@@ -1388,7 +1501,7 @@
       <w:r>
         <w:drawing>
           <wp:inline distT="0" distB="0" distL="0" distR="0">
-            <wp:extent cx="5905500" cy="7677150"/>
+            <wp:extent cx="5905500" cy="2200275"/>
             <wp:effectExtent t="0" r="0" b="0" l="0"/>
             <wp:docPr id="1" name="" descr="" title=""/>
             <wp:cNvGraphicFramePr>
@@ -1413,7 +1526,7 @@
                   <pic:spPr bwMode="auto">
                     <a:xfrm>
                       <a:off x="0" y="0"/>
-                      <a:ext cx="5905500" cy="7677150"/>
+                      <a:ext cx="5905500" cy="2200275"/>
                     </a:xfrm>
                     <a:prstGeom prst="rect">
                       <a:avLst/>
@@ -1436,10 +1549,10 @@
           <w:b/>
           <w:bCs/>
         </w:rPr>
-        <w:t xml:space="preserve">Figure S2. Pre-specified marker panel.</w:t>
-      </w:r>
-      <w:r>
-        <w:t xml:space="preserve"> z-scores for pre-resistant versus pre-sensitive cells. The control column shows the control (fitness) contrast; the drug columns show the difference from the control contrast, z_diff = (z_drug − z_control)/√2. Asterisks mark FDR &lt; 0.05 for z_diff. Genes not among the 5,005 retained genes (CDKN2A, RB1, GLB1, KDM5A) are omitted.</w:t>
+        <w:t xml:space="preserve">Figure 7. A second lineage system with six treatments (Schaff et al., 2026).</w:t>
+      </w:r>
+      <w:r>
+        <w:t xml:space="preserve"> (a) AUROC for predicting whether an untreated cell's lineage is detected again after each treatment, using clone size before treatment, expression (50 principal components), both, and the label-free density score; lineage-grouped cross-validation, error bars are 95% lineage-bootstrap intervals. (b) AUROC when the out-of-fold score trained on one treatment's labels is used to rank another treatment's labels. (c) Expression AUROC before and after residualising on log clone size, with the likelihood-ratio test for adding expression to clone size.</w:t>
       </w:r>
     </w:p>
     <w:p>
@@ -1450,7 +1563,7 @@
       <w:r>
         <w:drawing>
           <wp:inline distT="0" distB="0" distL="0" distR="0">
-            <wp:extent cx="5905500" cy="4124325"/>
+            <wp:extent cx="5905500" cy="3629025"/>
             <wp:effectExtent t="0" r="0" b="0" l="0"/>
             <wp:docPr id="1" name="" descr="" title=""/>
             <wp:cNvGraphicFramePr>
@@ -1475,6 +1588,130 @@
                   <pic:spPr bwMode="auto">
                     <a:xfrm>
                       <a:off x="0" y="0"/>
+                      <a:ext cx="5905500" cy="3629025"/>
+                    </a:xfrm>
+                    <a:prstGeom prst="rect">
+                      <a:avLst/>
+                    </a:prstGeom>
+                  </pic:spPr>
+                </pic:pic>
+              </a:graphicData>
+            </a:graphic>
+          </wp:inline>
+        </w:drawing>
+      </w:r>
+    </w:p>
+    <w:p>
+      <w:pPr>
+        <w:spacing w:after="160" w:line="360"/>
+        <w:jc w:val="both"/>
+      </w:pPr>
+      <w:r>
+        <w:rPr>
+          <w:b/>
+          <w:bCs/>
+        </w:rPr>
+        <w:t xml:space="preserve">Figure S1. Label-free typicality.</w:t>
+      </w:r>
+      <w:r>
+        <w:t xml:space="preserve"> AUROC of the local-density score (negative mean distance to the 15 nearest neighbours within the sample), compared with the supervised PCA-logistic model and the control-arm (fitness) model, for each arm.</w:t>
+      </w:r>
+    </w:p>
+    <w:p>
+      <w:pPr>
+        <w:keepNext/>
+        <w:spacing w:before="240"/>
+      </w:pPr>
+      <w:r>
+        <w:drawing>
+          <wp:inline distT="0" distB="0" distL="0" distR="0">
+            <wp:extent cx="5905500" cy="7677150"/>
+            <wp:effectExtent t="0" r="0" b="0" l="0"/>
+            <wp:docPr id="1" name="" descr="" title=""/>
+            <wp:cNvGraphicFramePr>
+              <a:graphicFrameLocks xmlns:a="http://schemas.openxmlformats.org/drawingml/2006/main" noChangeAspect="1"/>
+            </wp:cNvGraphicFramePr>
+            <a:graphic xmlns:a="http://schemas.openxmlformats.org/drawingml/2006/main">
+              <a:graphicData uri="http://schemas.openxmlformats.org/drawingml/2006/picture">
+                <pic:pic xmlns:pic="http://schemas.openxmlformats.org/drawingml/2006/picture">
+                  <pic:nvPicPr>
+                    <pic:cNvPr id="0" name="" descr=""/>
+                    <pic:cNvPicPr>
+                      <a:picLocks noChangeAspect="1" noChangeArrowheads="1"/>
+                    </pic:cNvPicPr>
+                  </pic:nvPicPr>
+                  <pic:blipFill>
+                    <a:blip r:embed="rId17" cstate="none"/>
+                    <a:srcRect/>
+                    <a:stretch>
+                      <a:fillRect/>
+                    </a:stretch>
+                  </pic:blipFill>
+                  <pic:spPr bwMode="auto">
+                    <a:xfrm>
+                      <a:off x="0" y="0"/>
+                      <a:ext cx="5905500" cy="7677150"/>
+                    </a:xfrm>
+                    <a:prstGeom prst="rect">
+                      <a:avLst/>
+                    </a:prstGeom>
+                  </pic:spPr>
+                </pic:pic>
+              </a:graphicData>
+            </a:graphic>
+          </wp:inline>
+        </w:drawing>
+      </w:r>
+    </w:p>
+    <w:p>
+      <w:pPr>
+        <w:spacing w:after="160" w:line="360"/>
+        <w:jc w:val="both"/>
+      </w:pPr>
+      <w:r>
+        <w:rPr>
+          <w:b/>
+          <w:bCs/>
+        </w:rPr>
+        <w:t xml:space="preserve">Figure S2. Pre-specified marker panel.</w:t>
+      </w:r>
+      <w:r>
+        <w:t xml:space="preserve"> z-scores for pre-resistant versus pre-sensitive cells. The control column shows the control (fitness) contrast; the drug columns show the difference from the control contrast, z_diff = (z_drug − z_control)/√2. Asterisks mark FDR &lt; 0.05 for z_diff. Genes not among the 5,005 retained genes (CDKN2A, RB1, GLB1, KDM5A) are omitted.</w:t>
+      </w:r>
+    </w:p>
+    <w:p>
+      <w:pPr>
+        <w:keepNext/>
+        <w:spacing w:before="240"/>
+      </w:pPr>
+      <w:r>
+        <w:drawing>
+          <wp:inline distT="0" distB="0" distL="0" distR="0">
+            <wp:extent cx="5905500" cy="4124325"/>
+            <wp:effectExtent t="0" r="0" b="0" l="0"/>
+            <wp:docPr id="1" name="" descr="" title=""/>
+            <wp:cNvGraphicFramePr>
+              <a:graphicFrameLocks xmlns:a="http://schemas.openxmlformats.org/drawingml/2006/main" noChangeAspect="1"/>
+            </wp:cNvGraphicFramePr>
+            <a:graphic xmlns:a="http://schemas.openxmlformats.org/drawingml/2006/main">
+              <a:graphicData uri="http://schemas.openxmlformats.org/drawingml/2006/picture">
+                <pic:pic xmlns:pic="http://schemas.openxmlformats.org/drawingml/2006/picture">
+                  <pic:nvPicPr>
+                    <pic:cNvPr id="0" name="" descr=""/>
+                    <pic:cNvPicPr>
+                      <a:picLocks noChangeAspect="1" noChangeArrowheads="1"/>
+                    </pic:cNvPicPr>
+                  </pic:nvPicPr>
+                  <pic:blipFill>
+                    <a:blip r:embed="rId18" cstate="none"/>
+                    <a:srcRect/>
+                    <a:stretch>
+                      <a:fillRect/>
+                    </a:stretch>
+                  </pic:blipFill>
+                  <pic:spPr bwMode="auto">
+                    <a:xfrm>
+                      <a:off x="0" y="0"/>
                       <a:ext cx="5905500" cy="4124325"/>
                     </a:xfrm>
                     <a:prstGeom prst="rect">
@@ -1528,6 +1765,35 @@
           <w:szCs w:val="20"/>
         </w:rPr>
         <w:t xml:space="preserve">All references were checked against Europe PMC, NCBI PMC, arXiv, JMLR or Crossref on 25–26 September 2026. For the 29 studies marked ✓, the full text was retrieved and the statements cited above were checked against it; the others were checked against their abstracts.</w:t>
+      </w:r>
+    </w:p>
+    <w:p>
+      <w:pPr>
+        <w:spacing w:after="160" w:line="276"/>
+        <w:jc w:val="left"/>
+      </w:pPr>
+      <w:r>
+        <w:rPr>
+          <w:sz w:val="20"/>
+          <w:szCs w:val="20"/>
+        </w:rPr>
+        <w:t xml:space="preserve">Aviv H. Pretreatment transcriptional state carries condition-specific information about future clonal detection in a lineage-traced melanoma line. </w:t>
+      </w:r>
+      <w:r>
+        <w:rPr>
+          <w:i/>
+          <w:iCs/>
+          <w:sz w:val="20"/>
+          <w:szCs w:val="20"/>
+        </w:rPr>
+        <w:t xml:space="preserve">Zenodo</w:t>
+      </w:r>
+      <w:r>
+        <w:rPr>
+          <w:sz w:val="20"/>
+          <w:szCs w:val="20"/>
+        </w:rPr>
+        <w:t xml:space="preserve"> (2026). doi:10.5281/zenodo.22850050 ✓</w:t>
       </w:r>
     </w:p>
     <w:p>

</xml_diff>

<commit_message>
Reorder results so figures are cited in sequence, and extend the discussion
Sections now run: predictability, fitness, typicality, biology, ceiling, graph model, external and
patient checks, second lineage system, substitutes for a control arm. The discussion covers what the
second system adds, what a substitute for a control arm can and cannot do, and what the synthetic
experiments revealed about our own estimators.
</commit_message>
<xml_diff>
--- a/paper/manuscript.docx
+++ b/paper/manuscript.docx
@@ -392,6 +392,112 @@
         <w:pStyle w:val="Heading2"/>
       </w:pPr>
       <w:r>
+        <w:t xml:space="preserve">Little transfer to other systems, and no enrichment after chemotherapy in patients (Fig. 6)</w:t>
+      </w:r>
+    </w:p>
+    <w:p>
+      <w:pPr>
+        <w:spacing w:after="160" w:line="360"/>
+        <w:jc w:val="both"/>
+      </w:pPr>
+      <w:r>
+        <w:t xml:space="preserve">In the Watermelon data (PC9 lung cancer cells, osimertinib; Oren et al., 2021), 5,087 barcoded day-0 cells from 2,993 lineages were labelled by whether their lineage was observed at day 14. Clone size alone predicted this label with AUROC 0.76. Expression alone reached 0.61, added 0.01 to clone size, and reached 0.58 among singleton lineages, where clone size carries no information. Models trained on ReSisTrace and applied without refitting scored 0.49–0.52. The label-free density score, which reaches 0.63–0.70 in ReSisTrace, gave only 0.533 here (95% CI 0.517–0.552; Fig. 6a).</w:t>
+      </w:r>
+    </w:p>
+    <w:p>
+      <w:pPr>
+        <w:spacing w:after="160" w:line="360"/>
+        <w:jc w:val="both"/>
+      </w:pPr>
+      <w:r>
+        <w:t xml:space="preserve">In the triple-negative breast cancer data (MDA-MB-468, afatinib; Pellecchia et al., 2024), 1,541 untreated barcoded cells from 448 lineages were labelled with the authors' annotation of lineages found among drug-tolerant expanded persisters after 40 days (55.9% positive). Clone size alone gave AUROC 0.88 and expression alone 0.64; together they gave 0.88. ReSisTrace models transferred slightly above chance (0.54–0.57). Among the 237 singleton lineages, the ReSisTrace control model transferred best (0.64, 95% CI 0.53–0.76), which fits the idea that what transfers is fitness rather than drug tolerance. The subset is small, however, and we do not rely on it. The label-free density score gave 0.570 (95% CI 0.530–0.605; Fig. 6b).</w:t>
+      </w:r>
+    </w:p>
+    <w:p>
+      <w:pPr>
+        <w:spacing w:after="160" w:line="360"/>
+        <w:jc w:val="both"/>
+      </w:pPr>
+      <w:r>
+        <w:t xml:space="preserve">In 303 TCGA ovarian primary tumours, we tested five signatures against overall survival and progression-free interval (10 tests). Only the olaparib-specific signature showed a nominal association with overall survival (hazard ratio 1.20 per s.d., 95% CI 1.03–1.39, p = 0.017), and it did not survive correction for multiple testing (FDR 0.17). No signature was associated with progression-free interval (all p &gt; 0.2; Fig. 6c).</w:t>
+      </w:r>
+    </w:p>
+    <w:p>
+      <w:pPr>
+        <w:spacing w:after="160" w:line="360"/>
+        <w:jc w:val="both"/>
+      </w:pPr>
+      <w:r>
+        <w:t xml:space="preserve">Survival statistics in bulk tumours are an indirect test. A more direct one asks whether the cells that persist through chemotherapy in patients carry the pre-resistant states. Zhang et al. (2022) sequenced malignant cells from 11 patients with high-grade serous ovarian cancer before and after three cycles of neoadjuvant carboplatin–paclitaxel (8,806 malignant cells). If the ReSisTrace carboplatin states were selected by treatment, post-treatment cells should score higher than treatment-naive cells from the same patient. They did not. We compared scores within each patient and against random gene sets matched in size and expression (Methods). The carboplatin whole-contrast and carboplatin-specific signatures rose in only 5 of 11 patients (median change −0.03 and −0.10 within-patient s.d.; Wilcoxon p = 0.24 and 0.83), within the range of random gene sets. The fitness signature moved the other way. It was lower after treatment in 7 of 11 patients (median −0.18; Wilcoxon p = 0.042), below all 200 matched random sets (two-sided p = 0.005), and lower in all five patients whose two samples came from the same anatomical site (Fig. 6d, Table S21). No signature change was associated with the platinum-free interval (Spearman |ρ| ≤ 0.34, all p &gt; 0.3; n = 11). The state that predicts recovery in culture, which is proliferative and low in stress and apoptosis programmes, is therefore depleted rather than enriched in tumours that have been through chemotherapy. This fits the view that it marks the ability to regrow after the experimental procedure rather than tolerance of the drug. Post-treatment tissue also differs in ways a sister design does not capture (drug-induced changes, stroma, sampling site), so this is a consistency check rather than a validation.</w:t>
+      </w:r>
+    </w:p>
+    <w:p>
+      <w:pPr>
+        <w:pStyle w:val="Heading2"/>
+      </w:pPr>
+      <w:r>
+        <w:t xml:space="preserve">A second lineage system, six treatments: clone size explains most of the signal again (Fig. 7)</w:t>
+      </w:r>
+    </w:p>
+    <w:p>
+      <w:pPr>
+        <w:spacing w:after="160" w:line="360"/>
+        <w:jc w:val="both"/>
+      </w:pPr>
+      <w:r>
+        <w:t xml:space="preserve">ReSisTrace is the only design we know of that carries an untreated arm through the whole protocol, so the fitness model cannot be rebuilt elsewhere. A weaker version of the same question can be asked wherever pre-treatment clone size is measured, because the size a lineage reaches in culture before any drug is itself a measure of how well it grows. Schaff et al. (2026) barcoded WM989 melanoma cells, profiled an untreated sample, split the rest across six treatments (dabrafenib, trametinib, CoCl2, acidic medium, cisplatin and doxorubicin) and sequenced the surviving cells with paired barcodes. Every untreated cell therefore carries six labels at once. We assigned lineages from the barcode features stored in the same matrices as the genes (Methods) and obtained 7,165 untreated cells from 1,695 lineages, of which 30.6% (trametinib) to 78.3% (acidic medium) lay in a lineage that was detected again after treatment. As in the other clone-level data sets, what is observed is detection, not death: a lineage can go undetected because its cells died or simply because it was not sampled.</w:t>
+      </w:r>
+    </w:p>
+    <w:p>
+      <w:pPr>
+        <w:spacing w:after="160" w:line="360"/>
+        <w:jc w:val="both"/>
+      </w:pPr>
+      <w:r>
+        <w:t xml:space="preserve">Clone size predicted detection better than expression for every one of the six treatments: AUROC 0.68–0.90 for clone size against 0.54–0.66 for a logistic model on 50 principal components, with lineage-grouped cross-validation throughout (Fig. 7a). Adding expression to clone size changed AUROC by at most 0.04, and for four treatments not at all. After the expression score was residualised on log clone size, it fell to 0.44–0.59, and the likelihood-ratio test for adding it to clone size was not significant for cisplatin (p = 0.46) or doxorubicin (p = 0.15), although it was for the other four (p &lt; 10⁻⁸; Table S22). The two targeted therapies behaved differently from the rest: dabrafenib and trametinib were the treatments where clone size mattered least (0.70 and 0.68) and where expression added most (0.04 and 0.03), which matches the weak clone-size correlations the original authors reported for exactly those two arms. For the stressors and the two chemotherapies, almost nothing survived the adjustment.</w:t>
+      </w:r>
+    </w:p>
+    <w:p>
+      <w:pPr>
+        <w:spacing w:after="160" w:line="360"/>
+        <w:jc w:val="both"/>
+      </w:pPr>
+      <w:r>
+        <w:t xml:space="preserve">This does not contradict the original study, which showed that pre-treatment size is not the sole determinant of resistance and that some small clones became highly resistant. It does put the two predictors side by side, which had not been done: as a predictor of whether a lineage is detected again, its size before treatment is worth far more than its transcriptional state, and the part of the state that is not explained by growth is small except under MAPK inhibition.</w:t>
+      </w:r>
+    </w:p>
+    <w:p>
+      <w:pPr>
+        <w:spacing w:after="160" w:line="360"/>
+        <w:jc w:val="both"/>
+      </w:pPr>
+      <w:r>
+        <w:t xml:space="preserve">While this work was in preparation, Aviv (2026) released a preregistered reanalysis of the same data that reaches the same conclusion about clone size from a different direction, and then goes further. That analysis notes that "clone abundance dominates", so a comparison that does not hold abundance fixed finds "a signal that is really a headcount", which is what Fig. 7a shows. It then asks a question we do not: not whether a clone is detected at all, but which of the six conditions a clone is detected under. Holding clone abundance and condition identity fixed, a model in which state effects differ by condition ordered the six conditions within a clone better than a model in which the state effect is shared, by 0.052 in equal-clone-weighted within-clone AUROC (95% CI 0.037–0.066, permutation p &lt; 0.001), while a shared state effect added nothing to condition identity alone. The two results fit together and neither is implied by the other. Averaged over conditions, state is worth little next to size; conditional on size and condition, a small condition-specific part remains. It is worth noting how close that 0.052 is to the 0.014–0.025 we measure against a real untreated arm in ReSisTrace: in both systems the part of the pre-treatment state that is specific to the treatment is small and hard to see next to the axis that is not.</w:t>
+      </w:r>
+    </w:p>
+    <w:p>
+      <w:pPr>
+        <w:spacing w:after="160" w:line="360"/>
+        <w:jc w:val="both"/>
+      </w:pPr>
+      <w:r>
+        <w:t xml:space="preserve">Cross-treatment transfer was structured rather than general (Fig. 7b). Scores trained on one treatment's labels ranked another treatment's labels at 0.48–0.63, with two blocks: the two MAPK inhibitors transferred to each other (0.565 and 0.568) better than to anything else, and the four stress and chemotherapy arms transferred among themselves (0.548–0.627). This is the pattern the original authors saw in the resistant cells' transcriptomes, and here it appears in what can be predicted beforehand.</w:t>
+      </w:r>
+    </w:p>
+    <w:p>
+      <w:pPr>
+        <w:spacing w:after="160" w:line="360"/>
+        <w:jc w:val="both"/>
+      </w:pPr>
+      <w:r>
+        <w:t xml:space="preserve">The ceiling analysis did not carry over, for a reason worth stating. Cells that share a lineage in the untreated sample are separated by about six doublings rather than one division, and they share far less state: the mean intraclass correlation over the first ten principal components was 0.18, against 0.75 for ReSisTrace sisters, and the concordance of the model score between clone-mates was 0.17–0.21, against 0.63–0.81. Dividing the observed signal by so small a concordance is an extrapolation the liability model cannot support, and it failed openly: in three of the six treatments the implied correlation exceeded one and the estimate was clamped (Table S23). We therefore report no ceiling for this data set. The sister design, where the two cells are one division apart, is what makes that bound estimable at all.</w:t>
+      </w:r>
+    </w:p>
+    <w:p>
+      <w:pPr>
+        <w:pStyle w:val="Heading2"/>
+      </w:pPr>
+      <w:r>
         <w:t xml:space="preserve">Without an untreated arm, the drug-specific gain can be bracketed but not measured (Fig. 8)</w:t>
       </w:r>
     </w:p>
@@ -424,112 +530,6 @@
     </w:p>
     <w:p>
       <w:pPr>
-        <w:pStyle w:val="Heading2"/>
-      </w:pPr>
-      <w:r>
-        <w:t xml:space="preserve">A second lineage system, six treatments: clone size explains most of the signal again (Fig. 7)</w:t>
-      </w:r>
-    </w:p>
-    <w:p>
-      <w:pPr>
-        <w:spacing w:after="160" w:line="360"/>
-        <w:jc w:val="both"/>
-      </w:pPr>
-      <w:r>
-        <w:t xml:space="preserve">ReSisTrace is the only design we know of that carries an untreated arm through the whole protocol, so the fitness model cannot be rebuilt elsewhere. A weaker version of the same question can be asked wherever pre-treatment clone size is measured, because the size a lineage reaches in culture before any drug is itself a measure of how well it grows. Schaff et al. (2026) barcoded WM989 melanoma cells, profiled an untreated sample, split the rest across six treatments (dabrafenib, trametinib, CoCl2, acidic medium, cisplatin and doxorubicin) and sequenced the surviving cells with paired barcodes. Every untreated cell therefore carries six labels at once. We assigned lineages from the barcode features stored in the same matrices as the genes (Methods) and obtained 7,165 untreated cells from 1,695 lineages, of which 30.6% (trametinib) to 78.3% (acidic medium) lay in a lineage that was detected again after treatment. As in the other clone-level data sets, what is observed is detection, not death: a lineage can go undetected because its cells died or simply because it was not sampled.</w:t>
-      </w:r>
-    </w:p>
-    <w:p>
-      <w:pPr>
-        <w:spacing w:after="160" w:line="360"/>
-        <w:jc w:val="both"/>
-      </w:pPr>
-      <w:r>
-        <w:t xml:space="preserve">Clone size predicted detection better than expression for every one of the six treatments: AUROC 0.68–0.90 for clone size against 0.54–0.66 for a logistic model on 50 principal components, with lineage-grouped cross-validation throughout (Fig. 7a). Adding expression to clone size changed AUROC by at most 0.04, and for four treatments not at all. After the expression score was residualised on log clone size, it fell to 0.44–0.59, and the likelihood-ratio test for adding it to clone size was not significant for cisplatin (p = 0.46) or doxorubicin (p = 0.15), although it was for the other four (p &lt; 10⁻⁸; Table S22). The two targeted therapies behaved differently from the rest: dabrafenib and trametinib were the treatments where clone size mattered least (0.70 and 0.68) and where expression added most (0.04 and 0.03), which matches the weak clone-size correlations the original authors reported for exactly those two arms. For the stressors and the two chemotherapies, almost nothing survived the adjustment.</w:t>
-      </w:r>
-    </w:p>
-    <w:p>
-      <w:pPr>
-        <w:spacing w:after="160" w:line="360"/>
-        <w:jc w:val="both"/>
-      </w:pPr>
-      <w:r>
-        <w:t xml:space="preserve">This does not contradict the original study, which showed that pre-treatment size is not the sole determinant of resistance and that some small clones became highly resistant. It does put the two predictors side by side, which had not been done: as a predictor of whether a lineage is detected again, its size before treatment is worth far more than its transcriptional state, and the part of the state that is not explained by growth is small except under MAPK inhibition.</w:t>
-      </w:r>
-    </w:p>
-    <w:p>
-      <w:pPr>
-        <w:spacing w:after="160" w:line="360"/>
-        <w:jc w:val="both"/>
-      </w:pPr>
-      <w:r>
-        <w:t xml:space="preserve">While this work was in preparation, Aviv (2026) released a preregistered reanalysis of the same data that reaches the same conclusion about clone size from a different direction, and then goes further. That analysis notes that "clone abundance dominates", so a comparison that does not hold abundance fixed finds "a signal that is really a headcount", which is what Fig. 7a shows. It then asks a question we do not: not whether a clone is detected at all, but which of the six conditions a clone is detected under. Holding clone abundance and condition identity fixed, a model in which state effects differ by condition ordered the six conditions within a clone better than a model in which the state effect is shared, by 0.052 in equal-clone-weighted within-clone AUROC (95% CI 0.037–0.066, permutation p &lt; 0.001), while a shared state effect added nothing to condition identity alone. The two results fit together and neither is implied by the other. Averaged over conditions, state is worth little next to size; conditional on size and condition, a small condition-specific part remains. It is worth noting how close that 0.052 is to the 0.014–0.025 we measure against a real untreated arm in ReSisTrace: in both systems the part of the pre-treatment state that is specific to the treatment is small and hard to see next to the axis that is not.</w:t>
-      </w:r>
-    </w:p>
-    <w:p>
-      <w:pPr>
-        <w:spacing w:after="160" w:line="360"/>
-        <w:jc w:val="both"/>
-      </w:pPr>
-      <w:r>
-        <w:t xml:space="preserve">Cross-treatment transfer was structured rather than general (Fig. 7b). Scores trained on one treatment's labels ranked another treatment's labels at 0.48–0.63, with two blocks: the two MAPK inhibitors transferred to each other (0.565 and 0.568) better than to anything else, and the four stress and chemotherapy arms transferred among themselves (0.548–0.627). This is the pattern the original authors saw in the resistant cells' transcriptomes, and here it appears in what can be predicted beforehand.</w:t>
-      </w:r>
-    </w:p>
-    <w:p>
-      <w:pPr>
-        <w:spacing w:after="160" w:line="360"/>
-        <w:jc w:val="both"/>
-      </w:pPr>
-      <w:r>
-        <w:t xml:space="preserve">The ceiling analysis did not carry over, for a reason worth stating. Cells that share a lineage in the untreated sample are separated by about six doublings rather than one division, and they share far less state: the mean intraclass correlation over the first ten principal components was 0.18, against 0.75 for ReSisTrace sisters, and the concordance of the model score between clone-mates was 0.17–0.21, against 0.63–0.81. Dividing the observed signal by so small a concordance is an extrapolation the liability model cannot support, and it failed openly: in three of the six treatments the implied correlation exceeded one and the estimate was clamped (Table S23). We therefore report no ceiling for this data set. The sister design, where the two cells are one division apart, is what makes that bound estimable at all.</w:t>
-      </w:r>
-    </w:p>
-    <w:p>
-      <w:pPr>
-        <w:pStyle w:val="Heading2"/>
-      </w:pPr>
-      <w:r>
-        <w:t xml:space="preserve">Little transfer to other systems, and no enrichment after chemotherapy in patients (Fig. 6)</w:t>
-      </w:r>
-    </w:p>
-    <w:p>
-      <w:pPr>
-        <w:spacing w:after="160" w:line="360"/>
-        <w:jc w:val="both"/>
-      </w:pPr>
-      <w:r>
-        <w:t xml:space="preserve">In the Watermelon data (PC9 lung cancer cells, osimertinib; Oren et al., 2021), 5,087 barcoded day-0 cells from 2,993 lineages were labelled by whether their lineage was observed at day 14. Clone size alone predicted this label with AUROC 0.76. Expression alone reached 0.61, added 0.01 to clone size, and reached 0.58 among singleton lineages, where clone size carries no information. Models trained on ReSisTrace and applied without refitting scored 0.49–0.52. The label-free density score, which reaches 0.63–0.70 in ReSisTrace, gave only 0.533 here (95% CI 0.517–0.552; Fig. 6a).</w:t>
-      </w:r>
-    </w:p>
-    <w:p>
-      <w:pPr>
-        <w:spacing w:after="160" w:line="360"/>
-        <w:jc w:val="both"/>
-      </w:pPr>
-      <w:r>
-        <w:t xml:space="preserve">In the triple-negative breast cancer data (MDA-MB-468, afatinib; Pellecchia et al., 2024), 1,541 untreated barcoded cells from 448 lineages were labelled with the authors' annotation of lineages found among drug-tolerant expanded persisters after 40 days (55.9% positive). Clone size alone gave AUROC 0.88 and expression alone 0.64; together they gave 0.88. ReSisTrace models transferred slightly above chance (0.54–0.57). Among the 237 singleton lineages, the ReSisTrace control model transferred best (0.64, 95% CI 0.53–0.76), which fits the idea that what transfers is fitness rather than drug tolerance. The subset is small, however, and we do not rely on it. The label-free density score gave 0.570 (95% CI 0.530–0.605; Fig. 6b).</w:t>
-      </w:r>
-    </w:p>
-    <w:p>
-      <w:pPr>
-        <w:spacing w:after="160" w:line="360"/>
-        <w:jc w:val="both"/>
-      </w:pPr>
-      <w:r>
-        <w:t xml:space="preserve">In 303 TCGA ovarian primary tumours, we tested five signatures against overall survival and progression-free interval (10 tests). Only the olaparib-specific signature showed a nominal association with overall survival (hazard ratio 1.20 per s.d., 95% CI 1.03–1.39, p = 0.017), and it did not survive correction for multiple testing (FDR 0.17). No signature was associated with progression-free interval (all p &gt; 0.2; Fig. 6c).</w:t>
-      </w:r>
-    </w:p>
-    <w:p>
-      <w:pPr>
-        <w:spacing w:after="160" w:line="360"/>
-        <w:jc w:val="both"/>
-      </w:pPr>
-      <w:r>
-        <w:t xml:space="preserve">Survival statistics in bulk tumours are an indirect test. A more direct one asks whether the cells that persist through chemotherapy in patients carry the pre-resistant states. Zhang et al. (2022) sequenced malignant cells from 11 patients with high-grade serous ovarian cancer before and after three cycles of neoadjuvant carboplatin–paclitaxel (8,806 malignant cells). If the ReSisTrace carboplatin states were selected by treatment, post-treatment cells should score higher than treatment-naive cells from the same patient. They did not. We compared scores within each patient and against random gene sets matched in size and expression (Methods). The carboplatin whole-contrast and carboplatin-specific signatures rose in only 5 of 11 patients (median change −0.03 and −0.10 within-patient s.d.; Wilcoxon p = 0.24 and 0.83), within the range of random gene sets. The fitness signature moved the other way. It was lower after treatment in 7 of 11 patients (median −0.18; Wilcoxon p = 0.042), below all 200 matched random sets (two-sided p = 0.005), and lower in all five patients whose two samples came from the same anatomical site (Fig. 6d, Table S21). No signature change was associated with the platinum-free interval (Spearman |ρ| ≤ 0.34, all p &gt; 0.3; n = 11). The state that predicts recovery in culture, which is proliferative and low in stress and apoptosis programmes, is therefore depleted rather than enriched in tumours that have been through chemotherapy. This fits the view that it marks the ability to regrow after the experimental procedure rather than tolerance of the drug. Post-treatment tissue also differs in ways a sister design does not capture (drug-induced changes, stroma, sampling site), so this is a consistency check rather than a validation.</w:t>
-      </w:r>
-    </w:p>
-    <w:p>
-      <w:pPr>
         <w:pStyle w:val="Heading1"/>
       </w:pPr>
       <w:r>
@@ -578,16 +578,43 @@
         <w:jc w:val="both"/>
       </w:pPr>
       <w:r>
-        <w:t xml:space="preserve">The external data sets show how strongly clone-level designs are shaped by sampling. In both, clone size predicted whether a lineage would be seen again much better than expression did. This is expected, since larger clones are more likely to be re-sampled. Expression-based claims from clone-level labels therefore need clone size as a baseline, and singleton lineages are a useful, if small, stress test. The failure of ReSisTrace models to transfer is not surprising, given different cell lines, drugs and label definitions, but it argues against treating any single pre-resistance signature as general. The patient cohort makes the same point from the other direction. Cells that survived carboplatin-based chemotherapy in tumours were no higher on the carboplatin signatures than the same patients' untreated cells, and were lower on the fitness signature. A state that marks recovery in a culture dish need not mark survival in a patient, where the drug is given over months and the cells sit in a tissue. This is a further reason to measure the drug-specific part of a lineage signal, since it is the part that might translate.</w:t>
-      </w:r>
-    </w:p>
-    <w:p>
-      <w:pPr>
-        <w:spacing w:after="160" w:line="360"/>
-        <w:jc w:val="both"/>
-      </w:pPr>
-      <w:r>
-        <w:t xml:space="preserve">Several limitations apply. First, ReSisTrace labels are noisy. Cells whose sister was lost or only partially matched are counted as pre-sensitive, and our ceiling handles this only through an assumed noise level. Second, the Gaussian liability model is a simplification. It assumes a single linear score and treats the fitted model as capturing the relevant direction, so the ceilings are approximate. Third, our copy-number clusters were inferred from expression and only weakly separated. They reproduced the published enrichment pattern, but they are not the original subclone calls. Fourth, all analyses use one ovarian cancer cell line, and the external checks rely on clone-level labels, on bulk tumours, and on a patient cohort of 11 in which the two samples are different pieces of tissue rather than sisters, so a negative result there has several possible causes. Finally, the graph model was tested with one architecture and modest tuning, and the foundation model was used as a frozen feature extractor rather than fine-tuned, which may not be the best use of it. A different design might do better, but the near-identical performance of very different models, from logistic regression to a 104-million-parameter transformer, suggests that the information, not the model class, is the limit.</w:t>
+        <w:t xml:space="preserve">The clone-level data sets show how strongly such designs are shaped by sampling. In all three, including the six treatments of the second system, clone size predicted whether a lineage would be seen again much better than expression did. This is expected, since larger clones are more likely to be re-sampled. Expression-based claims from clone-level labels therefore need clone size as a baseline, and singleton lineages are a useful, if small, stress test. The failure of ReSisTrace models to transfer is not surprising, given different cell lines, drugs and label definitions, but it argues against treating any single pre-resistance signature as general. The patient cohort makes the same point from the other direction. Cells that survived carboplatin-based chemotherapy in tumours were no higher on the carboplatin signatures than the same patients' untreated cells, and were lower on the fitness signature. A state that marks recovery in a culture dish need not mark survival in a patient, where the drug is given over months and the cells sit in a tissue. This is a further reason to measure the drug-specific part of a lineage signal, since it is the part that might translate.</w:t>
+      </w:r>
+    </w:p>
+    <w:p>
+      <w:pPr>
+        <w:spacing w:after="160" w:line="360"/>
+        <w:jc w:val="both"/>
+      </w:pPr>
+      <w:r>
+        <w:t xml:space="preserve">What the second system adds is that this is not a quirk of one protocol. Six treatments, a different cancer type and a different barcoding scheme give the same ordering: how much a lineage had grown before treatment matters more than what its cells were expressing, and the part of expression that survives adjustment is small, or for two of the six not distinguishable from nothing. Aviv (2026) reaches the same conclusion about abundance independently, and then shows that a condition-specific component does remain once abundance and condition are held fixed. We read the two together as follows: the axis that dominates is not about the drug, and the part that is about the drug is real but small. Both halves matter. A study that reports only the first half will conclude there is nothing there, and a study that reports only the second will overstate what a pre-treatment profile can do.</w:t>
+      </w:r>
+    </w:p>
+    <w:p>
+      <w:pPr>
+        <w:spacing w:after="160" w:line="360"/>
+        <w:jc w:val="both"/>
+      </w:pPr>
+      <w:r>
+        <w:t xml:space="preserve">The practical question is what to do when no untreated arm exists, which is almost always. We tested two substitutes and neither reproduced the control arm: a label-free density score inflated the drug-specific gain two- to three-fold, and a baseline built from the other treated arms almost erased it, because those arms carry the drug-specific component too. They failed in opposite directions and bracketed the truth in all three ReSisTrace arms, but that ordering is not guaranteed and did not hold in four of the six treatments of the second system. Our conclusion is deliberately modest: a substitute can tell you that a reported pre-resistance signal is mostly fitness, and cannot tell you by how much. The only way to get the number is to carry an untreated arm through the same protocol, which costs a fraction of the experiment and is the single change we would ask of future designs.</w:t>
+      </w:r>
+    </w:p>
+    <w:p>
+      <w:pPr>
+        <w:spacing w:after="160" w:line="360"/>
+        <w:jc w:val="both"/>
+      </w:pPr>
+      <w:r>
+        <w:t xml:space="preserve">Checking the estimators against synthetic experiments where the answer is known was worth more than we expected, because it found a limitation we would otherwise have reported as a result. The size-matched gain is recovered with little bias and does not appear when it is absent. The sister ceiling is accurate only when the sequenced sister bears on its sibling's fate through the state the two share, and when fate depends instead on the treated cell's own realised state the bound is too generous, so it should be read as an upper bound on what a perfect model could reach and therefore a lower bound on how much is lost. The interval around the drug-specific gain was the clearest case: resampling families to re-score models that were fitted once describes only how much the evaluation would move, and covers the truth well below the nominal rate. The package therefore also provides an interval that refits the whole procedure inside each replicate, which is slower by the number of replicates, and we would encourage anyone putting a bootstrap around a cross-validated score to check its coverage against a known answer before quoting it.</w:t>
+      </w:r>
+    </w:p>
+    <w:p>
+      <w:pPr>
+        <w:spacing w:after="160" w:line="360"/>
+        <w:jc w:val="both"/>
+      </w:pPr>
+      <w:r>
+        <w:t xml:space="preserve">Several limitations apply. First, ReSisTrace labels are noisy. Cells whose sister was lost or only partially matched are counted as pre-sensitive, and our ceiling handles this only through an assumed noise level. Second, the Gaussian liability model is a simplification. It assumes a single linear score and treats the fitted model as capturing the relevant direction, so the ceilings are approximate. Third, our copy-number clusters were inferred from expression and only weakly separated. They reproduced the published enrichment pattern, but they are not the original subclone calls. Fourth, all analyses use one ovarian cancer cell line, and the external checks rely on clone-level labels, on bulk tumours, and on a patient cohort of 11 in which the two samples are different pieces of tissue rather than sisters, so a negative result there has several possible causes. Fifth, the second system has no drug-free arm, so clone size stands in for fitness there, and lineage detection stands in for survival; a lineage can go unseen because its cells died or because it was not sampled. Our barcode assignment there is also simpler than the original authors', so our clone counts are not identical to theirs, although the conclusions held across the thresholds we tried. Finally, the graph model was tested with one architecture and modest tuning, and the foundation model was used as a frozen feature extractor rather than fine-tuned, which may not be the best use of it. A different design might do better, but the near-identical performance of very different models, from logistic regression to a 104-million-parameter transformer, suggests that the information, not the model class, is the limit.</w:t>
       </w:r>
     </w:p>
     <w:p>
@@ -789,6 +816,38 @@
       </w:r>
       <w:r>
         <w:t xml:space="preserve"> Throughout, fitness is defined operationally as what predicts a sister's recovery without any drug: the score of a PCA-logistic model trained on the lineage labels of the untreated control arm. Technical covariates (sequencing depth, detected genes, mitochondrial fraction, cell-cycle scores) are not part of this definition and were handled separately by regression. For each drug arm, the fitness score was the prediction of this model trained on all labelled control cells. We report the drug model's out-of-fold AUROC; the fitness model's AUROC on the drug-arm labels; the AUROC of the drug logit after within-sample linear regression on the fitness logit; the mean AUROC within fitness-score quintiles; a one-degree-of-freedom likelihood-ratio test for adding the drug logit to a model containing the fitness logit; and the size-matched specificity index (ΔAUROC). For the latter, the drug model was fitted by the same lineage-grouped five-fold cross-validation, but each training fold was reduced to a random set of whole families containing as many cells as the labelled control arm (4,183), so that the drug model never had more training data than the fitness model. Out-of-fold drug scores and the fitness score were then compared on all drug-arm cells, and ΔAUROC was averaged over 10 random reductions. Its 95% confidence interval came from 1,000 paired family-level bootstrap resamples: each resample reweighted whole families, and the seed-averaged ΔAUROC was recomputed with both scores on the same resampled cells. We used this bootstrap rather than a DeLong test because sisters are not independent observations. The one-sided p-value is the fraction of resamples with ΔAUROC ≤ 0. An earlier, simpler estimate (five random training sets, scored on the held-out drug-arm cells) gave similar values and is reported in Table S3.</w:t>
+      </w:r>
+    </w:p>
+    <w:p>
+      <w:pPr>
+        <w:spacing w:after="160" w:line="360"/>
+        <w:jc w:val="both"/>
+      </w:pPr>
+      <w:r>
+        <w:rPr>
+          <w:b/>
+          <w:bCs/>
+        </w:rPr>
+        <w:t xml:space="preserve">Synthetic experiments.</w:t>
+      </w:r>
+      <w:r>
+        <w:t xml:space="preserve"> To check the estimators against a known answer we generated lineage experiments from a model in which every quantity they estimate has a closed form. A family has a latent state z ~ N(0, I) in ten dimensions; its two sisters are measured as z plus independent Gaussian noise of standard deviation s, so the correlation between sisters is 1/(1 + s²) per dimension. The treated sister's survival follows a liability built from u = f·x_treated + (1 − f)·z, where f decides whether fate is driven by the treated cell's own realised state (f = 1) or only by the state the sisters share (f = 0). The liability is a·u₁ in the control arm and a·u₁ + b·u₂ in the drug arm, plus independent noise scaled so the total variance is one, so the first dimension is a generic fitness axis and the second is drug-specific. A cell is a positive when its liability exceeds the (1 − prevalence) quantile, and a fraction of true positives is then flipped to negative to imitate a sister that was not recovered. Because the measurement noise is Gaussian and independent of z, the best possible drug score is a·x₁ + b·x₂ and the best possible fitness score is x₁, so the population value of every reported quantity follows from one large draw. We swept the drug-specific strength (including zero), label noise, the number of families, sister similarity, a sequencing-depth confound, and f, running 25 independent experiments per setting and comparing the framework's estimates with the population values.</w:t>
+      </w:r>
+    </w:p>
+    <w:p>
+      <w:pPr>
+        <w:spacing w:after="160" w:line="360"/>
+        <w:jc w:val="both"/>
+      </w:pPr>
+      <w:r>
+        <w:rPr>
+          <w:b/>
+          <w:bCs/>
+        </w:rPr>
+        <w:t xml:space="preserve">Experiment design.</w:t>
+      </w:r>
+      <w:r>
+        <w:t xml:space="preserve"> The standard error of the size-matched gain was calibrated on those runs as k/√n_eff, where n_eff is the harmonic mean of the drug and control family counts, since the drug model is trained down to the control arm's size and adding drug families alone therefore stops helping. Rarer positives were taken to scale the error as 1/√(p(1 − p)). The resulting calculator returns the families per arm needed to detect a given gain at a given power, and is provided in the package.</w:t>
       </w:r>
     </w:p>
     <w:p>

</xml_diff>

<commit_message>
Rewrite the abstract for the current paper, and state the interval caveat
The abstract now covers the second lineage system, the foundation model and the failed substitutes for
a control arm, and no longer claims the drug-specific intervals exclude zero, since the synthetic
experiments show that interval covers the truth less often than its nominal rate. The methods say so
directly and point to the slower interval that refits within each replicate.
</commit_message>
<xml_diff>
--- a/paper/manuscript.docx
+++ b/paper/manuscript.docx
@@ -48,7 +48,7 @@
         <w:t xml:space="preserve">Methods.</w:t>
       </w:r>
       <w:r>
-        <w:t xml:space="preserve"> We used the ReSisTrace data (Kuramochi ovarian cancer cells; carboplatin, olaparib, NK cells and no-drug control; two replicates; 32,642 labelled pre-treatment cells). We trained classifiers directly on the lineage labels and evaluated them with lineage-grouped cross-validation, replicate hold-out and transfer between arms. We then measured how much of the predictive signal is shared with the control arm, estimated an upper bound on predictability from 3,477 pairs of sisters that were both sequenced before treatment, and tested for confounding by sequencing depth, cell cycle and inferred copy-number subclones. Two independent lineage-tracing data sets, the TCGA ovarian cancer cohort and a cohort of 11 patients sampled before and after neoadjuvant chemotherapy served as external checks.</w:t>
+        <w:t xml:space="preserve"> We used the ReSisTrace data (Kuramochi ovarian cancer cells; carboplatin, olaparib, NK cells and no-drug control; two replicates; 32,642 labelled pre-treatment cells). We trained classifiers directly on the lineage labels and evaluated them with lineage-grouped cross-validation, replicate hold-out and transfer between arms. We then measured how much of the predictive signal is shared with the control arm, estimated an upper bound on predictability from 3,477 pairs of sisters that were both sequenced before treatment, and tested for confounding by sequencing depth, cell cycle and inferred copy-number subclones. A second lineage-tracing system with six treatments in parallel, two clone-level data sets, the TCGA ovarian cancer cohort and 11 patients sampled before and after neoadjuvant chemotherapy served as external checks. Synthetic experiments with a known answer were used to check the estimators themselves.</w:t>
       </w:r>
     </w:p>
     <w:p>
@@ -64,7 +64,7 @@
         <w:t xml:space="preserve">Results.</w:t>
       </w:r>
       <w:r>
-        <w:t xml:space="preserve"> A logistic model on 50 principal components predicted the sister's fate with AUROC 0.72–0.75 in the drug arms (label-permutation p &lt; 0.01). On the olaparib arm, under the same balanced protocol, this was well above the AUROC of about 0.50–0.60 reported for existing drug-response predictors, and neither tuning, pooling arms, gradient boosting, a graph neural network with sister-pair pretraining nor embeddings from a single-cell foundation model improved on it (graph network 0.70–0.73 across three seeds; Geneformer 0.67–0.68). However, a model trained only on the untreated control arm predicted the drug-arm labels almost as well (AUROC 0.70–0.73). With training size matched, the drug-specific gain over this fitness model was 0.014–0.025 AUROC (95% confidence intervals excluding zero in every drug arm) and fell to 0.003 for NK cells once depth and mitochondrial content were removed (95% CI −0.010 to 0.016). Beyond the fitness axis, pre-resistant cells showed lower E2F, mitotic-spindle and MYC-target expression. A label-free score of how typical a cell's state is reached AUROC 0.63–0.70 on its own. Sister discordance alone cost about 0.09–0.12 AUROC. Inferred copy-number subclones did not explain the signal. In two external data sets, clone size predicted lineage survival far better than expression, and ReSisTrace models transferred at or near chance. No derived signature was associated with outcome in TCGA ovarian tumours after correction for multiple testing, and in 11 patients sampled before and after neoadjuvant chemotherapy the drug signatures were not enriched in the cells that persisted, while the fitness signature was depleted.</w:t>
+        <w:t xml:space="preserve"> A logistic model on 50 principal components predicted the sister's fate with AUROC 0.72–0.75 in the drug arms (label-permutation p &lt; 0.01), well above the 0.50–0.60 reported for existing drug-response predictors on the same olaparib task. Neither tuning, pooling arms, gradient boosting, a graph neural network with sister-pair pretraining nor embeddings from a single-cell foundation model improved on it (graph network 0.70–0.73; Geneformer 0.67–0.68). However, a model trained only on the untreated control arm predicted the drug-arm labels almost as well (0.70–0.73). With training size matched, the drug-specific gain over this fitness model was 0.014–0.025 AUROC, falling to 0.003 for NK cells once depth and mitochondrial content were removed. Sister discordance alone cost about 0.09–0.12 AUROC. A label-free measure of how typical a cell's state is reached 0.63–0.70 on its own; inferred copy-number subclones did not explain the signal. The pattern held in a second system: across six treatments of barcoded melanoma cells, clone size before treatment predicted whether a lineage was detected again better than expression did in every arm (0.68–0.90 against 0.54–0.66), and expression added nothing beyond clone size for two of the six. No derived signature was associated with outcome in TCGA ovarian tumours after correction, and in patients the drug signatures were not enriched in the cells that persisted through chemotherapy while the fitness signature was depleted. Substitutes for an untreated arm failed in both directions, over- and under-stating the drug-specific gain.</w:t>
       </w:r>
     </w:p>
     <w:p>
@@ -80,7 +80,7 @@
         <w:t xml:space="preserve">Conclusions.</w:t>
       </w:r>
       <w:r>
-        <w:t xml:space="preserve"> In this system, most of what a pre-treatment transcriptome says about a sister's survival is generic fitness rather than drug-specific tolerance, and even a perfect model of the sequenced cell would be limited by the imperfect similarity of sisters. The fitness state does not appear to be what selects cells in treated patients. Untreated controls and sister-based ceilings should accompany claims that pre-existing states predict drug tolerance, and we provide them as a small reusable package.</w:t>
+        <w:t xml:space="preserve"> In this system, most of what a pre-treatment transcriptome says about a sister's survival is generic fitness rather than drug-specific tolerance, and even a perfect model of the sequenced cell would be limited by the imperfect similarity of sisters. The fitness state does not appear to be what selects cells in treated patients. Because no substitute for a matched untreated arm reproduced it, we argue that such an arm should be carried through the same protocol wherever pre-existing states are claimed to predict drug tolerance, and we provide the evaluation as a small reusable package.</w:t>
       </w:r>
     </w:p>
     <w:p>
@@ -815,7 +815,16 @@
         <w:t xml:space="preserve">Fitness analysis.</w:t>
       </w:r>
       <w:r>
-        <w:t xml:space="preserve"> Throughout, fitness is defined operationally as what predicts a sister's recovery without any drug: the score of a PCA-logistic model trained on the lineage labels of the untreated control arm. Technical covariates (sequencing depth, detected genes, mitochondrial fraction, cell-cycle scores) are not part of this definition and were handled separately by regression. For each drug arm, the fitness score was the prediction of this model trained on all labelled control cells. We report the drug model's out-of-fold AUROC; the fitness model's AUROC on the drug-arm labels; the AUROC of the drug logit after within-sample linear regression on the fitness logit; the mean AUROC within fitness-score quintiles; a one-degree-of-freedom likelihood-ratio test for adding the drug logit to a model containing the fitness logit; and the size-matched specificity index (ΔAUROC). For the latter, the drug model was fitted by the same lineage-grouped five-fold cross-validation, but each training fold was reduced to a random set of whole families containing as many cells as the labelled control arm (4,183), so that the drug model never had more training data than the fitness model. Out-of-fold drug scores and the fitness score were then compared on all drug-arm cells, and ΔAUROC was averaged over 10 random reductions. Its 95% confidence interval came from 1,000 paired family-level bootstrap resamples: each resample reweighted whole families, and the seed-averaged ΔAUROC was recomputed with both scores on the same resampled cells. We used this bootstrap rather than a DeLong test because sisters are not independent observations. The one-sided p-value is the fraction of resamples with ΔAUROC ≤ 0. An earlier, simpler estimate (five random training sets, scored on the held-out drug-arm cells) gave similar values and is reported in Table S3.</w:t>
+        <w:t xml:space="preserve"> Throughout, fitness is defined operationally as what predicts a sister's recovery without any drug: the score of a PCA-logistic model trained on the lineage labels of the untreated control arm. Technical covariates (sequencing depth, detected genes, mitochondrial fraction, cell-cycle scores) are not part of this definition and were handled separately by regression. For each drug arm, the fitness score was the prediction of this model trained on all labelled control cells. We report the drug model's out-of-fold AUROC; the fitness model's AUROC on the drug-arm labels; the AUROC of the drug logit after within-sample linear regression on the fitness logit; the mean AUROC within fitness-score quintiles; a one-degree-of-freedom likelihood-ratio test for adding the drug logit to a model containing the fitness logit; and the size-matched specificity index (ΔAUROC). For the latter, the drug model was fitted by the same lineage-grouped five-fold cross-validation, but each training fold was reduced to a random set of whole families containing as many cells as the labelled control arm (4,183), so that the drug model never had more training data than the fitness model. Out-of-fold drug scores and the fitness score were then compared on all drug-arm cells, and ΔAUROC was averaged over 10 random reductions. Its 95% confidence interval came from 1,000 paired family-level bootstrap resamples: each resample reweighted whole families, and the seed-averaged ΔAUROC was recomputed with both scores on the same resampled cells. We used this bootstrap rather than a DeLong test because sisters are not independent observations. It resamples families to re-score models that were fitted once, so it describes how much the evaluation would move and not how much the whole procedure would move; in the synthetic experiments it covered the truth less often than its nominal rate, and the intervals quoted here should therefore be read as a lower bound on the uncertainty. The package also provides a slower interval that refits the fitness model and the capped out-of-fold drug model inside every replicate (</w:t>
+      </w:r>
+      <w:r>
+        <w:rPr>
+          <w:rFonts w:ascii="Consolas" w:cs="Consolas" w:eastAsia="Consolas" w:hAnsi="Consolas"/>
+        </w:rPr>
+        <w:t xml:space="preserve">scripts/28_delta_refit_bootstrap.py</w:t>
+      </w:r>
+      <w:r>
+        <w:t xml:space="preserve">). The one-sided p-value is the fraction of resamples with ΔAUROC ≤ 0. An earlier, simpler estimate (five random training sets, scored on the held-out drug-arm cells) gave similar values and is reported in Table S3.</w:t>
       </w:r>
     </w:p>
     <w:p>

</xml_diff>

<commit_message>
Correct the drug-specific intervals, add the simulation results and recalibrate the design tool
The size-matched gain is 0.014-0.025 and positive everywhere, but an interval that refits the whole
procedure inside each replicate does not exclude zero in any arm (p = 0.07-0.21). The design
calculation, now calibrated on the finished sweep, says the published experiment resolves about
0.023-0.025, so all three estimates sit below what it can resolve. Text, abstract and conclusions say
this directly instead of quoting the evaluation-only intervals.

New results section and Fig 9: the gain is recovered with bias under 0.005 and does not appear when
absent (2 of 25 at zero effect); a depth confound biases it down by 0.018 with 24% coverage; the
evaluation-only interval is too narrow by 1.2-1.9x; and the sister ceiling is exact under its
assumption and overstates by up to 0.114 when fate depends on shared state.

Audit now at 107 checks.
</commit_message>
<xml_diff>
--- a/paper/manuscript.docx
+++ b/paper/manuscript.docx
@@ -64,7 +64,7 @@
         <w:t xml:space="preserve">Results.</w:t>
       </w:r>
       <w:r>
-        <w:t xml:space="preserve"> A logistic model on 50 principal components predicted the sister's fate with AUROC 0.72–0.75 in the drug arms (label-permutation p &lt; 0.01), well above the 0.50–0.60 reported for existing drug-response predictors on the same olaparib task. Neither tuning, pooling arms, gradient boosting, a graph neural network with sister-pair pretraining nor embeddings from a single-cell foundation model improved on it (graph network 0.70–0.73; Geneformer 0.67–0.68). However, a model trained only on the untreated control arm predicted the drug-arm labels almost as well (0.70–0.73). With training size matched, the drug-specific gain over this fitness model was 0.014–0.025 AUROC, falling to 0.003 for NK cells once depth and mitochondrial content were removed. Sister discordance alone cost about 0.09–0.12 AUROC. A label-free measure of how typical a cell's state is reached 0.63–0.70 on its own; inferred copy-number subclones did not explain the signal. The pattern held in a second system: across six treatments of barcoded melanoma cells, clone size before treatment predicted whether a lineage was detected again better than expression did in every arm (0.68–0.90 against 0.54–0.66), and expression added nothing beyond clone size for two of the six. No derived signature was associated with outcome in TCGA ovarian tumours after correction, and in patients the drug signatures were not enriched in the cells that persisted through chemotherapy while the fitness signature was depleted. Substitutes for an untreated arm failed in both directions, over- and under-stating the drug-specific gain.</w:t>
+        <w:t xml:space="preserve"> A logistic model on 50 principal components predicted the sister's fate with AUROC 0.72–0.75 in the drug arms (label-permutation p &lt; 0.01), well above the 0.50–0.60 reported for existing drug-response predictors on the same olaparib task. Neither tuning, pooling arms, gradient boosting, a graph neural network with sister-pair pretraining nor embeddings from a single-cell foundation model improved on it (graph network 0.70–0.73; Geneformer 0.67–0.68). However, a model trained only on the untreated control arm predicted the drug-arm labels almost as well (0.70–0.73). With training size matched, the drug-specific gain over this fitness model was 0.014–0.025 AUROC, falling to 0.003 for NK cells once depth and mitochondrial content were removed. That gain is positive in every arm and every preprocessing variant, but once uncertainty in model fitting is included rather than evaluation alone, no single arm's interval excludes zero (p = 0.07–0.21), which matches a design calculation showing the experiment can resolve about 0.021. Sister discordance alone cost about 0.09–0.12 AUROC. A label-free measure of how typical a cell's state is reached 0.63–0.70 on its own; inferred copy-number subclones did not explain the signal. The pattern held in a second system: across six treatments of barcoded melanoma cells, clone size before treatment predicted whether a lineage was detected again better than expression did in every arm (0.68–0.90 against 0.54–0.66), and expression added nothing beyond clone size for two of the six. No derived signature was associated with outcome in TCGA ovarian tumours after correction, and in patients the drug signatures were not enriched in the cells that persisted through chemotherapy while the fitness signature was depleted. Substitutes for an untreated arm failed in both directions, over- and under-stating the drug-specific gain.</w:t>
       </w:r>
     </w:p>
     <w:p>
@@ -80,7 +80,7 @@
         <w:t xml:space="preserve">Conclusions.</w:t>
       </w:r>
       <w:r>
-        <w:t xml:space="preserve"> In this system, most of what a pre-treatment transcriptome says about a sister's survival is generic fitness rather than drug-specific tolerance, and even a perfect model of the sequenced cell would be limited by the imperfect similarity of sisters. The fitness state does not appear to be what selects cells in treated patients. Because no substitute for a matched untreated arm reproduced it, we argue that such an arm should be carried through the same protocol wherever pre-existing states are claimed to predict drug tolerance, and we provide the evaluation as a small reusable package.</w:t>
+        <w:t xml:space="preserve"> In this system, most of what a pre-treatment transcriptome says about a sister's survival is generic fitness rather than drug-specific tolerance, and the drug-specific remainder is small enough that the experiment cannot separate it from zero, and even a perfect model of the sequenced cell would be limited by the imperfect similarity of sisters. The fitness state does not appear to be what selects cells in treated patients. Because no substitute for a matched untreated arm reproduced it, we argue that such an arm should be carried through the same protocol wherever pre-existing states are claimed to predict drug tolerance, and we provide the evaluation as a small reusable package.</w:t>
       </w:r>
     </w:p>
     <w:p>
@@ -254,7 +254,7 @@
         <w:jc w:val="both"/>
       </w:pPr>
       <w:r>
-        <w:t xml:space="preserve">Drug-arm and control-model scores were strongly correlated (Spearman 0.80–0.82). Adding the drug score to a logistic model that already contained the control-model score still improved fit in every arm (likelihood-ratio p &lt; 10⁻²⁵). The drug-specific component was therefore real, but it was small. The drug score residualised on the control score reached AUROC 0.60–0.63, and within quintiles of the control score 0.64–0.66 (Fig. 3b). The control arm has fewer labelled cells (4,183) than the drug arms (8,942–10,123), so we also trained drug models on random sets of whole families of the same size, repeated ten times, and put a paired family-bootstrap confidence interval on the difference (Methods). The drug-specific advantage was then 0.014 for carboplatin (95% CI 0.001–0.026), 0.025 for olaparib (0.012–0.039) and 0.017 for NK (0.003–0.031) (Fig. 3c, Table S19). The spread across the ten training subsets was small (s.d. 0.003–0.004). The gain was essentially unchanged after removing cell cycle (0.014, 0.025, 0.014). After removing depth and mitochondrial content as well, it was 0.012 for carboplatin (−0.001 to 0.025), 0.021 for olaparib (0.008–0.035) and 0.003 for NK (−0.010 to 0.016). For NK cells, therefore, nothing drug-specific could be distinguished from zero. The result did not depend on how expression was represented. We repeated the analysis with Harmony-corrected components (batch = sample; Korsunsky et al., 2019), with principal components of analytic Pearson residuals, a count-based alternative to log-normalisation (Lause et al., 2021), and with the latent space of scVI, which models library size and sample explicitly (Lopez et al., 2018). We also replaced the principal components with 768-dimensional cell embeddings from Geneformer, a transformer pretrained on 104 million human single-cell transcriptomes and continually pretrained on about 14 million cancer transcriptomes (Theodoris et al., 2023; Chen et al., 2026). The foundation model did not extract more signal than 50 principal components: it reached 0.671–0.683 in the drug arms, below the 0.723–0.747 of the linear model, and its fitness model still explained most of that (0.634–0.663), leaving a size-matched gain of 0.017–0.030. Across all four alternative representations, drug-arm models reached 0.671–0.746, the control-trained model 0.634–0.722 on the same labels, and the size-matched drug-specific gain (simpler five-repeat estimate) was 0.013–0.032 (Table S17).</w:t>
+        <w:t xml:space="preserve">Drug-arm and control-model scores were strongly correlated (Spearman 0.80–0.82). Adding the drug score to a logistic model that already contained the control-model score still improved fit in every arm (likelihood-ratio p &lt; 10⁻²⁵). The drug-specific component was therefore real, but it was small. The drug score residualised on the control score reached AUROC 0.60–0.63, and within quintiles of the control score 0.64–0.66 (Fig. 3b). The control arm has fewer labelled cells (4,183) than the drug arms (8,942–10,123), so we also trained drug models on random sets of whole families of the same size, repeated ten times, and put a paired family-bootstrap confidence interval on the difference (Methods). The drug-specific advantage was then 0.014 for carboplatin, 0.025 for olaparib and 0.017 for NK, with a spread across the ten training subsets of only 0.003–0.004 (Fig. 3c, Table S19). How certain these numbers are depends on what the interval is asked to include. Resampling families to re-score models that were fitted once gives intervals that exclude zero in all three arms (0.001–0.026, 0.012–0.039, 0.003–0.031), but that describes only how much the evaluation would move. Repeating the whole procedure inside each of 60 bootstrap replicates, so that the control-arm model and the capped out-of-fold drug model are refitted every time, gives 0.017 for carboplatin (95% CI −0.002 to 0.043, p = 0.16), 0.022 for olaparib (−0.004 to 0.046, p = 0.07) and 0.014 for NK (−0.011 to 0.038, p = 0.21) (Table S27). None of these excludes zero. The size of the effect is therefore well constrained and small, but this experiment cannot establish from any single arm that it is not zero, which is what our design calculation implies: with 3,879 labelled control families it can resolve a gain of about 0.023 to 0.025 at 80% power, and all three estimates fall below that. What does speak for a real effect is consistency rather than any one interval: the gain is positive in all three arms, under all three preprocessing variants, and across every alternative representation we tried, and the likelihood-ratio test above, which asks whether the drug score adds information about these cells rather than whether the gain would repeat in a new experiment, is significant beyond p &lt; 10⁻²⁵ in every arm. The gain was essentially unchanged after removing cell cycle (0.014, 0.025, 0.014). After removing depth and mitochondrial content as well, it was 0.012 for carboplatin, 0.021 for olaparib and 0.003 for NK. For NK cells, therefore, nothing drug-specific remained even by the narrower evaluation-only interval (−0.010 to 0.016). The result did not depend on how expression was represented. We repeated the analysis with Harmony-corrected components (batch = sample; Korsunsky et al., 2019), with principal components of analytic Pearson residuals, a count-based alternative to log-normalisation (Lause et al., 2021), and with the latent space of scVI, which models library size and sample explicitly (Lopez et al., 2018). We also replaced the principal components with 768-dimensional cell embeddings from Geneformer, a transformer pretrained on 104 million human single-cell transcriptomes and continually pretrained on about 14 million cancer transcriptomes (Theodoris et al., 2023; Chen et al., 2026). The foundation model did not extract more signal than 50 principal components: it reached 0.671–0.683 in the drug arms, below the 0.723–0.747 of the linear model, and its fitness model still explained most of that (0.634–0.663), leaving a size-matched gain of 0.017–0.030. Across all four alternative representations, drug-arm models reached 0.671–0.746, the control-trained model 0.634–0.722 on the same labels, and the size-matched drug-specific gain (simpler five-repeat estimate) was 0.013–0.032 (Table S17).</w:t>
       </w:r>
     </w:p>
     <w:p>
@@ -530,6 +530,59 @@
     </w:p>
     <w:p>
       <w:pPr>
+        <w:pStyle w:val="Heading2"/>
+      </w:pPr>
+      <w:r>
+        <w:t xml:space="preserve">The estimators, checked against a known answer (Fig. 9)</w:t>
+      </w:r>
+    </w:p>
+    <w:p>
+      <w:pPr>
+        <w:spacing w:after="160" w:line="360"/>
+        <w:jc w:val="both"/>
+      </w:pPr>
+      <w:r>
+        <w:t xml:space="preserve">Everything above rests on two estimators, so we tested them where the answer is known. Synthetic sister experiments fix how much of survival is generic fitness, how much is drug-specific, how alike sisters are, and whether fate is driven by the treated cell's own state or by the state the sisters share; the framework was then run blind on 25 independent experiments per setting (Methods, Table S24).</w:t>
+      </w:r>
+    </w:p>
+    <w:p>
+      <w:pPr>
+        <w:spacing w:after="160" w:line="360"/>
+        <w:jc w:val="both"/>
+      </w:pPr>
+      <w:r>
+        <w:t xml:space="preserve">The size-matched gain behaved well. When there was no drug-specific effect the estimate was −0.001 and only 2 of 25 experiments produced an interval excluding zero, close to the 5% expected. When an effect was present it was recovered with a bias of +0.001 to +0.005, rising with the size of the effect, and with a bias below 0.003 for every level of label noise we tried (0, 10 and 20%). The one setting that broke it was a technical confound: when a shared axis was added to both the measurement and the chance of being recovered, imitating the sequencing-depth effect seen in the real data, the gain was underestimated by 0.018 and the interval covered the truth in only 24% of experiments. This is the situation our </w:t>
+      </w:r>
+      <w:r>
+        <w:rPr>
+          <w:rFonts w:ascii="Consolas" w:cs="Consolas" w:eastAsia="Consolas" w:hAnsi="Consolas"/>
+        </w:rPr>
+        <w:t xml:space="preserve">regress_all</w:t>
+      </w:r>
+      <w:r>
+        <w:t xml:space="preserve"> variant is meant for, and it suggests the numbers from that variant are conservative rather than deflated by over-correction.</w:t>
+      </w:r>
+    </w:p>
+    <w:p>
+      <w:pPr>
+        <w:spacing w:after="160" w:line="360"/>
+        <w:jc w:val="both"/>
+      </w:pPr>
+      <w:r>
+        <w:t xml:space="preserve">The intervals were the weak point, and this is why the figures above are quoted from a refitting bootstrap. Setting the depth confound aside, the evaluation-only interval covered the truth in 52% to 88% of experiments rather than 95%, and it was worst where the effect was largest; with the depth confound it fell to 24%. Comparing its width with the actual spread of the estimate across independent experiments, it is too narrow by a factor of 1.2 to 1.9. Any bootstrap placed around a cross-validated score, here or elsewhere, is measuring how much the evaluation would move and not how much the whole procedure would move.</w:t>
+      </w:r>
+    </w:p>
+    <w:p>
+      <w:pPr>
+        <w:spacing w:after="160" w:line="360"/>
+        <w:jc w:val="both"/>
+      </w:pPr>
+      <w:r>
+        <w:t xml:space="preserve">The ceiling was accurate when its assumption held and failed openly when it did not. With fate driven by the treated cell's own state, which is the case the estimator assumes, the implied AUROC was within 0.005 of what a model actually achieved on that cell. As fate was shifted towards depending only on the state the sisters share, the estimate drifted upward, by 0.052 at the halfway point and by 0.114 when fate depended on shared state alone. The error is one-sided: the estimator overstates what a perfect model of the treated cell could do, and therefore overstates the cost of reading the wrong cell. We verified this ordering analytically as well as by simulation (Methods), so the sister costs reported above should be read as upper bounds.</w:t>
+      </w:r>
+    </w:p>
+    <w:p>
+      <w:pPr>
         <w:pStyle w:val="Heading1"/>
       </w:pPr>
       <w:r>
@@ -542,7 +595,7 @@
         <w:jc w:val="both"/>
       </w:pPr>
       <w:r>
-        <w:t xml:space="preserve">The ReSisTrace design separates two things that most lineage-tracing studies cannot: surviving a drug, and simply being recovered after the experimental procedure. Dai et al. (2024) built the control arm for this purpose and saw the fitness signal in their differential expression. We asked how much it matters for prediction, and the answer is: most of it. A model trained without any drug predicts drug-arm fates nearly as well as models trained on those arms, and a label-free measure of how typical a cell's state is recovers much of the same signal. The drug-specific remainder is statistically robust and biologically coherent, pointing to lower proliferation among otherwise fit cells, but it is worth one to three points of AUROC. For NK cells it largely disappears once depth and mitochondrial content are removed.</w:t>
+        <w:t xml:space="preserve">The ReSisTrace design separates two things that most lineage-tracing studies cannot: surviving a drug, and simply being recovered after the experimental procedure. Dai et al. (2024) built the control arm for this purpose and saw the fitness signal in their differential expression. We asked how much it matters for prediction, and the answer is: most of it. A model trained without any drug predicts drug-arm fates nearly as well as models trained on those arms, and a label-free measure of how typical a cell's state is recovers much of the same signal. The drug-specific remainder is biologically coherent, pointing to lower proliferation among otherwise fit cells, and it is positive everywhere we look, but it is worth one to three points of AUROC and no single arm resolves it from zero once the uncertainty of fitting is counted. For NK cells it largely disappears once depth and mitochondrial content are removed.</w:t>
       </w:r>
     </w:p>
     <w:p>
@@ -1038,7 +1091,7 @@
         <w:t xml:space="preserve">scripts/run_all.sh</w:t>
       </w:r>
       <w:r>
-        <w:t xml:space="preserve">) that regenerates every result, figure and supplementary table from the public data on a laptop CPU; only the Geneformer forward pass used a GPU (a Kaggle T4; the notebook is included). Every metric is appended to a results table together with a hash of the configuration that produced it. All result tables underlying the figures and text, including full differential expression and gene-set enrichment results, are provided as Supplementary Tables S1–S26 (Supplementary_Tables.xlsx).</w:t>
+        <w:t xml:space="preserve">) that regenerates every result, figure and supplementary table from the public data on a laptop CPU; only the Geneformer forward pass used a GPU (a Kaggle T4; the notebook is included). Every metric is appended to a results table together with a hash of the configuration that produced it. All result tables underlying the figures and text, including full differential expression and gene-set enrichment results, are provided as Supplementary Tables S1–S27 (Supplementary_Tables.xlsx).</w:t>
       </w:r>
     </w:p>
     <w:p>
@@ -1631,7 +1684,7 @@
       <w:r>
         <w:drawing>
           <wp:inline distT="0" distB="0" distL="0" distR="0">
-            <wp:extent cx="5905500" cy="3629025"/>
+            <wp:extent cx="5905500" cy="2057400"/>
             <wp:effectExtent t="0" r="0" b="0" l="0"/>
             <wp:docPr id="1" name="" descr="" title=""/>
             <wp:cNvGraphicFramePr>
@@ -1656,7 +1709,7 @@
                   <pic:spPr bwMode="auto">
                     <a:xfrm>
                       <a:off x="0" y="0"/>
-                      <a:ext cx="5905500" cy="3629025"/>
+                      <a:ext cx="5905500" cy="2057400"/>
                     </a:xfrm>
                     <a:prstGeom prst="rect">
                       <a:avLst/>
@@ -1679,10 +1732,10 @@
           <w:b/>
           <w:bCs/>
         </w:rPr>
-        <w:t xml:space="preserve">Figure S1. Label-free typicality.</w:t>
-      </w:r>
-      <w:r>
-        <w:t xml:space="preserve"> AUROC of the local-density score (negative mean distance to the 15 nearest neighbours within the sample), compared with the supervised PCA-logistic model and the control-arm (fitness) model, for each arm.</w:t>
+        <w:t xml:space="preserve">Figure 9. The estimators checked against a known answer.</w:t>
+      </w:r>
+      <w:r>
+        <w:t xml:space="preserve"> (a) Estimated against true drug-specific gain across synthetic settings; the line is equality and bars are the spread over 25 independent experiments. (b) Coverage of the nominal 95% interval in each setting; the dashed line is 0.95. (c) Estimated minus actual AUROC if the treated sister were scored, as fate moves from depending on the treated cell's own state (left, the estimator's assumption) to depending only on the state the sisters share (right).</w:t>
       </w:r>
     </w:p>
     <w:p>
@@ -1693,7 +1746,7 @@
       <w:r>
         <w:drawing>
           <wp:inline distT="0" distB="0" distL="0" distR="0">
-            <wp:extent cx="5905500" cy="7677150"/>
+            <wp:extent cx="5905500" cy="3629025"/>
             <wp:effectExtent t="0" r="0" b="0" l="0"/>
             <wp:docPr id="1" name="" descr="" title=""/>
             <wp:cNvGraphicFramePr>
@@ -1718,6 +1771,68 @@
                   <pic:spPr bwMode="auto">
                     <a:xfrm>
                       <a:off x="0" y="0"/>
+                      <a:ext cx="5905500" cy="3629025"/>
+                    </a:xfrm>
+                    <a:prstGeom prst="rect">
+                      <a:avLst/>
+                    </a:prstGeom>
+                  </pic:spPr>
+                </pic:pic>
+              </a:graphicData>
+            </a:graphic>
+          </wp:inline>
+        </w:drawing>
+      </w:r>
+    </w:p>
+    <w:p>
+      <w:pPr>
+        <w:spacing w:after="160" w:line="360"/>
+        <w:jc w:val="both"/>
+      </w:pPr>
+      <w:r>
+        <w:rPr>
+          <w:b/>
+          <w:bCs/>
+        </w:rPr>
+        <w:t xml:space="preserve">Figure S1. Label-free typicality.</w:t>
+      </w:r>
+      <w:r>
+        <w:t xml:space="preserve"> AUROC of the local-density score (negative mean distance to the 15 nearest neighbours within the sample), compared with the supervised PCA-logistic model and the control-arm (fitness) model, for each arm.</w:t>
+      </w:r>
+    </w:p>
+    <w:p>
+      <w:pPr>
+        <w:keepNext/>
+        <w:spacing w:before="240"/>
+      </w:pPr>
+      <w:r>
+        <w:drawing>
+          <wp:inline distT="0" distB="0" distL="0" distR="0">
+            <wp:extent cx="5905500" cy="7677150"/>
+            <wp:effectExtent t="0" r="0" b="0" l="0"/>
+            <wp:docPr id="1" name="" descr="" title=""/>
+            <wp:cNvGraphicFramePr>
+              <a:graphicFrameLocks xmlns:a="http://schemas.openxmlformats.org/drawingml/2006/main" noChangeAspect="1"/>
+            </wp:cNvGraphicFramePr>
+            <a:graphic xmlns:a="http://schemas.openxmlformats.org/drawingml/2006/main">
+              <a:graphicData uri="http://schemas.openxmlformats.org/drawingml/2006/picture">
+                <pic:pic xmlns:pic="http://schemas.openxmlformats.org/drawingml/2006/picture">
+                  <pic:nvPicPr>
+                    <pic:cNvPr id="0" name="" descr=""/>
+                    <pic:cNvPicPr>
+                      <a:picLocks noChangeAspect="1" noChangeArrowheads="1"/>
+                    </pic:cNvPicPr>
+                  </pic:nvPicPr>
+                  <pic:blipFill>
+                    <a:blip r:embed="rId18" cstate="none"/>
+                    <a:srcRect/>
+                    <a:stretch>
+                      <a:fillRect/>
+                    </a:stretch>
+                  </pic:blipFill>
+                  <pic:spPr bwMode="auto">
+                    <a:xfrm>
+                      <a:off x="0" y="0"/>
                       <a:ext cx="5905500" cy="7677150"/>
                     </a:xfrm>
                     <a:prstGeom prst="rect">
@@ -1771,7 +1886,7 @@
                     </pic:cNvPicPr>
                   </pic:nvPicPr>
                   <pic:blipFill>
-                    <a:blip r:embed="rId18" cstate="none"/>
+                    <a:blip r:embed="rId19" cstate="none"/>
                     <a:srcRect/>
                     <a:stretch>
                       <a:fillRect/>

</xml_diff>

<commit_message>
Report the refitting intervals for all three preprocessing variants
Across the nine arm-by-variant combinations the gain is positive in eight, but only one interval
excludes zero (olaparib with cell cycle removed, p = 0.033), about what nine tests give by chance.
Olaparib is closest in all three variants, which fits its larger gain and higher label prevalence.
</commit_message>
<xml_diff>
--- a/paper/manuscript.docx
+++ b/paper/manuscript.docx
@@ -64,7 +64,7 @@
         <w:t xml:space="preserve">Results.</w:t>
       </w:r>
       <w:r>
-        <w:t xml:space="preserve"> A logistic model on 50 principal components predicted the sister's fate with AUROC 0.72–0.75 in the drug arms (label-permutation p &lt; 0.01), well above the 0.50–0.60 reported for existing drug-response predictors on the same olaparib task. Neither tuning, pooling arms, gradient boosting, a graph neural network with sister-pair pretraining nor embeddings from a single-cell foundation model improved on it (graph network 0.70–0.73; Geneformer 0.67–0.68). However, a model trained only on the untreated control arm predicted the drug-arm labels almost as well (0.70–0.73). With training size matched, the drug-specific gain over this fitness model was 0.014–0.025 AUROC, falling to 0.003 for NK cells once depth and mitochondrial content were removed. That gain is positive in every arm and every preprocessing variant, but once uncertainty in model fitting is included rather than evaluation alone, no single arm's interval excludes zero (p = 0.07–0.21), which matches a design calculation showing the experiment can resolve about 0.021. Sister discordance alone cost about 0.09–0.12 AUROC. A label-free measure of how typical a cell's state is reached 0.63–0.70 on its own; inferred copy-number subclones did not explain the signal. The pattern held in a second system: across six treatments of barcoded melanoma cells, clone size before treatment predicted whether a lineage was detected again better than expression did in every arm (0.68–0.90 against 0.54–0.66), and expression added nothing beyond clone size for two of the six. No derived signature was associated with outcome in TCGA ovarian tumours after correction, and in patients the drug signatures were not enriched in the cells that persisted through chemotherapy while the fitness signature was depleted. Substitutes for an untreated arm failed in both directions, over- and under-stating the drug-specific gain.</w:t>
+        <w:t xml:space="preserve"> A logistic model on 50 principal components predicted the sister's fate with AUROC 0.72–0.75 in the drug arms (label-permutation p &lt; 0.01), well above the 0.50–0.60 reported for existing drug-response predictors on the same olaparib task. Neither tuning, pooling arms, gradient boosting, a graph neural network with sister-pair pretraining nor embeddings from a single-cell foundation model improved on it (graph network 0.70–0.73; Geneformer 0.67–0.68). However, a model trained only on the untreated control arm predicted the drug-arm labels almost as well (0.70–0.73). With training size matched, the drug-specific gain over this fitness model was 0.014–0.025 AUROC, falling to 0.003 for NK cells once depth and mitochondrial content were removed. That gain is positive in every arm and every preprocessing variant, but once uncertainty in model fitting is included rather than evaluation alone, only one of nine arm-by-variant intervals excludes zero, which matches a design calculation showing the experiment can resolve about 0.023–0.025. Sister discordance alone cost about 0.09–0.12 AUROC. A label-free measure of how typical a cell's state is reached 0.63–0.70 on its own; inferred copy-number subclones did not explain the signal. The pattern held in a second system: across six treatments of barcoded melanoma cells, clone size before treatment predicted whether a lineage was detected again better than expression did in every arm (0.68–0.90 against 0.54–0.66), and expression added nothing beyond clone size for two of the six. No derived signature was associated with outcome in TCGA ovarian tumours after correction, and in patients the drug signatures were not enriched in the cells that persisted through chemotherapy while the fitness signature was depleted. Substitutes for an untreated arm failed in both directions, over- and under-stating the drug-specific gain.</w:t>
       </w:r>
     </w:p>
     <w:p>
@@ -254,7 +254,7 @@
         <w:jc w:val="both"/>
       </w:pPr>
       <w:r>
-        <w:t xml:space="preserve">Drug-arm and control-model scores were strongly correlated (Spearman 0.80–0.82). Adding the drug score to a logistic model that already contained the control-model score still improved fit in every arm (likelihood-ratio p &lt; 10⁻²⁵). The drug-specific component was therefore real, but it was small. The drug score residualised on the control score reached AUROC 0.60–0.63, and within quintiles of the control score 0.64–0.66 (Fig. 3b). The control arm has fewer labelled cells (4,183) than the drug arms (8,942–10,123), so we also trained drug models on random sets of whole families of the same size, repeated ten times, and put a paired family-bootstrap confidence interval on the difference (Methods). The drug-specific advantage was then 0.014 for carboplatin, 0.025 for olaparib and 0.017 for NK, with a spread across the ten training subsets of only 0.003–0.004 (Fig. 3c, Table S19). How certain these numbers are depends on what the interval is asked to include. Resampling families to re-score models that were fitted once gives intervals that exclude zero in all three arms (0.001–0.026, 0.012–0.039, 0.003–0.031), but that describes only how much the evaluation would move. Repeating the whole procedure inside each of 60 bootstrap replicates, so that the control-arm model and the capped out-of-fold drug model are refitted every time, gives 0.017 for carboplatin (95% CI −0.002 to 0.043, p = 0.16), 0.022 for olaparib (−0.004 to 0.046, p = 0.07) and 0.014 for NK (−0.011 to 0.038, p = 0.21) (Table S27). None of these excludes zero. The size of the effect is therefore well constrained and small, but this experiment cannot establish from any single arm that it is not zero, which is what our design calculation implies: with 3,879 labelled control families it can resolve a gain of about 0.023 to 0.025 at 80% power, and all three estimates fall below that. What does speak for a real effect is consistency rather than any one interval: the gain is positive in all three arms, under all three preprocessing variants, and across every alternative representation we tried, and the likelihood-ratio test above, which asks whether the drug score adds information about these cells rather than whether the gain would repeat in a new experiment, is significant beyond p &lt; 10⁻²⁵ in every arm. The gain was essentially unchanged after removing cell cycle (0.014, 0.025, 0.014). After removing depth and mitochondrial content as well, it was 0.012 for carboplatin, 0.021 for olaparib and 0.003 for NK. For NK cells, therefore, nothing drug-specific remained even by the narrower evaluation-only interval (−0.010 to 0.016). The result did not depend on how expression was represented. We repeated the analysis with Harmony-corrected components (batch = sample; Korsunsky et al., 2019), with principal components of analytic Pearson residuals, a count-based alternative to log-normalisation (Lause et al., 2021), and with the latent space of scVI, which models library size and sample explicitly (Lopez et al., 2018). We also replaced the principal components with 768-dimensional cell embeddings from Geneformer, a transformer pretrained on 104 million human single-cell transcriptomes and continually pretrained on about 14 million cancer transcriptomes (Theodoris et al., 2023; Chen et al., 2026). The foundation model did not extract more signal than 50 principal components: it reached 0.671–0.683 in the drug arms, below the 0.723–0.747 of the linear model, and its fitness model still explained most of that (0.634–0.663), leaving a size-matched gain of 0.017–0.030. Across all four alternative representations, drug-arm models reached 0.671–0.746, the control-trained model 0.634–0.722 on the same labels, and the size-matched drug-specific gain (simpler five-repeat estimate) was 0.013–0.032 (Table S17).</w:t>
+        <w:t xml:space="preserve">Drug-arm and control-model scores were strongly correlated (Spearman 0.80–0.82). Adding the drug score to a logistic model that already contained the control-model score still improved fit in every arm (likelihood-ratio p &lt; 10⁻²⁵). The drug-specific component was therefore real, but it was small. The drug score residualised on the control score reached AUROC 0.60–0.63, and within quintiles of the control score 0.64–0.66 (Fig. 3b). The control arm has fewer labelled cells (4,183) than the drug arms (8,942–10,123), so we also trained drug models on random sets of whole families of the same size, repeated ten times, and put a paired family-bootstrap confidence interval on the difference (Methods). The drug-specific advantage was then 0.014 for carboplatin, 0.025 for olaparib and 0.017 for NK, with a spread across the ten training subsets of only 0.003–0.004 (Fig. 3c, Table S19). How certain these numbers are depends on what the interval is asked to include. Resampling families to re-score models that were fitted once gives intervals that exclude zero in all three arms (0.001–0.026, 0.012–0.039, 0.003–0.031), but that describes only how much the evaluation would move. Repeating the whole procedure inside each of 60 bootstrap replicates, so that the control-arm model and the capped out-of-fold drug model are refitted every time, gives 0.017 for carboplatin (95% CI −0.002 to 0.043, p = 0.16), 0.022 for olaparib (−0.004 to 0.046, p = 0.07) and 0.014 for NK (−0.011 to 0.038, p = 0.21) (Table S27). None of these excludes zero. Repeating this for the other two preprocessing variants gives the same picture: over all nine arm-by-variant combinations the gain is positive in eight, but only one interval excludes zero (olaparib with cell cycle removed, 0.025, 0.002–0.047, p = 0.033), which is about what nine tests would produce by chance. The size of the effect is therefore well constrained and small, but this experiment cannot establish from any single arm that it is not zero, which is what our design calculation implies: with 3,879 labelled control families it can resolve a gain of about 0.023 to 0.025 at 80% power, and every estimate falls below that. Olaparib is the one arm that comes close in all three variants (p = 0.066, 0.033 and 0.098), which is consistent with it having both the largest gain and the highest label prevalence, and so the most power. What does speak for a real effect is consistency rather than any one interval: the gain is positive in all three arms, under all three preprocessing variants, and across every alternative representation we tried, and the likelihood-ratio test above, which asks whether the drug score adds information about these cells rather than whether the gain would repeat in a new experiment, is significant beyond p &lt; 10⁻²⁵ in every arm. A reader who wants one number should take the effect as being of order 0.02 AUROC, with this experiment unable to separate it from zero. The gain was essentially unchanged after removing cell cycle (0.014, 0.025, 0.014). After removing depth and mitochondrial content as well, it was 0.012 for carboplatin, 0.021 for olaparib and 0.003 for NK. For NK cells, therefore, nothing drug-specific remained even by the narrower evaluation-only interval (−0.010 to 0.016). The result did not depend on how expression was represented. We repeated the analysis with Harmony-corrected components (batch = sample; Korsunsky et al., 2019), with principal components of analytic Pearson residuals, a count-based alternative to log-normalisation (Lause et al., 2021), and with the latent space of scVI, which models library size and sample explicitly (Lopez et al., 2018). We also replaced the principal components with 768-dimensional cell embeddings from Geneformer, a transformer pretrained on 104 million human single-cell transcriptomes and continually pretrained on about 14 million cancer transcriptomes (Theodoris et al., 2023; Chen et al., 2026). The foundation model did not extract more signal than 50 principal components: it reached 0.671–0.683 in the drug arms, below the 0.723–0.747 of the linear model, and its fitness model still explained most of that (0.634–0.663), leaving a size-matched gain of 0.017–0.030. Across all four alternative representations, drug-arm models reached 0.671–0.746, the control-trained model 0.634–0.722 on the same labels, and the size-matched drug-specific gain (simpler five-repeat estimate) was 0.013–0.032 (Table S17).</w:t>
       </w:r>
     </w:p>
     <w:p>

</xml_diff>